<commit_message>
Untrack the course materials that slipped into the repository
Removing their ignore rules while moving them into 课程材料/ let the instructor handouts and
the class sign-up sheet be staged by git add -A. They are now untracked again and the rules
are restored both for the folder and by file name. The blobs remain in the branch history.
refresh_toc.ps1 is pure ASCII again: PowerShell 5.1 misreads a BOM-less UTF-8 script, so the
document is located by an ASCII pattern instead of a Chinese path.

Co-Authored-By: Claude Fable 5.1 <noreply@anthropic.com>
</commit_message>
<xml_diff>
--- a/文档/Project10_Star_Analyst_Research_Plan_EN.docx
+++ b/文档/Project10_Star_Analyst_Research_Plan_EN.docx
@@ -202,7 +202,7 @@
         </w:rPr>
         <w:fldChar w:fldCharType="separate"/>
       </w:r>
-      <w:hyperlink w:anchor="_Toc242218499" w:history="1">
+      <w:hyperlink w:anchor="_Toc242289933" w:history="1">
         <w:r>
           <w:rPr>
             <w:rStyle w:val="aff9"/>
@@ -240,7 +240,7 @@
             <w:noProof/>
             <w:webHidden/>
           </w:rPr>
-          <w:instrText>PAGEREF _Toc242218499 \h</w:instrText>
+          <w:instrText>PAGEREF _Toc242289933 \h</w:instrText>
         </w:r>
         <w:r>
           <w:rPr>
@@ -298,7 +298,7 @@
           <w14:ligatures w14:val="standardContextual"/>
         </w:rPr>
       </w:pPr>
-      <w:hyperlink w:anchor="_Toc242218500" w:history="1">
+      <w:hyperlink w:anchor="_Toc242289934" w:history="1">
         <w:r>
           <w:rPr>
             <w:rStyle w:val="aff9"/>
@@ -336,7 +336,7 @@
             <w:noProof/>
             <w:webHidden/>
           </w:rPr>
-          <w:instrText>PAGEREF _Toc242218500 \h</w:instrText>
+          <w:instrText>PAGEREF _Toc242289934 \h</w:instrText>
         </w:r>
         <w:r>
           <w:rPr>
@@ -394,7 +394,7 @@
           <w14:ligatures w14:val="standardContextual"/>
         </w:rPr>
       </w:pPr>
-      <w:hyperlink w:anchor="_Toc242218501" w:history="1">
+      <w:hyperlink w:anchor="_Toc242289935" w:history="1">
         <w:r>
           <w:rPr>
             <w:rStyle w:val="aff9"/>
@@ -432,7 +432,7 @@
             <w:noProof/>
             <w:webHidden/>
           </w:rPr>
-          <w:instrText>PAGEREF _Toc242218501 \h</w:instrText>
+          <w:instrText>PAGEREF _Toc242289935 \h</w:instrText>
         </w:r>
         <w:r>
           <w:rPr>
@@ -490,7 +490,7 @@
           <w14:ligatures w14:val="standardContextual"/>
         </w:rPr>
       </w:pPr>
-      <w:hyperlink w:anchor="_Toc242218502" w:history="1">
+      <w:hyperlink w:anchor="_Toc242289936" w:history="1">
         <w:r>
           <w:rPr>
             <w:rStyle w:val="aff9"/>
@@ -528,7 +528,7 @@
             <w:noProof/>
             <w:webHidden/>
           </w:rPr>
-          <w:instrText>PAGEREF _Toc242218502 \h</w:instrText>
+          <w:instrText>PAGEREF _Toc242289936 \h</w:instrText>
         </w:r>
         <w:r>
           <w:rPr>
@@ -586,7 +586,7 @@
           <w14:ligatures w14:val="standardContextual"/>
         </w:rPr>
       </w:pPr>
-      <w:hyperlink w:anchor="_Toc242218503" w:history="1">
+      <w:hyperlink w:anchor="_Toc242289937" w:history="1">
         <w:r>
           <w:rPr>
             <w:rStyle w:val="aff9"/>
@@ -624,7 +624,7 @@
             <w:noProof/>
             <w:webHidden/>
           </w:rPr>
-          <w:instrText>PAGEREF _Toc242218503 \h</w:instrText>
+          <w:instrText>PAGEREF _Toc242289937 \h</w:instrText>
         </w:r>
         <w:r>
           <w:rPr>
@@ -682,7 +682,7 @@
           <w14:ligatures w14:val="standardContextual"/>
         </w:rPr>
       </w:pPr>
-      <w:hyperlink w:anchor="_Toc242218504" w:history="1">
+      <w:hyperlink w:anchor="_Toc242289938" w:history="1">
         <w:r>
           <w:rPr>
             <w:rStyle w:val="aff9"/>
@@ -720,7 +720,7 @@
             <w:noProof/>
             <w:webHidden/>
           </w:rPr>
-          <w:instrText>PAGEREF _Toc242218504 \h</w:instrText>
+          <w:instrText>PAGEREF _Toc242289938 \h</w:instrText>
         </w:r>
         <w:r>
           <w:rPr>
@@ -778,7 +778,7 @@
           <w14:ligatures w14:val="standardContextual"/>
         </w:rPr>
       </w:pPr>
-      <w:hyperlink w:anchor="_Toc242218505" w:history="1">
+      <w:hyperlink w:anchor="_Toc242289939" w:history="1">
         <w:r>
           <w:rPr>
             <w:rStyle w:val="aff9"/>
@@ -816,7 +816,7 @@
             <w:noProof/>
             <w:webHidden/>
           </w:rPr>
-          <w:instrText>PAGEREF _Toc242218505 \h</w:instrText>
+          <w:instrText>PAGEREF _Toc242289939 \h</w:instrText>
         </w:r>
         <w:r>
           <w:rPr>
@@ -874,7 +874,7 @@
           <w14:ligatures w14:val="standardContextual"/>
         </w:rPr>
       </w:pPr>
-      <w:hyperlink w:anchor="_Toc242218506" w:history="1">
+      <w:hyperlink w:anchor="_Toc242289940" w:history="1">
         <w:r>
           <w:rPr>
             <w:rStyle w:val="aff9"/>
@@ -912,7 +912,7 @@
             <w:noProof/>
             <w:webHidden/>
           </w:rPr>
-          <w:instrText>PAGEREF _Toc242218506 \h</w:instrText>
+          <w:instrText>PAGEREF _Toc242289940 \h</w:instrText>
         </w:r>
         <w:r>
           <w:rPr>
@@ -970,7 +970,7 @@
           <w14:ligatures w14:val="standardContextual"/>
         </w:rPr>
       </w:pPr>
-      <w:hyperlink w:anchor="_Toc242218507" w:history="1">
+      <w:hyperlink w:anchor="_Toc242289941" w:history="1">
         <w:r>
           <w:rPr>
             <w:rStyle w:val="aff9"/>
@@ -1008,7 +1008,7 @@
             <w:noProof/>
             <w:webHidden/>
           </w:rPr>
-          <w:instrText>PAGEREF _Toc242218507 \h</w:instrText>
+          <w:instrText>PAGEREF _Toc242289941 \h</w:instrText>
         </w:r>
         <w:r>
           <w:rPr>
@@ -1066,7 +1066,7 @@
           <w14:ligatures w14:val="standardContextual"/>
         </w:rPr>
       </w:pPr>
-      <w:hyperlink w:anchor="_Toc242218508" w:history="1">
+      <w:hyperlink w:anchor="_Toc242289942" w:history="1">
         <w:r>
           <w:rPr>
             <w:rStyle w:val="aff9"/>
@@ -1104,7 +1104,7 @@
             <w:noProof/>
             <w:webHidden/>
           </w:rPr>
-          <w:instrText>PAGEREF _Toc242218508 \h</w:instrText>
+          <w:instrText>PAGEREF _Toc242289942 \h</w:instrText>
         </w:r>
         <w:r>
           <w:rPr>
@@ -1162,7 +1162,7 @@
           <w14:ligatures w14:val="standardContextual"/>
         </w:rPr>
       </w:pPr>
-      <w:hyperlink w:anchor="_Toc242218509" w:history="1">
+      <w:hyperlink w:anchor="_Toc242289943" w:history="1">
         <w:r>
           <w:rPr>
             <w:rStyle w:val="aff9"/>
@@ -1200,7 +1200,7 @@
             <w:noProof/>
             <w:webHidden/>
           </w:rPr>
-          <w:instrText>PAGEREF _Toc242218509 \h</w:instrText>
+          <w:instrText>PAGEREF _Toc242289943 \h</w:instrText>
         </w:r>
         <w:r>
           <w:rPr>
@@ -1258,7 +1258,7 @@
           <w14:ligatures w14:val="standardContextual"/>
         </w:rPr>
       </w:pPr>
-      <w:hyperlink w:anchor="_Toc242218510" w:history="1">
+      <w:hyperlink w:anchor="_Toc242289944" w:history="1">
         <w:r>
           <w:rPr>
             <w:rStyle w:val="aff9"/>
@@ -1296,7 +1296,7 @@
             <w:noProof/>
             <w:webHidden/>
           </w:rPr>
-          <w:instrText>PAGEREF _Toc242218510 \h</w:instrText>
+          <w:instrText>PAGEREF _Toc242289944 \h</w:instrText>
         </w:r>
         <w:r>
           <w:rPr>
@@ -1354,7 +1354,7 @@
           <w14:ligatures w14:val="standardContextual"/>
         </w:rPr>
       </w:pPr>
-      <w:hyperlink w:anchor="_Toc242218511" w:history="1">
+      <w:hyperlink w:anchor="_Toc242289945" w:history="1">
         <w:r>
           <w:rPr>
             <w:rStyle w:val="aff9"/>
@@ -1392,7 +1392,7 @@
             <w:noProof/>
             <w:webHidden/>
           </w:rPr>
-          <w:instrText>PAGEREF _Toc242218511 \h</w:instrText>
+          <w:instrText>PAGEREF _Toc242289945 \h</w:instrText>
         </w:r>
         <w:r>
           <w:rPr>
@@ -1450,7 +1450,7 @@
           <w14:ligatures w14:val="standardContextual"/>
         </w:rPr>
       </w:pPr>
-      <w:hyperlink w:anchor="_Toc242218512" w:history="1">
+      <w:hyperlink w:anchor="_Toc242289946" w:history="1">
         <w:r>
           <w:rPr>
             <w:rStyle w:val="aff9"/>
@@ -1488,7 +1488,7 @@
             <w:noProof/>
             <w:webHidden/>
           </w:rPr>
-          <w:instrText>PAGEREF _Toc242218512 \h</w:instrText>
+          <w:instrText>PAGEREF _Toc242289946 \h</w:instrText>
         </w:r>
         <w:r>
           <w:rPr>
@@ -1543,7 +1543,7 @@
         <w:pStyle w:val="1"/>
         <w:spacing w:before="280" w:after="120"/>
       </w:pPr>
-      <w:bookmarkStart w:id="0" w:name="_Toc242218499"/>
+      <w:bookmarkStart w:id="0" w:name="_Toc242289933"/>
       <w:r>
         <w:rPr>
           <w:rFonts w:ascii="Times New Roman" w:eastAsia="Arial" w:hAnsi="Times New Roman"/>
@@ -1992,7 +1992,7 @@
         <w:pStyle w:val="1"/>
         <w:spacing w:before="280" w:after="120"/>
       </w:pPr>
-      <w:bookmarkStart w:id="1" w:name="_Toc242218500"/>
+      <w:bookmarkStart w:id="1" w:name="_Toc242289934"/>
       <w:r>
         <w:rPr>
           <w:rFonts w:ascii="Times New Roman" w:eastAsia="Arial" w:hAnsi="Times New Roman"/>
@@ -2040,7 +2040,7 @@
         <w:pStyle w:val="1"/>
         <w:spacing w:before="280" w:after="120"/>
       </w:pPr>
-      <w:bookmarkStart w:id="2" w:name="_Toc242218501"/>
+      <w:bookmarkStart w:id="2" w:name="_Toc242289935"/>
       <w:r>
         <w:rPr>
           <w:rFonts w:ascii="Times New Roman" w:eastAsia="Arial" w:hAnsi="Times New Roman"/>
@@ -2460,7 +2460,7 @@
         <w:pStyle w:val="1"/>
         <w:spacing w:before="280" w:after="120"/>
       </w:pPr>
-      <w:bookmarkStart w:id="3" w:name="_Toc242218502"/>
+      <w:bookmarkStart w:id="3" w:name="_Toc242289936"/>
       <w:r>
         <w:rPr>
           <w:rFonts w:ascii="Times New Roman" w:eastAsia="Arial" w:hAnsi="Times New Roman"/>
@@ -2967,7 +2967,7 @@
         <w:pStyle w:val="1"/>
         <w:spacing w:before="280" w:after="120"/>
       </w:pPr>
-      <w:bookmarkStart w:id="4" w:name="_Toc242218503"/>
+      <w:bookmarkStart w:id="4" w:name="_Toc242289937"/>
       <w:r>
         <w:rPr>
           <w:rFonts w:ascii="Times New Roman" w:eastAsia="Arial" w:hAnsi="Times New Roman"/>
@@ -3421,7 +3421,7 @@
         <w:pStyle w:val="1"/>
         <w:spacing w:before="280" w:after="120"/>
       </w:pPr>
-      <w:bookmarkStart w:id="5" w:name="_Toc242218504"/>
+      <w:bookmarkStart w:id="5" w:name="_Toc242289938"/>
       <w:r>
         <w:rPr>
           <w:rFonts w:ascii="Times New Roman" w:eastAsia="Arial" w:hAnsi="Times New Roman"/>
@@ -3593,7 +3593,7 @@
         <w:pStyle w:val="1"/>
         <w:spacing w:before="280" w:after="120"/>
       </w:pPr>
-      <w:bookmarkStart w:id="6" w:name="_Toc242218505"/>
+      <w:bookmarkStart w:id="6" w:name="_Toc242289939"/>
       <w:r>
         <w:rPr>
           <w:rFonts w:ascii="Times New Roman" w:eastAsia="Arial" w:hAnsi="Times New Roman"/>
@@ -3799,7 +3799,7 @@
         <w:pStyle w:val="1"/>
         <w:spacing w:before="280" w:after="120"/>
       </w:pPr>
-      <w:bookmarkStart w:id="7" w:name="_Toc242218506"/>
+      <w:bookmarkStart w:id="7" w:name="_Toc242289940"/>
       <w:r>
         <w:rPr>
           <w:rFonts w:ascii="Times New Roman" w:eastAsia="Arial" w:hAnsi="Times New Roman"/>
@@ -3943,7 +3943,7 @@
         <w:pStyle w:val="1"/>
         <w:spacing w:before="280" w:after="120"/>
       </w:pPr>
-      <w:bookmarkStart w:id="8" w:name="_Toc242218507"/>
+      <w:bookmarkStart w:id="8" w:name="_Toc242289941"/>
       <w:r>
         <w:rPr>
           <w:rFonts w:ascii="Times New Roman" w:eastAsia="Arial" w:hAnsi="Times New Roman"/>
@@ -4252,7 +4252,7 @@
         <w:pStyle w:val="1"/>
         <w:spacing w:before="280" w:after="120"/>
       </w:pPr>
-      <w:bookmarkStart w:id="9" w:name="_Toc242218508"/>
+      <w:bookmarkStart w:id="9" w:name="_Toc242289942"/>
       <w:r>
         <w:rPr>
           <w:rFonts w:ascii="Times New Roman" w:eastAsia="Arial" w:hAnsi="Times New Roman"/>
@@ -4348,7 +4348,7 @@
         <w:pStyle w:val="1"/>
         <w:spacing w:before="280" w:after="120"/>
       </w:pPr>
-      <w:bookmarkStart w:id="10" w:name="_Toc242218509"/>
+      <w:bookmarkStart w:id="10" w:name="_Toc242289943"/>
       <w:r>
         <w:rPr>
           <w:rFonts w:ascii="Times New Roman" w:eastAsia="Arial" w:hAnsi="Times New Roman"/>
@@ -4454,7 +4454,7 @@
         <w:pStyle w:val="1"/>
         <w:spacing w:before="280" w:after="120"/>
       </w:pPr>
-      <w:bookmarkStart w:id="11" w:name="_Toc242218510"/>
+      <w:bookmarkStart w:id="11" w:name="_Toc242289944"/>
       <w:r>
         <w:rPr>
           <w:rFonts w:ascii="Times New Roman" w:eastAsia="Arial" w:hAnsi="Times New Roman"/>
@@ -4619,7 +4619,7 @@
         <w:pStyle w:val="1"/>
         <w:spacing w:before="280" w:after="120"/>
       </w:pPr>
-      <w:bookmarkStart w:id="12" w:name="_Toc242218511"/>
+      <w:bookmarkStart w:id="12" w:name="_Toc242289945"/>
       <w:r>
         <w:rPr>
           <w:rFonts w:ascii="Times New Roman" w:eastAsia="Arial" w:hAnsi="Times New Roman"/>
@@ -4857,7 +4857,7 @@
         <w:pStyle w:val="1"/>
         <w:spacing w:before="280" w:after="120"/>
       </w:pPr>
-      <w:bookmarkStart w:id="13" w:name="_Toc242218512"/>
+      <w:bookmarkStart w:id="13" w:name="_Toc242289946"/>
       <w:r>
         <w:rPr>
           <w:rFonts w:ascii="Times New Roman" w:eastAsia="Arial" w:hAnsi="Times New Roman"/>

</xml_diff>

<commit_message>
Show the real paths in the document build instructions
Co-Authored-By: Claude Fable 5.1 <noreply@anthropic.com>
</commit_message>
<xml_diff>
--- a/文档/Project10_Star_Analyst_Research_Plan_EN.docx
+++ b/文档/Project10_Star_Analyst_Research_Plan_EN.docx
@@ -202,7 +202,7 @@
         </w:rPr>
         <w:fldChar w:fldCharType="separate"/>
       </w:r>
-      <w:hyperlink w:anchor="_Toc242289933" w:history="1">
+      <w:hyperlink w:anchor="_Toc242290050" w:history="1">
         <w:r>
           <w:rPr>
             <w:rStyle w:val="aff9"/>
@@ -240,7 +240,7 @@
             <w:noProof/>
             <w:webHidden/>
           </w:rPr>
-          <w:instrText>PAGEREF _Toc242289933 \h</w:instrText>
+          <w:instrText>PAGEREF _Toc242290050 \h</w:instrText>
         </w:r>
         <w:r>
           <w:rPr>
@@ -298,7 +298,7 @@
           <w14:ligatures w14:val="standardContextual"/>
         </w:rPr>
       </w:pPr>
-      <w:hyperlink w:anchor="_Toc242289934" w:history="1">
+      <w:hyperlink w:anchor="_Toc242290051" w:history="1">
         <w:r>
           <w:rPr>
             <w:rStyle w:val="aff9"/>
@@ -336,7 +336,7 @@
             <w:noProof/>
             <w:webHidden/>
           </w:rPr>
-          <w:instrText>PAGEREF _Toc242289934 \h</w:instrText>
+          <w:instrText>PAGEREF _Toc242290051 \h</w:instrText>
         </w:r>
         <w:r>
           <w:rPr>
@@ -394,7 +394,7 @@
           <w14:ligatures w14:val="standardContextual"/>
         </w:rPr>
       </w:pPr>
-      <w:hyperlink w:anchor="_Toc242289935" w:history="1">
+      <w:hyperlink w:anchor="_Toc242290052" w:history="1">
         <w:r>
           <w:rPr>
             <w:rStyle w:val="aff9"/>
@@ -432,7 +432,7 @@
             <w:noProof/>
             <w:webHidden/>
           </w:rPr>
-          <w:instrText>PAGEREF _Toc242289935 \h</w:instrText>
+          <w:instrText>PAGEREF _Toc242290052 \h</w:instrText>
         </w:r>
         <w:r>
           <w:rPr>
@@ -490,7 +490,7 @@
           <w14:ligatures w14:val="standardContextual"/>
         </w:rPr>
       </w:pPr>
-      <w:hyperlink w:anchor="_Toc242289936" w:history="1">
+      <w:hyperlink w:anchor="_Toc242290053" w:history="1">
         <w:r>
           <w:rPr>
             <w:rStyle w:val="aff9"/>
@@ -528,7 +528,7 @@
             <w:noProof/>
             <w:webHidden/>
           </w:rPr>
-          <w:instrText>PAGEREF _Toc242289936 \h</w:instrText>
+          <w:instrText>PAGEREF _Toc242290053 \h</w:instrText>
         </w:r>
         <w:r>
           <w:rPr>
@@ -586,7 +586,7 @@
           <w14:ligatures w14:val="standardContextual"/>
         </w:rPr>
       </w:pPr>
-      <w:hyperlink w:anchor="_Toc242289937" w:history="1">
+      <w:hyperlink w:anchor="_Toc242290054" w:history="1">
         <w:r>
           <w:rPr>
             <w:rStyle w:val="aff9"/>
@@ -624,7 +624,7 @@
             <w:noProof/>
             <w:webHidden/>
           </w:rPr>
-          <w:instrText>PAGEREF _Toc242289937 \h</w:instrText>
+          <w:instrText>PAGEREF _Toc242290054 \h</w:instrText>
         </w:r>
         <w:r>
           <w:rPr>
@@ -682,7 +682,7 @@
           <w14:ligatures w14:val="standardContextual"/>
         </w:rPr>
       </w:pPr>
-      <w:hyperlink w:anchor="_Toc242289938" w:history="1">
+      <w:hyperlink w:anchor="_Toc242290055" w:history="1">
         <w:r>
           <w:rPr>
             <w:rStyle w:val="aff9"/>
@@ -720,7 +720,7 @@
             <w:noProof/>
             <w:webHidden/>
           </w:rPr>
-          <w:instrText>PAGEREF _Toc242289938 \h</w:instrText>
+          <w:instrText>PAGEREF _Toc242290055 \h</w:instrText>
         </w:r>
         <w:r>
           <w:rPr>
@@ -778,7 +778,7 @@
           <w14:ligatures w14:val="standardContextual"/>
         </w:rPr>
       </w:pPr>
-      <w:hyperlink w:anchor="_Toc242289939" w:history="1">
+      <w:hyperlink w:anchor="_Toc242290056" w:history="1">
         <w:r>
           <w:rPr>
             <w:rStyle w:val="aff9"/>
@@ -816,7 +816,7 @@
             <w:noProof/>
             <w:webHidden/>
           </w:rPr>
-          <w:instrText>PAGEREF _Toc242289939 \h</w:instrText>
+          <w:instrText>PAGEREF _Toc242290056 \h</w:instrText>
         </w:r>
         <w:r>
           <w:rPr>
@@ -874,7 +874,7 @@
           <w14:ligatures w14:val="standardContextual"/>
         </w:rPr>
       </w:pPr>
-      <w:hyperlink w:anchor="_Toc242289940" w:history="1">
+      <w:hyperlink w:anchor="_Toc242290057" w:history="1">
         <w:r>
           <w:rPr>
             <w:rStyle w:val="aff9"/>
@@ -912,7 +912,7 @@
             <w:noProof/>
             <w:webHidden/>
           </w:rPr>
-          <w:instrText>PAGEREF _Toc242289940 \h</w:instrText>
+          <w:instrText>PAGEREF _Toc242290057 \h</w:instrText>
         </w:r>
         <w:r>
           <w:rPr>
@@ -970,7 +970,7 @@
           <w14:ligatures w14:val="standardContextual"/>
         </w:rPr>
       </w:pPr>
-      <w:hyperlink w:anchor="_Toc242289941" w:history="1">
+      <w:hyperlink w:anchor="_Toc242290058" w:history="1">
         <w:r>
           <w:rPr>
             <w:rStyle w:val="aff9"/>
@@ -1008,7 +1008,7 @@
             <w:noProof/>
             <w:webHidden/>
           </w:rPr>
-          <w:instrText>PAGEREF _Toc242289941 \h</w:instrText>
+          <w:instrText>PAGEREF _Toc242290058 \h</w:instrText>
         </w:r>
         <w:r>
           <w:rPr>
@@ -1066,7 +1066,7 @@
           <w14:ligatures w14:val="standardContextual"/>
         </w:rPr>
       </w:pPr>
-      <w:hyperlink w:anchor="_Toc242289942" w:history="1">
+      <w:hyperlink w:anchor="_Toc242290059" w:history="1">
         <w:r>
           <w:rPr>
             <w:rStyle w:val="aff9"/>
@@ -1104,7 +1104,7 @@
             <w:noProof/>
             <w:webHidden/>
           </w:rPr>
-          <w:instrText>PAGEREF _Toc242289942 \h</w:instrText>
+          <w:instrText>PAGEREF _Toc242290059 \h</w:instrText>
         </w:r>
         <w:r>
           <w:rPr>
@@ -1162,7 +1162,7 @@
           <w14:ligatures w14:val="standardContextual"/>
         </w:rPr>
       </w:pPr>
-      <w:hyperlink w:anchor="_Toc242289943" w:history="1">
+      <w:hyperlink w:anchor="_Toc242290060" w:history="1">
         <w:r>
           <w:rPr>
             <w:rStyle w:val="aff9"/>
@@ -1200,7 +1200,7 @@
             <w:noProof/>
             <w:webHidden/>
           </w:rPr>
-          <w:instrText>PAGEREF _Toc242289943 \h</w:instrText>
+          <w:instrText>PAGEREF _Toc242290060 \h</w:instrText>
         </w:r>
         <w:r>
           <w:rPr>
@@ -1258,7 +1258,7 @@
           <w14:ligatures w14:val="standardContextual"/>
         </w:rPr>
       </w:pPr>
-      <w:hyperlink w:anchor="_Toc242289944" w:history="1">
+      <w:hyperlink w:anchor="_Toc242290061" w:history="1">
         <w:r>
           <w:rPr>
             <w:rStyle w:val="aff9"/>
@@ -1296,7 +1296,7 @@
             <w:noProof/>
             <w:webHidden/>
           </w:rPr>
-          <w:instrText>PAGEREF _Toc242289944 \h</w:instrText>
+          <w:instrText>PAGEREF _Toc242290061 \h</w:instrText>
         </w:r>
         <w:r>
           <w:rPr>
@@ -1354,7 +1354,7 @@
           <w14:ligatures w14:val="standardContextual"/>
         </w:rPr>
       </w:pPr>
-      <w:hyperlink w:anchor="_Toc242289945" w:history="1">
+      <w:hyperlink w:anchor="_Toc242290062" w:history="1">
         <w:r>
           <w:rPr>
             <w:rStyle w:val="aff9"/>
@@ -1392,7 +1392,7 @@
             <w:noProof/>
             <w:webHidden/>
           </w:rPr>
-          <w:instrText>PAGEREF _Toc242289945 \h</w:instrText>
+          <w:instrText>PAGEREF _Toc242290062 \h</w:instrText>
         </w:r>
         <w:r>
           <w:rPr>
@@ -1450,7 +1450,7 @@
           <w14:ligatures w14:val="standardContextual"/>
         </w:rPr>
       </w:pPr>
-      <w:hyperlink w:anchor="_Toc242289946" w:history="1">
+      <w:hyperlink w:anchor="_Toc242290063" w:history="1">
         <w:r>
           <w:rPr>
             <w:rStyle w:val="aff9"/>
@@ -1488,7 +1488,7 @@
             <w:noProof/>
             <w:webHidden/>
           </w:rPr>
-          <w:instrText>PAGEREF _Toc242289946 \h</w:instrText>
+          <w:instrText>PAGEREF _Toc242290063 \h</w:instrText>
         </w:r>
         <w:r>
           <w:rPr>
@@ -1543,7 +1543,7 @@
         <w:pStyle w:val="1"/>
         <w:spacing w:before="280" w:after="120"/>
       </w:pPr>
-      <w:bookmarkStart w:id="0" w:name="_Toc242289933"/>
+      <w:bookmarkStart w:id="0" w:name="_Toc242290050"/>
       <w:r>
         <w:rPr>
           <w:rFonts w:ascii="Times New Roman" w:eastAsia="Arial" w:hAnsi="Times New Roman"/>
@@ -1992,7 +1992,7 @@
         <w:pStyle w:val="1"/>
         <w:spacing w:before="280" w:after="120"/>
       </w:pPr>
-      <w:bookmarkStart w:id="1" w:name="_Toc242289934"/>
+      <w:bookmarkStart w:id="1" w:name="_Toc242290051"/>
       <w:r>
         <w:rPr>
           <w:rFonts w:ascii="Times New Roman" w:eastAsia="Arial" w:hAnsi="Times New Roman"/>
@@ -2040,7 +2040,7 @@
         <w:pStyle w:val="1"/>
         <w:spacing w:before="280" w:after="120"/>
       </w:pPr>
-      <w:bookmarkStart w:id="2" w:name="_Toc242289935"/>
+      <w:bookmarkStart w:id="2" w:name="_Toc242290052"/>
       <w:r>
         <w:rPr>
           <w:rFonts w:ascii="Times New Roman" w:eastAsia="Arial" w:hAnsi="Times New Roman"/>
@@ -2460,7 +2460,7 @@
         <w:pStyle w:val="1"/>
         <w:spacing w:before="280" w:after="120"/>
       </w:pPr>
-      <w:bookmarkStart w:id="3" w:name="_Toc242289936"/>
+      <w:bookmarkStart w:id="3" w:name="_Toc242290053"/>
       <w:r>
         <w:rPr>
           <w:rFonts w:ascii="Times New Roman" w:eastAsia="Arial" w:hAnsi="Times New Roman"/>
@@ -2967,7 +2967,7 @@
         <w:pStyle w:val="1"/>
         <w:spacing w:before="280" w:after="120"/>
       </w:pPr>
-      <w:bookmarkStart w:id="4" w:name="_Toc242289937"/>
+      <w:bookmarkStart w:id="4" w:name="_Toc242290054"/>
       <w:r>
         <w:rPr>
           <w:rFonts w:ascii="Times New Roman" w:eastAsia="Arial" w:hAnsi="Times New Roman"/>
@@ -3421,7 +3421,7 @@
         <w:pStyle w:val="1"/>
         <w:spacing w:before="280" w:after="120"/>
       </w:pPr>
-      <w:bookmarkStart w:id="5" w:name="_Toc242289938"/>
+      <w:bookmarkStart w:id="5" w:name="_Toc242290055"/>
       <w:r>
         <w:rPr>
           <w:rFonts w:ascii="Times New Roman" w:eastAsia="Arial" w:hAnsi="Times New Roman"/>
@@ -3593,7 +3593,7 @@
         <w:pStyle w:val="1"/>
         <w:spacing w:before="280" w:after="120"/>
       </w:pPr>
-      <w:bookmarkStart w:id="6" w:name="_Toc242289939"/>
+      <w:bookmarkStart w:id="6" w:name="_Toc242290056"/>
       <w:r>
         <w:rPr>
           <w:rFonts w:ascii="Times New Roman" w:eastAsia="Arial" w:hAnsi="Times New Roman"/>
@@ -3799,7 +3799,7 @@
         <w:pStyle w:val="1"/>
         <w:spacing w:before="280" w:after="120"/>
       </w:pPr>
-      <w:bookmarkStart w:id="7" w:name="_Toc242289940"/>
+      <w:bookmarkStart w:id="7" w:name="_Toc242290057"/>
       <w:r>
         <w:rPr>
           <w:rFonts w:ascii="Times New Roman" w:eastAsia="Arial" w:hAnsi="Times New Roman"/>
@@ -3943,7 +3943,7 @@
         <w:pStyle w:val="1"/>
         <w:spacing w:before="280" w:after="120"/>
       </w:pPr>
-      <w:bookmarkStart w:id="8" w:name="_Toc242289941"/>
+      <w:bookmarkStart w:id="8" w:name="_Toc242290058"/>
       <w:r>
         <w:rPr>
           <w:rFonts w:ascii="Times New Roman" w:eastAsia="Arial" w:hAnsi="Times New Roman"/>
@@ -4252,7 +4252,7 @@
         <w:pStyle w:val="1"/>
         <w:spacing w:before="280" w:after="120"/>
       </w:pPr>
-      <w:bookmarkStart w:id="9" w:name="_Toc242289942"/>
+      <w:bookmarkStart w:id="9" w:name="_Toc242290059"/>
       <w:r>
         <w:rPr>
           <w:rFonts w:ascii="Times New Roman" w:eastAsia="Arial" w:hAnsi="Times New Roman"/>
@@ -4348,7 +4348,7 @@
         <w:pStyle w:val="1"/>
         <w:spacing w:before="280" w:after="120"/>
       </w:pPr>
-      <w:bookmarkStart w:id="10" w:name="_Toc242289943"/>
+      <w:bookmarkStart w:id="10" w:name="_Toc242290060"/>
       <w:r>
         <w:rPr>
           <w:rFonts w:ascii="Times New Roman" w:eastAsia="Arial" w:hAnsi="Times New Roman"/>
@@ -4454,7 +4454,7 @@
         <w:pStyle w:val="1"/>
         <w:spacing w:before="280" w:after="120"/>
       </w:pPr>
-      <w:bookmarkStart w:id="11" w:name="_Toc242289944"/>
+      <w:bookmarkStart w:id="11" w:name="_Toc242290061"/>
       <w:r>
         <w:rPr>
           <w:rFonts w:ascii="Times New Roman" w:eastAsia="Arial" w:hAnsi="Times New Roman"/>
@@ -4619,7 +4619,7 @@
         <w:pStyle w:val="1"/>
         <w:spacing w:before="280" w:after="120"/>
       </w:pPr>
-      <w:bookmarkStart w:id="12" w:name="_Toc242289945"/>
+      <w:bookmarkStart w:id="12" w:name="_Toc242290062"/>
       <w:r>
         <w:rPr>
           <w:rFonts w:ascii="Times New Roman" w:eastAsia="Arial" w:hAnsi="Times New Roman"/>
@@ -4857,7 +4857,7 @@
         <w:pStyle w:val="1"/>
         <w:spacing w:before="280" w:after="120"/>
       </w:pPr>
-      <w:bookmarkStart w:id="13" w:name="_Toc242289946"/>
+      <w:bookmarkStart w:id="13" w:name="_Toc242290063"/>
       <w:r>
         <w:rPr>
           <w:rFonts w:ascii="Times New Roman" w:eastAsia="Arial" w:hAnsi="Times New Roman"/>

</xml_diff>

<commit_message>
Clean deliverable naming and align documents with the audited numbers
Rename the remaining handover_* files to ref_newfortune_*, rename
README_pipeline.md to data_pipeline.md, and replace internal handover titles
with content-based names. Track the small reference tables needed to reproduce
the pipeline. Correct the 2018 list evidence, the target-price population and
the raw extract paths. event_study_v2 now reads market panels split by year.
Rebuild the Word deliverables.

Co-Authored-By: Claude Code <noreply@anthropic.com>
</commit_message>
<xml_diff>
--- a/文档/Project10_Star_Analyst_Research_Plan_EN.docx
+++ b/文档/Project10_Star_Analyst_Research_Plan_EN.docx
@@ -100,7 +100,7 @@
         <w:rPr>
           <w:color w:val="000000"/>
         </w:rPr>
-        <w:t>Status as of: 6 October 2026</w:t>
+        <w:t>Status as of: 18 October 2026</w:t>
       </w:r>
     </w:p>
     <w:p>
@@ -202,7 +202,7 @@
         </w:rPr>
         <w:fldChar w:fldCharType="separate"/>
       </w:r>
-      <w:hyperlink w:anchor="_Toc242290050" w:history="1">
+      <w:hyperlink w:anchor="_Toc243215522" w:history="1">
         <w:r>
           <w:rPr>
             <w:rStyle w:val="aff9"/>
@@ -240,7 +240,7 @@
             <w:noProof/>
             <w:webHidden/>
           </w:rPr>
-          <w:instrText>PAGEREF _Toc242290050 \h</w:instrText>
+          <w:instrText>PAGEREF _Toc243215522 \h</w:instrText>
         </w:r>
         <w:r>
           <w:rPr>
@@ -298,7 +298,7 @@
           <w14:ligatures w14:val="standardContextual"/>
         </w:rPr>
       </w:pPr>
-      <w:hyperlink w:anchor="_Toc242290051" w:history="1">
+      <w:hyperlink w:anchor="_Toc243215523" w:history="1">
         <w:r>
           <w:rPr>
             <w:rStyle w:val="aff9"/>
@@ -336,7 +336,7 @@
             <w:noProof/>
             <w:webHidden/>
           </w:rPr>
-          <w:instrText>PAGEREF _Toc242290051 \h</w:instrText>
+          <w:instrText>PAGEREF _Toc243215523 \h</w:instrText>
         </w:r>
         <w:r>
           <w:rPr>
@@ -394,7 +394,7 @@
           <w14:ligatures w14:val="standardContextual"/>
         </w:rPr>
       </w:pPr>
-      <w:hyperlink w:anchor="_Toc242290052" w:history="1">
+      <w:hyperlink w:anchor="_Toc243215524" w:history="1">
         <w:r>
           <w:rPr>
             <w:rStyle w:val="aff9"/>
@@ -432,7 +432,7 @@
             <w:noProof/>
             <w:webHidden/>
           </w:rPr>
-          <w:instrText>PAGEREF _Toc242290052 \h</w:instrText>
+          <w:instrText>PAGEREF _Toc243215524 \h</w:instrText>
         </w:r>
         <w:r>
           <w:rPr>
@@ -490,7 +490,7 @@
           <w14:ligatures w14:val="standardContextual"/>
         </w:rPr>
       </w:pPr>
-      <w:hyperlink w:anchor="_Toc242290053" w:history="1">
+      <w:hyperlink w:anchor="_Toc243215525" w:history="1">
         <w:r>
           <w:rPr>
             <w:rStyle w:val="aff9"/>
@@ -528,7 +528,7 @@
             <w:noProof/>
             <w:webHidden/>
           </w:rPr>
-          <w:instrText>PAGEREF _Toc242290053 \h</w:instrText>
+          <w:instrText>PAGEREF _Toc243215525 \h</w:instrText>
         </w:r>
         <w:r>
           <w:rPr>
@@ -586,7 +586,7 @@
           <w14:ligatures w14:val="standardContextual"/>
         </w:rPr>
       </w:pPr>
-      <w:hyperlink w:anchor="_Toc242290054" w:history="1">
+      <w:hyperlink w:anchor="_Toc243215526" w:history="1">
         <w:r>
           <w:rPr>
             <w:rStyle w:val="aff9"/>
@@ -624,7 +624,7 @@
             <w:noProof/>
             <w:webHidden/>
           </w:rPr>
-          <w:instrText>PAGEREF _Toc242290054 \h</w:instrText>
+          <w:instrText>PAGEREF _Toc243215526 \h</w:instrText>
         </w:r>
         <w:r>
           <w:rPr>
@@ -682,7 +682,7 @@
           <w14:ligatures w14:val="standardContextual"/>
         </w:rPr>
       </w:pPr>
-      <w:hyperlink w:anchor="_Toc242290055" w:history="1">
+      <w:hyperlink w:anchor="_Toc243215527" w:history="1">
         <w:r>
           <w:rPr>
             <w:rStyle w:val="aff9"/>
@@ -720,7 +720,7 @@
             <w:noProof/>
             <w:webHidden/>
           </w:rPr>
-          <w:instrText>PAGEREF _Toc242290055 \h</w:instrText>
+          <w:instrText>PAGEREF _Toc243215527 \h</w:instrText>
         </w:r>
         <w:r>
           <w:rPr>
@@ -778,7 +778,7 @@
           <w14:ligatures w14:val="standardContextual"/>
         </w:rPr>
       </w:pPr>
-      <w:hyperlink w:anchor="_Toc242290056" w:history="1">
+      <w:hyperlink w:anchor="_Toc243215528" w:history="1">
         <w:r>
           <w:rPr>
             <w:rStyle w:val="aff9"/>
@@ -816,7 +816,7 @@
             <w:noProof/>
             <w:webHidden/>
           </w:rPr>
-          <w:instrText>PAGEREF _Toc242290056 \h</w:instrText>
+          <w:instrText>PAGEREF _Toc243215528 \h</w:instrText>
         </w:r>
         <w:r>
           <w:rPr>
@@ -874,7 +874,7 @@
           <w14:ligatures w14:val="standardContextual"/>
         </w:rPr>
       </w:pPr>
-      <w:hyperlink w:anchor="_Toc242290057" w:history="1">
+      <w:hyperlink w:anchor="_Toc243215529" w:history="1">
         <w:r>
           <w:rPr>
             <w:rStyle w:val="aff9"/>
@@ -912,7 +912,7 @@
             <w:noProof/>
             <w:webHidden/>
           </w:rPr>
-          <w:instrText>PAGEREF _Toc242290057 \h</w:instrText>
+          <w:instrText>PAGEREF _Toc243215529 \h</w:instrText>
         </w:r>
         <w:r>
           <w:rPr>
@@ -970,7 +970,7 @@
           <w14:ligatures w14:val="standardContextual"/>
         </w:rPr>
       </w:pPr>
-      <w:hyperlink w:anchor="_Toc242290058" w:history="1">
+      <w:hyperlink w:anchor="_Toc243215530" w:history="1">
         <w:r>
           <w:rPr>
             <w:rStyle w:val="aff9"/>
@@ -1008,7 +1008,7 @@
             <w:noProof/>
             <w:webHidden/>
           </w:rPr>
-          <w:instrText>PAGEREF _Toc242290058 \h</w:instrText>
+          <w:instrText>PAGEREF _Toc243215530 \h</w:instrText>
         </w:r>
         <w:r>
           <w:rPr>
@@ -1066,7 +1066,7 @@
           <w14:ligatures w14:val="standardContextual"/>
         </w:rPr>
       </w:pPr>
-      <w:hyperlink w:anchor="_Toc242290059" w:history="1">
+      <w:hyperlink w:anchor="_Toc243215531" w:history="1">
         <w:r>
           <w:rPr>
             <w:rStyle w:val="aff9"/>
@@ -1104,7 +1104,7 @@
             <w:noProof/>
             <w:webHidden/>
           </w:rPr>
-          <w:instrText>PAGEREF _Toc242290059 \h</w:instrText>
+          <w:instrText>PAGEREF _Toc243215531 \h</w:instrText>
         </w:r>
         <w:r>
           <w:rPr>
@@ -1162,7 +1162,7 @@
           <w14:ligatures w14:val="standardContextual"/>
         </w:rPr>
       </w:pPr>
-      <w:hyperlink w:anchor="_Toc242290060" w:history="1">
+      <w:hyperlink w:anchor="_Toc243215532" w:history="1">
         <w:r>
           <w:rPr>
             <w:rStyle w:val="aff9"/>
@@ -1200,7 +1200,7 @@
             <w:noProof/>
             <w:webHidden/>
           </w:rPr>
-          <w:instrText>PAGEREF _Toc242290060 \h</w:instrText>
+          <w:instrText>PAGEREF _Toc243215532 \h</w:instrText>
         </w:r>
         <w:r>
           <w:rPr>
@@ -1258,7 +1258,7 @@
           <w14:ligatures w14:val="standardContextual"/>
         </w:rPr>
       </w:pPr>
-      <w:hyperlink w:anchor="_Toc242290061" w:history="1">
+      <w:hyperlink w:anchor="_Toc243215533" w:history="1">
         <w:r>
           <w:rPr>
             <w:rStyle w:val="aff9"/>
@@ -1296,103 +1296,7 @@
             <w:noProof/>
             <w:webHidden/>
           </w:rPr>
-          <w:instrText>PAGEREF _Toc242290061 \h</w:instrText>
-        </w:r>
-        <w:r>
-          <w:rPr>
-            <w:rFonts w:hint="eastAsia"/>
-            <w:noProof/>
-            <w:webHidden/>
-          </w:rPr>
-          <w:instrText xml:space="preserve"> </w:instrText>
-        </w:r>
-        <w:r>
-          <w:rPr>
-            <w:rFonts w:hint="eastAsia"/>
-            <w:noProof/>
-            <w:webHidden/>
-          </w:rPr>
-        </w:r>
-        <w:r>
-          <w:rPr>
-            <w:rFonts w:hint="eastAsia"/>
-            <w:noProof/>
-            <w:webHidden/>
-          </w:rPr>
-          <w:fldChar w:fldCharType="separate"/>
-        </w:r>
-        <w:r>
-          <w:rPr>
-            <w:noProof/>
-            <w:webHidden/>
-          </w:rPr>
-          <w:t>6</w:t>
-        </w:r>
-        <w:r>
-          <w:rPr>
-            <w:rFonts w:hint="eastAsia"/>
-            <w:noProof/>
-            <w:webHidden/>
-          </w:rPr>
-          <w:fldChar w:fldCharType="end"/>
-        </w:r>
-      </w:hyperlink>
-    </w:p>
-    <w:p>
-      <w:pPr>
-        <w:pStyle w:val="TOC1"/>
-        <w:tabs>
-          <w:tab w:val="right" w:leader="dot" w:pos="9402"/>
-        </w:tabs>
-        <w:rPr>
-          <w:rFonts w:asciiTheme="minorHAnsi" w:eastAsiaTheme="minorEastAsia" w:hAnsiTheme="minorHAnsi" w:hint="eastAsia"/>
-          <w:noProof/>
-          <w:kern w:val="2"/>
-          <w:sz w:val="22"/>
-          <w:szCs w:val="24"/>
-          <w:lang w:eastAsia="zh-CN"/>
-          <w14:ligatures w14:val="standardContextual"/>
-        </w:rPr>
-      </w:pPr>
-      <w:hyperlink w:anchor="_Toc242290062" w:history="1">
-        <w:r>
-          <w:rPr>
-            <w:rStyle w:val="aff9"/>
-            <w:rFonts w:eastAsia="Arial"/>
-            <w:noProof/>
-          </w:rPr>
-          <w:t>13. References</w:t>
-        </w:r>
-        <w:r>
-          <w:rPr>
-            <w:rFonts w:hint="eastAsia"/>
-            <w:noProof/>
-            <w:webHidden/>
-          </w:rPr>
-          <w:tab/>
-        </w:r>
-        <w:r>
-          <w:rPr>
-            <w:rFonts w:hint="eastAsia"/>
-            <w:noProof/>
-            <w:webHidden/>
-          </w:rPr>
-          <w:fldChar w:fldCharType="begin"/>
-        </w:r>
-        <w:r>
-          <w:rPr>
-            <w:rFonts w:hint="eastAsia"/>
-            <w:noProof/>
-            <w:webHidden/>
-          </w:rPr>
-          <w:instrText xml:space="preserve"> </w:instrText>
-        </w:r>
-        <w:r>
-          <w:rPr>
-            <w:noProof/>
-            <w:webHidden/>
-          </w:rPr>
-          <w:instrText>PAGEREF _Toc242290062 \h</w:instrText>
+          <w:instrText>PAGEREF _Toc243215533 \h</w:instrText>
         </w:r>
         <w:r>
           <w:rPr>
@@ -1450,14 +1354,14 @@
           <w14:ligatures w14:val="standardContextual"/>
         </w:rPr>
       </w:pPr>
-      <w:hyperlink w:anchor="_Toc242290063" w:history="1">
+      <w:hyperlink w:anchor="_Toc243215534" w:history="1">
         <w:r>
           <w:rPr>
             <w:rStyle w:val="aff9"/>
             <w:rFonts w:eastAsia="Arial"/>
             <w:noProof/>
           </w:rPr>
-          <w:t>14. Known limitations to disclose</w:t>
+          <w:t>13. References</w:t>
         </w:r>
         <w:r>
           <w:rPr>
@@ -1488,7 +1392,7 @@
             <w:noProof/>
             <w:webHidden/>
           </w:rPr>
-          <w:instrText>PAGEREF _Toc242290063 \h</w:instrText>
+          <w:instrText>PAGEREF _Toc243215534 \h</w:instrText>
         </w:r>
         <w:r>
           <w:rPr>
@@ -1531,6 +1435,102 @@
       </w:hyperlink>
     </w:p>
     <w:p>
+      <w:pPr>
+        <w:pStyle w:val="TOC1"/>
+        <w:tabs>
+          <w:tab w:val="right" w:leader="dot" w:pos="9402"/>
+        </w:tabs>
+        <w:rPr>
+          <w:rFonts w:asciiTheme="minorHAnsi" w:eastAsiaTheme="minorEastAsia" w:hAnsiTheme="minorHAnsi" w:hint="eastAsia"/>
+          <w:noProof/>
+          <w:kern w:val="2"/>
+          <w:sz w:val="22"/>
+          <w:szCs w:val="24"/>
+          <w:lang w:eastAsia="zh-CN"/>
+          <w14:ligatures w14:val="standardContextual"/>
+        </w:rPr>
+      </w:pPr>
+      <w:hyperlink w:anchor="_Toc243215535" w:history="1">
+        <w:r>
+          <w:rPr>
+            <w:rStyle w:val="aff9"/>
+            <w:rFonts w:eastAsia="Arial"/>
+            <w:noProof/>
+          </w:rPr>
+          <w:t>14. Known limitations to disclose</w:t>
+        </w:r>
+        <w:r>
+          <w:rPr>
+            <w:rFonts w:hint="eastAsia"/>
+            <w:noProof/>
+            <w:webHidden/>
+          </w:rPr>
+          <w:tab/>
+        </w:r>
+        <w:r>
+          <w:rPr>
+            <w:rFonts w:hint="eastAsia"/>
+            <w:noProof/>
+            <w:webHidden/>
+          </w:rPr>
+          <w:fldChar w:fldCharType="begin"/>
+        </w:r>
+        <w:r>
+          <w:rPr>
+            <w:rFonts w:hint="eastAsia"/>
+            <w:noProof/>
+            <w:webHidden/>
+          </w:rPr>
+          <w:instrText xml:space="preserve"> </w:instrText>
+        </w:r>
+        <w:r>
+          <w:rPr>
+            <w:noProof/>
+            <w:webHidden/>
+          </w:rPr>
+          <w:instrText>PAGEREF _Toc243215535 \h</w:instrText>
+        </w:r>
+        <w:r>
+          <w:rPr>
+            <w:rFonts w:hint="eastAsia"/>
+            <w:noProof/>
+            <w:webHidden/>
+          </w:rPr>
+          <w:instrText xml:space="preserve"> </w:instrText>
+        </w:r>
+        <w:r>
+          <w:rPr>
+            <w:rFonts w:hint="eastAsia"/>
+            <w:noProof/>
+            <w:webHidden/>
+          </w:rPr>
+        </w:r>
+        <w:r>
+          <w:rPr>
+            <w:rFonts w:hint="eastAsia"/>
+            <w:noProof/>
+            <w:webHidden/>
+          </w:rPr>
+          <w:fldChar w:fldCharType="separate"/>
+        </w:r>
+        <w:r>
+          <w:rPr>
+            <w:noProof/>
+            <w:webHidden/>
+          </w:rPr>
+          <w:t>7</w:t>
+        </w:r>
+        <w:r>
+          <w:rPr>
+            <w:rFonts w:hint="eastAsia"/>
+            <w:noProof/>
+            <w:webHidden/>
+          </w:rPr>
+          <w:fldChar w:fldCharType="end"/>
+        </w:r>
+      </w:hyperlink>
+    </w:p>
+    <w:p>
       <w:r>
         <w:rPr>
           <w:color w:val="000000"/>
@@ -1543,7 +1543,7 @@
         <w:pStyle w:val="1"/>
         <w:spacing w:before="280" w:after="120"/>
       </w:pPr>
-      <w:bookmarkStart w:id="0" w:name="_Toc242290050"/>
+      <w:bookmarkStart w:id="0" w:name="_Toc243215522"/>
       <w:r>
         <w:rPr>
           <w:rFonts w:ascii="Times New Roman" w:eastAsia="Arial" w:hAnsi="Times New Roman"/>
@@ -1567,7 +1567,7 @@
         <w:rPr>
           <w:color w:val="000000"/>
         </w:rPr>
-        <w:t>their own judgement. This project measures the market footprint of authority rather</w:t>
+        <w:t>their own judgement. This project measures how the market responds to authority rather</w:t>
       </w:r>
     </w:p>
     <w:p>
@@ -1661,7 +1661,7 @@
         <w:rPr>
           <w:color w:val="000000"/>
         </w:rPr>
-        <w:t xml:space="preserve">Question 3 is the hinge: it puts the </w:t>
+        <w:t xml:space="preserve">Question 3 is the key question: the </w:t>
       </w:r>
       <w:r>
         <w:rPr>
@@ -1682,7 +1682,7 @@
         <w:rPr>
           <w:color w:val="000000"/>
         </w:rPr>
-        <w:t>hypothesis** side by side, so descriptive statistics alone cannot settle it.</w:t>
+        <w:t>hypothesis** make opposite predictions for it, so descriptive statistics alone cannot settle it.</w:t>
       </w:r>
     </w:p>
     <w:tbl>
@@ -1992,7 +1992,7 @@
         <w:pStyle w:val="1"/>
         <w:spacing w:before="280" w:after="120"/>
       </w:pPr>
-      <w:bookmarkStart w:id="1" w:name="_Toc242290051"/>
+      <w:bookmarkStart w:id="1" w:name="_Toc243215523"/>
       <w:r>
         <w:rPr>
           <w:rFonts w:ascii="Times New Roman" w:eastAsia="Arial" w:hAnsi="Times New Roman"/>
@@ -2040,7 +2040,7 @@
         <w:pStyle w:val="1"/>
         <w:spacing w:before="280" w:after="120"/>
       </w:pPr>
-      <w:bookmarkStart w:id="2" w:name="_Toc242290052"/>
+      <w:bookmarkStart w:id="2" w:name="_Toc243215524"/>
       <w:r>
         <w:rPr>
           <w:rFonts w:ascii="Times New Roman" w:eastAsia="Arial" w:hAnsi="Times New Roman"/>
@@ -2460,7 +2460,7 @@
         <w:pStyle w:val="1"/>
         <w:spacing w:before="280" w:after="120"/>
       </w:pPr>
-      <w:bookmarkStart w:id="3" w:name="_Toc242290053"/>
+      <w:bookmarkStart w:id="3" w:name="_Toc243215525"/>
       <w:r>
         <w:rPr>
           <w:rFonts w:ascii="Times New Roman" w:eastAsia="Arial" w:hAnsi="Times New Roman"/>
@@ -2967,7 +2967,7 @@
         <w:pStyle w:val="1"/>
         <w:spacing w:before="280" w:after="120"/>
       </w:pPr>
-      <w:bookmarkStart w:id="4" w:name="_Toc242290054"/>
+      <w:bookmarkStart w:id="4" w:name="_Toc243215526"/>
       <w:r>
         <w:rPr>
           <w:rFonts w:ascii="Times New Roman" w:eastAsia="Arial" w:hAnsi="Times New Roman"/>
@@ -3344,31 +3344,47 @@
         <w:rPr>
           <w:color w:val="000000"/>
         </w:rPr>
-        <w:t>special awards, not an annual industry ranking. Evidence: 36% of its names appear in</w:t>
-      </w:r>
-    </w:p>
-    <w:p>
-      <w:r>
-        <w:rPr>
-          <w:color w:val="000000"/>
-        </w:rPr>
-        <w:t>no other year (versus 8-23% elsewhere), its name overlap with 2019 is Jaccard 0.10</w:t>
-      </w:r>
-    </w:p>
-    <w:p>
-      <w:r>
-        <w:rPr>
-          <w:color w:val="000000"/>
-        </w:rPr>
-        <w:t>(versus 0.40-0.52 for adjacent pairs), and it matches the rating data at only 3.6%</w:t>
-      </w:r>
-    </w:p>
-    <w:p>
-      <w:r>
-        <w:rPr>
-          <w:color w:val="000000"/>
-        </w:rPr>
-        <w:t>versus 10-17% for every other list-year. It is therefore excluded, and 2018 events</w:t>
+        <w:t>special awards, not an annual industry ranking. Evidence: 34.7% of its names appear</w:t>
+      </w:r>
+    </w:p>
+    <w:p>
+      <w:r>
+        <w:rPr>
+          <w:color w:val="000000"/>
+        </w:rPr>
+        <w:t>in no other year, against 8.1-17.7% for 2019-2023 (the boundary years 2017 and 2024</w:t>
+      </w:r>
+    </w:p>
+    <w:p>
+      <w:r>
+        <w:rPr>
+          <w:color w:val="000000"/>
+        </w:rPr>
+        <w:t>run higher for mechanical reasons); its name overlap with 2019 is Jaccard 0.10,</w:t>
+      </w:r>
+    </w:p>
+    <w:p>
+      <w:r>
+        <w:rPr>
+          <w:color w:val="000000"/>
+        </w:rPr>
+        <w:t>against 0.42-0.52 for other adjacent pairs; and under the same name-and-broker match</w:t>
+      </w:r>
+    </w:p>
+    <w:p>
+      <w:r>
+        <w:rPr>
+          <w:color w:val="000000"/>
+        </w:rPr>
+        <w:t>used for the star variable it reaches only 4.0% of that year's events, against</w:t>
+      </w:r>
+    </w:p>
+    <w:p>
+      <w:r>
+        <w:rPr>
+          <w:color w:val="000000"/>
+        </w:rPr>
+        <w:t>12.1-14.0% for every other list-year. It is therefore excluded, and 2018 events</w:t>
       </w:r>
     </w:p>
     <w:p>
@@ -3421,7 +3437,7 @@
         <w:pStyle w:val="1"/>
         <w:spacing w:before="280" w:after="120"/>
       </w:pPr>
-      <w:bookmarkStart w:id="5" w:name="_Toc242290055"/>
+      <w:bookmarkStart w:id="5" w:name="_Toc243215527"/>
       <w:r>
         <w:rPr>
           <w:rFonts w:ascii="Times New Roman" w:eastAsia="Arial" w:hAnsi="Times New Roman"/>
@@ -3547,6 +3563,7 @@
           <w:b/>
           <w:color w:val="000000"/>
         </w:rPr>
+        <w:lastRenderedPageBreak/>
         <w:t>Step 4, heterogeneity.</w:t>
       </w:r>
       <w:r>
@@ -3570,7 +3587,6 @@
           <w:b/>
           <w:color w:val="000000"/>
         </w:rPr>
-        <w:lastRenderedPageBreak/>
         <w:t>Step 5, mechanism (extension, only if time permits).</w:t>
       </w:r>
       <w:r>
@@ -3593,7 +3609,7 @@
         <w:pStyle w:val="1"/>
         <w:spacing w:before="280" w:after="120"/>
       </w:pPr>
-      <w:bookmarkStart w:id="6" w:name="_Toc242290056"/>
+      <w:bookmarkStart w:id="6" w:name="_Toc243215528"/>
       <w:r>
         <w:rPr>
           <w:rFonts w:ascii="Times New Roman" w:eastAsia="Arial" w:hAnsi="Times New Roman"/>
@@ -3799,7 +3815,7 @@
         <w:pStyle w:val="1"/>
         <w:spacing w:before="280" w:after="120"/>
       </w:pPr>
-      <w:bookmarkStart w:id="7" w:name="_Toc242290057"/>
+      <w:bookmarkStart w:id="7" w:name="_Toc243215529"/>
       <w:r>
         <w:rPr>
           <w:rFonts w:ascii="Times New Roman" w:eastAsia="Arial" w:hAnsi="Times New Roman"/>
@@ -3943,7 +3959,7 @@
         <w:pStyle w:val="1"/>
         <w:spacing w:before="280" w:after="120"/>
       </w:pPr>
-      <w:bookmarkStart w:id="8" w:name="_Toc242290058"/>
+      <w:bookmarkStart w:id="8" w:name="_Toc243215530"/>
       <w:r>
         <w:rPr>
           <w:rFonts w:ascii="Times New Roman" w:eastAsia="Arial" w:hAnsi="Times New Roman"/>
@@ -4028,6 +4044,7 @@
                 <w:color w:val="000000"/>
                 <w:sz w:val="21"/>
               </w:rPr>
+              <w:lastRenderedPageBreak/>
               <w:t>1 Collect recommendation revisions</w:t>
             </w:r>
           </w:p>
@@ -4108,7 +4125,6 @@
                 <w:color w:val="000000"/>
                 <w:sz w:val="21"/>
               </w:rPr>
-              <w:lastRenderedPageBreak/>
               <w:t>3 Event study, CAR and abnormal volume</w:t>
             </w:r>
           </w:p>
@@ -4222,7 +4238,7 @@
         <w:rPr>
           <w:color w:val="000000"/>
         </w:rPr>
-        <w:t>B also delivers the market data (daily returns, volume, turnover, market cap) and the</w:t>
+        <w:t>B also delivers the market data (prices, daily returns and volume) and the</w:t>
       </w:r>
     </w:p>
     <w:p>
@@ -4238,13 +4254,37 @@
           <w:color w:val="000000"/>
           <w:sz w:val="22"/>
         </w:rPr>
-        <w:t>event_study.py</w:t>
-      </w:r>
-      <w:r>
-        <w:rPr>
-          <w:color w:val="000000"/>
-        </w:rPr>
-        <w:t>.</w:t>
+        <w:t>行情数据交付说明</w:t>
+      </w:r>
+      <w:r>
+        <w:rPr>
+          <w:rFonts w:ascii="Consolas" w:hAnsi="Consolas"/>
+          <w:color w:val="000000"/>
+          <w:sz w:val="22"/>
+        </w:rPr>
+        <w:t>.md</w:t>
+      </w:r>
+      <w:r>
+        <w:rPr>
+          <w:color w:val="000000"/>
+        </w:rPr>
+        <w:t>;</w:t>
+      </w:r>
+    </w:p>
+    <w:p>
+      <w:r>
+        <w:rPr>
+          <w:rFonts w:ascii="Consolas" w:hAnsi="Consolas"/>
+          <w:color w:val="000000"/>
+          <w:sz w:val="22"/>
+        </w:rPr>
+        <w:t>event_study_v2.py</w:t>
+      </w:r>
+      <w:r>
+        <w:rPr>
+          <w:color w:val="000000"/>
+        </w:rPr>
+        <w:t xml:space="preserve"> accepts either a single panel or panels split by year.</w:t>
       </w:r>
     </w:p>
     <w:p>
@@ -4252,7 +4292,7 @@
         <w:pStyle w:val="1"/>
         <w:spacing w:before="280" w:after="120"/>
       </w:pPr>
-      <w:bookmarkStart w:id="9" w:name="_Toc242290059"/>
+      <w:bookmarkStart w:id="9" w:name="_Toc243215531"/>
       <w:r>
         <w:rPr>
           <w:rFonts w:ascii="Times New Roman" w:eastAsia="Arial" w:hAnsi="Times New Roman"/>
@@ -4348,7 +4388,7 @@
         <w:pStyle w:val="1"/>
         <w:spacing w:before="280" w:after="120"/>
       </w:pPr>
-      <w:bookmarkStart w:id="10" w:name="_Toc242290060"/>
+      <w:bookmarkStart w:id="10" w:name="_Toc243215532"/>
       <w:r>
         <w:rPr>
           <w:rFonts w:ascii="Times New Roman" w:eastAsia="Arial" w:hAnsi="Times New Roman"/>
@@ -4454,13 +4494,14 @@
         <w:pStyle w:val="1"/>
         <w:spacing w:before="280" w:after="120"/>
       </w:pPr>
-      <w:bookmarkStart w:id="11" w:name="_Toc242290061"/>
+      <w:bookmarkStart w:id="11" w:name="_Toc243215533"/>
       <w:r>
         <w:rPr>
           <w:rFonts w:ascii="Times New Roman" w:eastAsia="Arial" w:hAnsi="Times New Roman"/>
           <w:color w:val="000000"/>
           <w:sz w:val="30"/>
         </w:rPr>
+        <w:lastRenderedPageBreak/>
         <w:t>12. Anticipated questions</w:t>
       </w:r>
       <w:bookmarkEnd w:id="11"/>
@@ -4503,7 +4544,6 @@
         <w:rPr>
           <w:color w:val="000000"/>
         </w:rPr>
-        <w:lastRenderedPageBreak/>
         <w:t>controls.</w:t>
       </w:r>
     </w:p>
@@ -4619,7 +4659,7 @@
         <w:pStyle w:val="1"/>
         <w:spacing w:before="280" w:after="120"/>
       </w:pPr>
-      <w:bookmarkStart w:id="12" w:name="_Toc242290062"/>
+      <w:bookmarkStart w:id="12" w:name="_Toc243215534"/>
       <w:r>
         <w:rPr>
           <w:rFonts w:ascii="Times New Roman" w:eastAsia="Arial" w:hAnsi="Times New Roman"/>
@@ -4857,7 +4897,7 @@
         <w:pStyle w:val="1"/>
         <w:spacing w:before="280" w:after="120"/>
       </w:pPr>
-      <w:bookmarkStart w:id="13" w:name="_Toc242290063"/>
+      <w:bookmarkStart w:id="13" w:name="_Toc243215535"/>
       <w:r>
         <w:rPr>
           <w:rFonts w:ascii="Times New Roman" w:eastAsia="Arial" w:hAnsi="Times New Roman"/>
@@ -4917,6 +4957,7 @@
         <w:rPr>
           <w:color w:val="000000"/>
         </w:rPr>
+        <w:lastRenderedPageBreak/>
         <w:t xml:space="preserve">never be matched. The 237 hits for </w:t>
       </w:r>
       <w:r>
@@ -4957,7 +4998,6 @@
         <w:rPr>
           <w:color w:val="000000"/>
         </w:rPr>
-        <w:lastRenderedPageBreak/>
         <w:t>The ST filter is an approximation because historical ST status is unobtainable.</w:t>
       </w:r>
     </w:p>
@@ -5400,6 +5440,7 @@
         <w:rPr>
           <w:color w:val="000000"/>
         </w:rPr>
+        <w:lastRenderedPageBreak/>
         <w:t>counts show such names exist: the largest reach 6,805 records, which no one person files.</w:t>
       </w:r>
     </w:p>
@@ -5684,31 +5725,31 @@
       </w:rPr>
     </w:lvl>
   </w:abstractNum>
-  <w:num w:numId="1" w16cid:durableId="1566725214">
+  <w:num w:numId="1" w16cid:durableId="387152069">
     <w:abstractNumId w:val="8"/>
   </w:num>
-  <w:num w:numId="2" w16cid:durableId="2030179537">
+  <w:num w:numId="2" w16cid:durableId="1138650308">
     <w:abstractNumId w:val="6"/>
   </w:num>
-  <w:num w:numId="3" w16cid:durableId="1613397667">
+  <w:num w:numId="3" w16cid:durableId="1576815826">
     <w:abstractNumId w:val="5"/>
   </w:num>
-  <w:num w:numId="4" w16cid:durableId="401414052">
+  <w:num w:numId="4" w16cid:durableId="267549509">
     <w:abstractNumId w:val="4"/>
   </w:num>
-  <w:num w:numId="5" w16cid:durableId="1050424885">
+  <w:num w:numId="5" w16cid:durableId="1874266397">
     <w:abstractNumId w:val="7"/>
   </w:num>
-  <w:num w:numId="6" w16cid:durableId="863136144">
+  <w:num w:numId="6" w16cid:durableId="1684626881">
     <w:abstractNumId w:val="3"/>
   </w:num>
-  <w:num w:numId="7" w16cid:durableId="553005119">
+  <w:num w:numId="7" w16cid:durableId="391124685">
     <w:abstractNumId w:val="2"/>
   </w:num>
-  <w:num w:numId="8" w16cid:durableId="2074429709">
+  <w:num w:numId="8" w16cid:durableId="1666518274">
     <w:abstractNumId w:val="1"/>
   </w:num>
-  <w:num w:numId="9" w16cid:durableId="608005638">
+  <w:num w:numId="9" w16cid:durableId="1803227065">
     <w:abstractNumId w:val="0"/>
   </w:num>
 </w:numbering>
@@ -17107,14 +17148,14 @@
     <w:autoRedefine/>
     <w:uiPriority w:val="39"/>
     <w:unhideWhenUsed/>
-    <w:rsid w:val="00E73D5E"/>
+    <w:rsid w:val="00504ABD"/>
   </w:style>
   <w:style w:type="character" w:styleId="aff9">
     <w:name w:val="Hyperlink"/>
     <w:basedOn w:val="a2"/>
     <w:uiPriority w:val="99"/>
     <w:unhideWhenUsed/>
-    <w:rsid w:val="00E73D5E"/>
+    <w:rsid w:val="00504ABD"/>
     <w:rPr>
       <w:color w:val="0000FF" w:themeColor="hyperlink"/>
       <w:u w:val="single"/>

</xml_diff>

<commit_message>
Add the presentation and written-report outlines to the plan and memo
The English plan now carries the 14-slide outline and the report structure, the
Chinese plan points to them, and the memo has the same outline in section 12.

Co-Authored-By: Claude Code <noreply@anthropic.com>
</commit_message>
<xml_diff>
--- a/文档/Project10_Star_Analyst_Research_Plan_EN.docx
+++ b/文档/Project10_Star_Analyst_Research_Plan_EN.docx
@@ -202,7 +202,7 @@
         </w:rPr>
         <w:fldChar w:fldCharType="separate"/>
       </w:r>
-      <w:hyperlink w:anchor="_Toc243215522" w:history="1">
+      <w:hyperlink w:anchor="_Toc243228834" w:history="1">
         <w:r>
           <w:rPr>
             <w:rStyle w:val="aff9"/>
@@ -240,7 +240,7 @@
             <w:noProof/>
             <w:webHidden/>
           </w:rPr>
-          <w:instrText>PAGEREF _Toc243215522 \h</w:instrText>
+          <w:instrText>PAGEREF _Toc243228834 \h</w:instrText>
         </w:r>
         <w:r>
           <w:rPr>
@@ -298,7 +298,7 @@
           <w14:ligatures w14:val="standardContextual"/>
         </w:rPr>
       </w:pPr>
-      <w:hyperlink w:anchor="_Toc243215523" w:history="1">
+      <w:hyperlink w:anchor="_Toc243228835" w:history="1">
         <w:r>
           <w:rPr>
             <w:rStyle w:val="aff9"/>
@@ -336,7 +336,7 @@
             <w:noProof/>
             <w:webHidden/>
           </w:rPr>
-          <w:instrText>PAGEREF _Toc243215523 \h</w:instrText>
+          <w:instrText>PAGEREF _Toc243228835 \h</w:instrText>
         </w:r>
         <w:r>
           <w:rPr>
@@ -394,7 +394,7 @@
           <w14:ligatures w14:val="standardContextual"/>
         </w:rPr>
       </w:pPr>
-      <w:hyperlink w:anchor="_Toc243215524" w:history="1">
+      <w:hyperlink w:anchor="_Toc243228836" w:history="1">
         <w:r>
           <w:rPr>
             <w:rStyle w:val="aff9"/>
@@ -432,7 +432,7 @@
             <w:noProof/>
             <w:webHidden/>
           </w:rPr>
-          <w:instrText>PAGEREF _Toc243215524 \h</w:instrText>
+          <w:instrText>PAGEREF _Toc243228836 \h</w:instrText>
         </w:r>
         <w:r>
           <w:rPr>
@@ -490,7 +490,7 @@
           <w14:ligatures w14:val="standardContextual"/>
         </w:rPr>
       </w:pPr>
-      <w:hyperlink w:anchor="_Toc243215525" w:history="1">
+      <w:hyperlink w:anchor="_Toc243228837" w:history="1">
         <w:r>
           <w:rPr>
             <w:rStyle w:val="aff9"/>
@@ -528,7 +528,7 @@
             <w:noProof/>
             <w:webHidden/>
           </w:rPr>
-          <w:instrText>PAGEREF _Toc243215525 \h</w:instrText>
+          <w:instrText>PAGEREF _Toc243228837 \h</w:instrText>
         </w:r>
         <w:r>
           <w:rPr>
@@ -586,7 +586,7 @@
           <w14:ligatures w14:val="standardContextual"/>
         </w:rPr>
       </w:pPr>
-      <w:hyperlink w:anchor="_Toc243215526" w:history="1">
+      <w:hyperlink w:anchor="_Toc243228838" w:history="1">
         <w:r>
           <w:rPr>
             <w:rStyle w:val="aff9"/>
@@ -624,7 +624,7 @@
             <w:noProof/>
             <w:webHidden/>
           </w:rPr>
-          <w:instrText>PAGEREF _Toc243215526 \h</w:instrText>
+          <w:instrText>PAGEREF _Toc243228838 \h</w:instrText>
         </w:r>
         <w:r>
           <w:rPr>
@@ -682,7 +682,7 @@
           <w14:ligatures w14:val="standardContextual"/>
         </w:rPr>
       </w:pPr>
-      <w:hyperlink w:anchor="_Toc243215527" w:history="1">
+      <w:hyperlink w:anchor="_Toc243228839" w:history="1">
         <w:r>
           <w:rPr>
             <w:rStyle w:val="aff9"/>
@@ -720,103 +720,7 @@
             <w:noProof/>
             <w:webHidden/>
           </w:rPr>
-          <w:instrText>PAGEREF _Toc243215527 \h</w:instrText>
-        </w:r>
-        <w:r>
-          <w:rPr>
-            <w:rFonts w:hint="eastAsia"/>
-            <w:noProof/>
-            <w:webHidden/>
-          </w:rPr>
-          <w:instrText xml:space="preserve"> </w:instrText>
-        </w:r>
-        <w:r>
-          <w:rPr>
-            <w:rFonts w:hint="eastAsia"/>
-            <w:noProof/>
-            <w:webHidden/>
-          </w:rPr>
-        </w:r>
-        <w:r>
-          <w:rPr>
-            <w:rFonts w:hint="eastAsia"/>
-            <w:noProof/>
-            <w:webHidden/>
-          </w:rPr>
-          <w:fldChar w:fldCharType="separate"/>
-        </w:r>
-        <w:r>
-          <w:rPr>
-            <w:noProof/>
-            <w:webHidden/>
-          </w:rPr>
-          <w:t>4</w:t>
-        </w:r>
-        <w:r>
-          <w:rPr>
-            <w:rFonts w:hint="eastAsia"/>
-            <w:noProof/>
-            <w:webHidden/>
-          </w:rPr>
-          <w:fldChar w:fldCharType="end"/>
-        </w:r>
-      </w:hyperlink>
-    </w:p>
-    <w:p>
-      <w:pPr>
-        <w:pStyle w:val="TOC1"/>
-        <w:tabs>
-          <w:tab w:val="right" w:leader="dot" w:pos="9402"/>
-        </w:tabs>
-        <w:rPr>
-          <w:rFonts w:asciiTheme="minorHAnsi" w:eastAsiaTheme="minorEastAsia" w:hAnsiTheme="minorHAnsi" w:hint="eastAsia"/>
-          <w:noProof/>
-          <w:kern w:val="2"/>
-          <w:sz w:val="22"/>
-          <w:szCs w:val="24"/>
-          <w:lang w:eastAsia="zh-CN"/>
-          <w14:ligatures w14:val="standardContextual"/>
-        </w:rPr>
-      </w:pPr>
-      <w:hyperlink w:anchor="_Toc243215528" w:history="1">
-        <w:r>
-          <w:rPr>
-            <w:rStyle w:val="aff9"/>
-            <w:rFonts w:eastAsia="Arial"/>
-            <w:noProof/>
-          </w:rPr>
-          <w:t>7. China-specific issues the design must address</w:t>
-        </w:r>
-        <w:r>
-          <w:rPr>
-            <w:rFonts w:hint="eastAsia"/>
-            <w:noProof/>
-            <w:webHidden/>
-          </w:rPr>
-          <w:tab/>
-        </w:r>
-        <w:r>
-          <w:rPr>
-            <w:rFonts w:hint="eastAsia"/>
-            <w:noProof/>
-            <w:webHidden/>
-          </w:rPr>
-          <w:fldChar w:fldCharType="begin"/>
-        </w:r>
-        <w:r>
-          <w:rPr>
-            <w:rFonts w:hint="eastAsia"/>
-            <w:noProof/>
-            <w:webHidden/>
-          </w:rPr>
-          <w:instrText xml:space="preserve"> </w:instrText>
-        </w:r>
-        <w:r>
-          <w:rPr>
-            <w:noProof/>
-            <w:webHidden/>
-          </w:rPr>
-          <w:instrText>PAGEREF _Toc243215528 \h</w:instrText>
+          <w:instrText>PAGEREF _Toc243228839 \h</w:instrText>
         </w:r>
         <w:r>
           <w:rPr>
@@ -874,14 +778,14 @@
           <w14:ligatures w14:val="standardContextual"/>
         </w:rPr>
       </w:pPr>
-      <w:hyperlink w:anchor="_Toc243215529" w:history="1">
+      <w:hyperlink w:anchor="_Toc243228840" w:history="1">
         <w:r>
           <w:rPr>
             <w:rStyle w:val="aff9"/>
             <w:rFonts w:eastAsia="Arial"/>
             <w:noProof/>
           </w:rPr>
-          <w:t>8. Robustness plan</w:t>
+          <w:t>7. China-specific issues the design must address</w:t>
         </w:r>
         <w:r>
           <w:rPr>
@@ -912,7 +816,7 @@
             <w:noProof/>
             <w:webHidden/>
           </w:rPr>
-          <w:instrText>PAGEREF _Toc243215529 \h</w:instrText>
+          <w:instrText>PAGEREF _Toc243228840 \h</w:instrText>
         </w:r>
         <w:r>
           <w:rPr>
@@ -970,14 +874,14 @@
           <w14:ligatures w14:val="standardContextual"/>
         </w:rPr>
       </w:pPr>
-      <w:hyperlink w:anchor="_Toc243215530" w:history="1">
+      <w:hyperlink w:anchor="_Toc243228841" w:history="1">
         <w:r>
           <w:rPr>
             <w:rStyle w:val="aff9"/>
             <w:rFonts w:eastAsia="Arial"/>
             <w:noProof/>
           </w:rPr>
-          <w:t>9. Division of labour (2 people)</w:t>
+          <w:t>8. Robustness plan</w:t>
         </w:r>
         <w:r>
           <w:rPr>
@@ -1008,103 +912,7 @@
             <w:noProof/>
             <w:webHidden/>
           </w:rPr>
-          <w:instrText>PAGEREF _Toc243215530 \h</w:instrText>
-        </w:r>
-        <w:r>
-          <w:rPr>
-            <w:rFonts w:hint="eastAsia"/>
-            <w:noProof/>
-            <w:webHidden/>
-          </w:rPr>
-          <w:instrText xml:space="preserve"> </w:instrText>
-        </w:r>
-        <w:r>
-          <w:rPr>
-            <w:rFonts w:hint="eastAsia"/>
-            <w:noProof/>
-            <w:webHidden/>
-          </w:rPr>
-        </w:r>
-        <w:r>
-          <w:rPr>
-            <w:rFonts w:hint="eastAsia"/>
-            <w:noProof/>
-            <w:webHidden/>
-          </w:rPr>
-          <w:fldChar w:fldCharType="separate"/>
-        </w:r>
-        <w:r>
-          <w:rPr>
-            <w:noProof/>
-            <w:webHidden/>
-          </w:rPr>
-          <w:t>5</w:t>
-        </w:r>
-        <w:r>
-          <w:rPr>
-            <w:rFonts w:hint="eastAsia"/>
-            <w:noProof/>
-            <w:webHidden/>
-          </w:rPr>
-          <w:fldChar w:fldCharType="end"/>
-        </w:r>
-      </w:hyperlink>
-    </w:p>
-    <w:p>
-      <w:pPr>
-        <w:pStyle w:val="TOC1"/>
-        <w:tabs>
-          <w:tab w:val="right" w:leader="dot" w:pos="9402"/>
-        </w:tabs>
-        <w:rPr>
-          <w:rFonts w:asciiTheme="minorHAnsi" w:eastAsiaTheme="minorEastAsia" w:hAnsiTheme="minorHAnsi" w:hint="eastAsia"/>
-          <w:noProof/>
-          <w:kern w:val="2"/>
-          <w:sz w:val="22"/>
-          <w:szCs w:val="24"/>
-          <w:lang w:eastAsia="zh-CN"/>
-          <w14:ligatures w14:val="standardContextual"/>
-        </w:rPr>
-      </w:pPr>
-      <w:hyperlink w:anchor="_Toc243215531" w:history="1">
-        <w:r>
-          <w:rPr>
-            <w:rStyle w:val="aff9"/>
-            <w:rFonts w:eastAsia="Arial"/>
-            <w:noProof/>
-          </w:rPr>
-          <w:t>10. Timeline</w:t>
-        </w:r>
-        <w:r>
-          <w:rPr>
-            <w:rFonts w:hint="eastAsia"/>
-            <w:noProof/>
-            <w:webHidden/>
-          </w:rPr>
-          <w:tab/>
-        </w:r>
-        <w:r>
-          <w:rPr>
-            <w:rFonts w:hint="eastAsia"/>
-            <w:noProof/>
-            <w:webHidden/>
-          </w:rPr>
-          <w:fldChar w:fldCharType="begin"/>
-        </w:r>
-        <w:r>
-          <w:rPr>
-            <w:rFonts w:hint="eastAsia"/>
-            <w:noProof/>
-            <w:webHidden/>
-          </w:rPr>
-          <w:instrText xml:space="preserve"> </w:instrText>
-        </w:r>
-        <w:r>
-          <w:rPr>
-            <w:noProof/>
-            <w:webHidden/>
-          </w:rPr>
-          <w:instrText>PAGEREF _Toc243215531 \h</w:instrText>
+          <w:instrText>PAGEREF _Toc243228841 \h</w:instrText>
         </w:r>
         <w:r>
           <w:rPr>
@@ -1162,14 +970,14 @@
           <w14:ligatures w14:val="standardContextual"/>
         </w:rPr>
       </w:pPr>
-      <w:hyperlink w:anchor="_Toc243215532" w:history="1">
+      <w:hyperlink w:anchor="_Toc243228842" w:history="1">
         <w:r>
           <w:rPr>
             <w:rStyle w:val="aff9"/>
             <w:rFonts w:eastAsia="Arial"/>
             <w:noProof/>
           </w:rPr>
-          <w:t>11. Slide outline (maximum 15)</w:t>
+          <w:t>9. Division of labour (2 people)</w:t>
         </w:r>
         <w:r>
           <w:rPr>
@@ -1200,7 +1008,7 @@
             <w:noProof/>
             <w:webHidden/>
           </w:rPr>
-          <w:instrText>PAGEREF _Toc243215532 \h</w:instrText>
+          <w:instrText>PAGEREF _Toc243228842 \h</w:instrText>
         </w:r>
         <w:r>
           <w:rPr>
@@ -1258,14 +1066,14 @@
           <w14:ligatures w14:val="standardContextual"/>
         </w:rPr>
       </w:pPr>
-      <w:hyperlink w:anchor="_Toc243215533" w:history="1">
+      <w:hyperlink w:anchor="_Toc243228843" w:history="1">
         <w:r>
           <w:rPr>
             <w:rStyle w:val="aff9"/>
             <w:rFonts w:eastAsia="Arial"/>
             <w:noProof/>
           </w:rPr>
-          <w:t>12. Anticipated questions</w:t>
+          <w:t>10. Timeline</w:t>
         </w:r>
         <w:r>
           <w:rPr>
@@ -1296,7 +1104,103 @@
             <w:noProof/>
             <w:webHidden/>
           </w:rPr>
-          <w:instrText>PAGEREF _Toc243215533 \h</w:instrText>
+          <w:instrText>PAGEREF _Toc243228843 \h</w:instrText>
+        </w:r>
+        <w:r>
+          <w:rPr>
+            <w:rFonts w:hint="eastAsia"/>
+            <w:noProof/>
+            <w:webHidden/>
+          </w:rPr>
+          <w:instrText xml:space="preserve"> </w:instrText>
+        </w:r>
+        <w:r>
+          <w:rPr>
+            <w:rFonts w:hint="eastAsia"/>
+            <w:noProof/>
+            <w:webHidden/>
+          </w:rPr>
+        </w:r>
+        <w:r>
+          <w:rPr>
+            <w:rFonts w:hint="eastAsia"/>
+            <w:noProof/>
+            <w:webHidden/>
+          </w:rPr>
+          <w:fldChar w:fldCharType="separate"/>
+        </w:r>
+        <w:r>
+          <w:rPr>
+            <w:noProof/>
+            <w:webHidden/>
+          </w:rPr>
+          <w:t>6</w:t>
+        </w:r>
+        <w:r>
+          <w:rPr>
+            <w:rFonts w:hint="eastAsia"/>
+            <w:noProof/>
+            <w:webHidden/>
+          </w:rPr>
+          <w:fldChar w:fldCharType="end"/>
+        </w:r>
+      </w:hyperlink>
+    </w:p>
+    <w:p>
+      <w:pPr>
+        <w:pStyle w:val="TOC1"/>
+        <w:tabs>
+          <w:tab w:val="right" w:leader="dot" w:pos="9402"/>
+        </w:tabs>
+        <w:rPr>
+          <w:rFonts w:asciiTheme="minorHAnsi" w:eastAsiaTheme="minorEastAsia" w:hAnsiTheme="minorHAnsi" w:hint="eastAsia"/>
+          <w:noProof/>
+          <w:kern w:val="2"/>
+          <w:sz w:val="22"/>
+          <w:szCs w:val="24"/>
+          <w:lang w:eastAsia="zh-CN"/>
+          <w14:ligatures w14:val="standardContextual"/>
+        </w:rPr>
+      </w:pPr>
+      <w:hyperlink w:anchor="_Toc243228844" w:history="1">
+        <w:r>
+          <w:rPr>
+            <w:rStyle w:val="aff9"/>
+            <w:rFonts w:eastAsia="Arial"/>
+            <w:noProof/>
+          </w:rPr>
+          <w:t>11. Presentation and written report</w:t>
+        </w:r>
+        <w:r>
+          <w:rPr>
+            <w:rFonts w:hint="eastAsia"/>
+            <w:noProof/>
+            <w:webHidden/>
+          </w:rPr>
+          <w:tab/>
+        </w:r>
+        <w:r>
+          <w:rPr>
+            <w:rFonts w:hint="eastAsia"/>
+            <w:noProof/>
+            <w:webHidden/>
+          </w:rPr>
+          <w:fldChar w:fldCharType="begin"/>
+        </w:r>
+        <w:r>
+          <w:rPr>
+            <w:rFonts w:hint="eastAsia"/>
+            <w:noProof/>
+            <w:webHidden/>
+          </w:rPr>
+          <w:instrText xml:space="preserve"> </w:instrText>
+        </w:r>
+        <w:r>
+          <w:rPr>
+            <w:noProof/>
+            <w:webHidden/>
+          </w:rPr>
+          <w:instrText>PAGEREF _Toc243228844 \h</w:instrText>
         </w:r>
         <w:r>
           <w:rPr>
@@ -1340,10 +1244,11 @@
     </w:p>
     <w:p>
       <w:pPr>
-        <w:pStyle w:val="TOC1"/>
+        <w:pStyle w:val="TOC2"/>
         <w:tabs>
           <w:tab w:val="right" w:leader="dot" w:pos="9402"/>
         </w:tabs>
+        <w:ind w:left="480"/>
         <w:rPr>
           <w:rFonts w:asciiTheme="minorHAnsi" w:eastAsiaTheme="minorEastAsia" w:hAnsiTheme="minorHAnsi" w:hint="eastAsia"/>
           <w:noProof/>
@@ -1354,14 +1259,14 @@
           <w14:ligatures w14:val="standardContextual"/>
         </w:rPr>
       </w:pPr>
-      <w:hyperlink w:anchor="_Toc243215534" w:history="1">
+      <w:hyperlink w:anchor="_Toc243228845" w:history="1">
         <w:r>
           <w:rPr>
             <w:rStyle w:val="aff9"/>
             <w:rFonts w:eastAsia="Arial"/>
             <w:noProof/>
           </w:rPr>
-          <w:t>13. References</w:t>
+          <w:t>11.1 Slide outline (maximum 15)</w:t>
         </w:r>
         <w:r>
           <w:rPr>
@@ -1392,7 +1297,7 @@
             <w:noProof/>
             <w:webHidden/>
           </w:rPr>
-          <w:instrText>PAGEREF _Toc243215534 \h</w:instrText>
+          <w:instrText>PAGEREF _Toc243228845 \h</w:instrText>
         </w:r>
         <w:r>
           <w:rPr>
@@ -1436,10 +1341,11 @@
     </w:p>
     <w:p>
       <w:pPr>
-        <w:pStyle w:val="TOC1"/>
+        <w:pStyle w:val="TOC2"/>
         <w:tabs>
           <w:tab w:val="right" w:leader="dot" w:pos="9402"/>
         </w:tabs>
+        <w:ind w:left="480"/>
         <w:rPr>
           <w:rFonts w:asciiTheme="minorHAnsi" w:eastAsiaTheme="minorEastAsia" w:hAnsiTheme="minorHAnsi" w:hint="eastAsia"/>
           <w:noProof/>
@@ -1450,7 +1356,295 @@
           <w14:ligatures w14:val="standardContextual"/>
         </w:rPr>
       </w:pPr>
-      <w:hyperlink w:anchor="_Toc243215535" w:history="1">
+      <w:hyperlink w:anchor="_Toc243228846" w:history="1">
+        <w:r>
+          <w:rPr>
+            <w:rStyle w:val="aff9"/>
+            <w:rFonts w:eastAsia="Arial"/>
+            <w:noProof/>
+          </w:rPr>
+          <w:t>11.2 Written report outline</w:t>
+        </w:r>
+        <w:r>
+          <w:rPr>
+            <w:rFonts w:hint="eastAsia"/>
+            <w:noProof/>
+            <w:webHidden/>
+          </w:rPr>
+          <w:tab/>
+        </w:r>
+        <w:r>
+          <w:rPr>
+            <w:rFonts w:hint="eastAsia"/>
+            <w:noProof/>
+            <w:webHidden/>
+          </w:rPr>
+          <w:fldChar w:fldCharType="begin"/>
+        </w:r>
+        <w:r>
+          <w:rPr>
+            <w:rFonts w:hint="eastAsia"/>
+            <w:noProof/>
+            <w:webHidden/>
+          </w:rPr>
+          <w:instrText xml:space="preserve"> </w:instrText>
+        </w:r>
+        <w:r>
+          <w:rPr>
+            <w:noProof/>
+            <w:webHidden/>
+          </w:rPr>
+          <w:instrText>PAGEREF _Toc243228846 \h</w:instrText>
+        </w:r>
+        <w:r>
+          <w:rPr>
+            <w:rFonts w:hint="eastAsia"/>
+            <w:noProof/>
+            <w:webHidden/>
+          </w:rPr>
+          <w:instrText xml:space="preserve"> </w:instrText>
+        </w:r>
+        <w:r>
+          <w:rPr>
+            <w:rFonts w:hint="eastAsia"/>
+            <w:noProof/>
+            <w:webHidden/>
+          </w:rPr>
+        </w:r>
+        <w:r>
+          <w:rPr>
+            <w:rFonts w:hint="eastAsia"/>
+            <w:noProof/>
+            <w:webHidden/>
+          </w:rPr>
+          <w:fldChar w:fldCharType="separate"/>
+        </w:r>
+        <w:r>
+          <w:rPr>
+            <w:noProof/>
+            <w:webHidden/>
+          </w:rPr>
+          <w:t>8</w:t>
+        </w:r>
+        <w:r>
+          <w:rPr>
+            <w:rFonts w:hint="eastAsia"/>
+            <w:noProof/>
+            <w:webHidden/>
+          </w:rPr>
+          <w:fldChar w:fldCharType="end"/>
+        </w:r>
+      </w:hyperlink>
+    </w:p>
+    <w:p>
+      <w:pPr>
+        <w:pStyle w:val="TOC1"/>
+        <w:tabs>
+          <w:tab w:val="right" w:leader="dot" w:pos="9402"/>
+        </w:tabs>
+        <w:rPr>
+          <w:rFonts w:asciiTheme="minorHAnsi" w:eastAsiaTheme="minorEastAsia" w:hAnsiTheme="minorHAnsi" w:hint="eastAsia"/>
+          <w:noProof/>
+          <w:kern w:val="2"/>
+          <w:sz w:val="22"/>
+          <w:szCs w:val="24"/>
+          <w:lang w:eastAsia="zh-CN"/>
+          <w14:ligatures w14:val="standardContextual"/>
+        </w:rPr>
+      </w:pPr>
+      <w:hyperlink w:anchor="_Toc243228847" w:history="1">
+        <w:r>
+          <w:rPr>
+            <w:rStyle w:val="aff9"/>
+            <w:rFonts w:eastAsia="Arial"/>
+            <w:noProof/>
+          </w:rPr>
+          <w:t>12. Anticipated questions</w:t>
+        </w:r>
+        <w:r>
+          <w:rPr>
+            <w:rFonts w:hint="eastAsia"/>
+            <w:noProof/>
+            <w:webHidden/>
+          </w:rPr>
+          <w:tab/>
+        </w:r>
+        <w:r>
+          <w:rPr>
+            <w:rFonts w:hint="eastAsia"/>
+            <w:noProof/>
+            <w:webHidden/>
+          </w:rPr>
+          <w:fldChar w:fldCharType="begin"/>
+        </w:r>
+        <w:r>
+          <w:rPr>
+            <w:rFonts w:hint="eastAsia"/>
+            <w:noProof/>
+            <w:webHidden/>
+          </w:rPr>
+          <w:instrText xml:space="preserve"> </w:instrText>
+        </w:r>
+        <w:r>
+          <w:rPr>
+            <w:noProof/>
+            <w:webHidden/>
+          </w:rPr>
+          <w:instrText>PAGEREF _Toc243228847 \h</w:instrText>
+        </w:r>
+        <w:r>
+          <w:rPr>
+            <w:rFonts w:hint="eastAsia"/>
+            <w:noProof/>
+            <w:webHidden/>
+          </w:rPr>
+          <w:instrText xml:space="preserve"> </w:instrText>
+        </w:r>
+        <w:r>
+          <w:rPr>
+            <w:rFonts w:hint="eastAsia"/>
+            <w:noProof/>
+            <w:webHidden/>
+          </w:rPr>
+        </w:r>
+        <w:r>
+          <w:rPr>
+            <w:rFonts w:hint="eastAsia"/>
+            <w:noProof/>
+            <w:webHidden/>
+          </w:rPr>
+          <w:fldChar w:fldCharType="separate"/>
+        </w:r>
+        <w:r>
+          <w:rPr>
+            <w:noProof/>
+            <w:webHidden/>
+          </w:rPr>
+          <w:t>8</w:t>
+        </w:r>
+        <w:r>
+          <w:rPr>
+            <w:rFonts w:hint="eastAsia"/>
+            <w:noProof/>
+            <w:webHidden/>
+          </w:rPr>
+          <w:fldChar w:fldCharType="end"/>
+        </w:r>
+      </w:hyperlink>
+    </w:p>
+    <w:p>
+      <w:pPr>
+        <w:pStyle w:val="TOC1"/>
+        <w:tabs>
+          <w:tab w:val="right" w:leader="dot" w:pos="9402"/>
+        </w:tabs>
+        <w:rPr>
+          <w:rFonts w:asciiTheme="minorHAnsi" w:eastAsiaTheme="minorEastAsia" w:hAnsiTheme="minorHAnsi" w:hint="eastAsia"/>
+          <w:noProof/>
+          <w:kern w:val="2"/>
+          <w:sz w:val="22"/>
+          <w:szCs w:val="24"/>
+          <w:lang w:eastAsia="zh-CN"/>
+          <w14:ligatures w14:val="standardContextual"/>
+        </w:rPr>
+      </w:pPr>
+      <w:hyperlink w:anchor="_Toc243228848" w:history="1">
+        <w:r>
+          <w:rPr>
+            <w:rStyle w:val="aff9"/>
+            <w:rFonts w:eastAsia="Arial"/>
+            <w:noProof/>
+          </w:rPr>
+          <w:t>13. References</w:t>
+        </w:r>
+        <w:r>
+          <w:rPr>
+            <w:rFonts w:hint="eastAsia"/>
+            <w:noProof/>
+            <w:webHidden/>
+          </w:rPr>
+          <w:tab/>
+        </w:r>
+        <w:r>
+          <w:rPr>
+            <w:rFonts w:hint="eastAsia"/>
+            <w:noProof/>
+            <w:webHidden/>
+          </w:rPr>
+          <w:fldChar w:fldCharType="begin"/>
+        </w:r>
+        <w:r>
+          <w:rPr>
+            <w:rFonts w:hint="eastAsia"/>
+            <w:noProof/>
+            <w:webHidden/>
+          </w:rPr>
+          <w:instrText xml:space="preserve"> </w:instrText>
+        </w:r>
+        <w:r>
+          <w:rPr>
+            <w:noProof/>
+            <w:webHidden/>
+          </w:rPr>
+          <w:instrText>PAGEREF _Toc243228848 \h</w:instrText>
+        </w:r>
+        <w:r>
+          <w:rPr>
+            <w:rFonts w:hint="eastAsia"/>
+            <w:noProof/>
+            <w:webHidden/>
+          </w:rPr>
+          <w:instrText xml:space="preserve"> </w:instrText>
+        </w:r>
+        <w:r>
+          <w:rPr>
+            <w:rFonts w:hint="eastAsia"/>
+            <w:noProof/>
+            <w:webHidden/>
+          </w:rPr>
+        </w:r>
+        <w:r>
+          <w:rPr>
+            <w:rFonts w:hint="eastAsia"/>
+            <w:noProof/>
+            <w:webHidden/>
+          </w:rPr>
+          <w:fldChar w:fldCharType="separate"/>
+        </w:r>
+        <w:r>
+          <w:rPr>
+            <w:noProof/>
+            <w:webHidden/>
+          </w:rPr>
+          <w:t>9</w:t>
+        </w:r>
+        <w:r>
+          <w:rPr>
+            <w:rFonts w:hint="eastAsia"/>
+            <w:noProof/>
+            <w:webHidden/>
+          </w:rPr>
+          <w:fldChar w:fldCharType="end"/>
+        </w:r>
+      </w:hyperlink>
+    </w:p>
+    <w:p>
+      <w:pPr>
+        <w:pStyle w:val="TOC1"/>
+        <w:tabs>
+          <w:tab w:val="right" w:leader="dot" w:pos="9402"/>
+        </w:tabs>
+        <w:rPr>
+          <w:rFonts w:asciiTheme="minorHAnsi" w:eastAsiaTheme="minorEastAsia" w:hAnsiTheme="minorHAnsi" w:hint="eastAsia"/>
+          <w:noProof/>
+          <w:kern w:val="2"/>
+          <w:sz w:val="22"/>
+          <w:szCs w:val="24"/>
+          <w:lang w:eastAsia="zh-CN"/>
+          <w14:ligatures w14:val="standardContextual"/>
+        </w:rPr>
+      </w:pPr>
+      <w:hyperlink w:anchor="_Toc243228849" w:history="1">
         <w:r>
           <w:rPr>
             <w:rStyle w:val="aff9"/>
@@ -1488,7 +1682,7 @@
             <w:noProof/>
             <w:webHidden/>
           </w:rPr>
-          <w:instrText>PAGEREF _Toc243215535 \h</w:instrText>
+          <w:instrText>PAGEREF _Toc243228849 \h</w:instrText>
         </w:r>
         <w:r>
           <w:rPr>
@@ -1518,7 +1712,7 @@
             <w:noProof/>
             <w:webHidden/>
           </w:rPr>
-          <w:t>7</w:t>
+          <w:t>9</w:t>
         </w:r>
         <w:r>
           <w:rPr>
@@ -1543,7 +1737,7 @@
         <w:pStyle w:val="1"/>
         <w:spacing w:before="280" w:after="120"/>
       </w:pPr>
-      <w:bookmarkStart w:id="0" w:name="_Toc243215522"/>
+      <w:bookmarkStart w:id="0" w:name="_Toc243228834"/>
       <w:r>
         <w:rPr>
           <w:rFonts w:ascii="Times New Roman" w:eastAsia="Arial" w:hAnsi="Times New Roman"/>
@@ -1567,6 +1761,7 @@
         <w:rPr>
           <w:color w:val="000000"/>
         </w:rPr>
+        <w:lastRenderedPageBreak/>
         <w:t>their own judgement. This project measures how the market responds to authority rather</w:t>
       </w:r>
     </w:p>
@@ -1583,7 +1778,6 @@
         <w:rPr>
           <w:color w:val="000000"/>
         </w:rPr>
-        <w:lastRenderedPageBreak/>
         <w:t xml:space="preserve">recommendation changes made by </w:t>
       </w:r>
       <w:r>
@@ -1992,7 +2186,7 @@
         <w:pStyle w:val="1"/>
         <w:spacing w:before="280" w:after="120"/>
       </w:pPr>
-      <w:bookmarkStart w:id="1" w:name="_Toc243215523"/>
+      <w:bookmarkStart w:id="1" w:name="_Toc243228835"/>
       <w:r>
         <w:rPr>
           <w:rFonts w:ascii="Times New Roman" w:eastAsia="Arial" w:hAnsi="Times New Roman"/>
@@ -2040,7 +2234,7 @@
         <w:pStyle w:val="1"/>
         <w:spacing w:before="280" w:after="120"/>
       </w:pPr>
-      <w:bookmarkStart w:id="2" w:name="_Toc243215524"/>
+      <w:bookmarkStart w:id="2" w:name="_Toc243228836"/>
       <w:r>
         <w:rPr>
           <w:rFonts w:ascii="Times New Roman" w:eastAsia="Arial" w:hAnsi="Times New Roman"/>
@@ -2215,7 +2409,6 @@
         <w:rPr>
           <w:color w:val="000000"/>
         </w:rPr>
-        <w:lastRenderedPageBreak/>
         <w:t>mean giving up the China-specific contribution.</w:t>
       </w:r>
     </w:p>
@@ -2460,7 +2653,7 @@
         <w:pStyle w:val="1"/>
         <w:spacing w:before="280" w:after="120"/>
       </w:pPr>
-      <w:bookmarkStart w:id="3" w:name="_Toc243215525"/>
+      <w:bookmarkStart w:id="3" w:name="_Toc243228837"/>
       <w:r>
         <w:rPr>
           <w:rFonts w:ascii="Times New Roman" w:eastAsia="Arial" w:hAnsi="Times New Roman"/>
@@ -2967,7 +3160,7 @@
         <w:pStyle w:val="1"/>
         <w:spacing w:before="280" w:after="120"/>
       </w:pPr>
-      <w:bookmarkStart w:id="4" w:name="_Toc243215526"/>
+      <w:bookmarkStart w:id="4" w:name="_Toc243228838"/>
       <w:r>
         <w:rPr>
           <w:rFonts w:ascii="Times New Roman" w:eastAsia="Arial" w:hAnsi="Times New Roman"/>
@@ -3204,7 +3397,6 @@
                 <w:color w:val="000000"/>
                 <w:sz w:val="19"/>
               </w:rPr>
-              <w:lastRenderedPageBreak/>
               <w:t>券商层级</w:t>
             </w:r>
             <w:r>
@@ -3264,7 +3456,7 @@
                 <w:color w:val="000000"/>
                 <w:sz w:val="21"/>
               </w:rPr>
-              <w:t>, cut on the cumulative share of rating records after broker names are canonicalised</w:t>
+              <w:t>, cut on the cumulative share of rating records after broker names are canonicalised; 13 / 26 / 85 of 124 houses. Stable identities use the name in force at the start of the sample; later names are display-only</w:t>
             </w:r>
           </w:p>
         </w:tc>
@@ -3305,15 +3497,234 @@
         <w:rPr>
           <w:color w:val="000000"/>
         </w:rPr>
-        <w:t xml:space="preserve"> for 2,772 of 20,980 events (13.2%), and the share is stable across years:</w:t>
-      </w:r>
-    </w:p>
-    <w:p>
-      <w:r>
-        <w:rPr>
-          <w:color w:val="000000"/>
-        </w:rPr>
-        <w:t>13.4%, 14.5%, 13.5%, 13.6%, 13.6%, 11.8%, 11.6% for 2018-2024.</w:t>
+        <w:t xml:space="preserve"> for 2,774 of 20,980 events (13.2%), and the share is stable across years:</w:t>
+      </w:r>
+    </w:p>
+    <w:p>
+      <w:r>
+        <w:rPr>
+          <w:color w:val="000000"/>
+        </w:rPr>
+        <w:t>13.4%, 14.5%, 13.5%, 13.6%, 13.6%, 11.9%, 11.7% for 2018-2024.</w:t>
+      </w:r>
+    </w:p>
+    <w:p>
+      <w:r>
+        <w:rPr>
+          <w:b/>
+          <w:color w:val="000000"/>
+        </w:rPr>
+        <w:t>Broker identities over time.</w:t>
+      </w:r>
+      <w:r>
+        <w:rPr>
+          <w:color w:val="000000"/>
+        </w:rPr>
+        <w:t xml:space="preserve"> Renames and mergers are resolved into one stable</w:t>
+      </w:r>
+    </w:p>
+    <w:p>
+      <w:r>
+        <w:rPr>
+          <w:color w:val="000000"/>
+        </w:rPr>
+        <w:t>identity per research entity, named after the name in force at the start of the sample:</w:t>
+      </w:r>
+    </w:p>
+    <w:p>
+      <w:r>
+        <w:rPr>
+          <w:color w:val="000000"/>
+        </w:rPr>
+        <w:t>国泰君安</w:t>
+      </w:r>
+      <w:r>
+        <w:rPr>
+          <w:color w:val="000000"/>
+        </w:rPr>
+        <w:t xml:space="preserve"> (not </w:t>
+      </w:r>
+      <w:r>
+        <w:rPr>
+          <w:color w:val="000000"/>
+        </w:rPr>
+        <w:t>国泰海通</w:t>
+      </w:r>
+      <w:r>
+        <w:rPr>
+          <w:color w:val="000000"/>
+        </w:rPr>
+        <w:t xml:space="preserve"> until 2025), </w:t>
+      </w:r>
+      <w:r>
+        <w:rPr>
+          <w:color w:val="000000"/>
+        </w:rPr>
+        <w:t>安信证券</w:t>
+      </w:r>
+      <w:r>
+        <w:rPr>
+          <w:color w:val="000000"/>
+        </w:rPr>
+        <w:t xml:space="preserve"> (not </w:t>
+      </w:r>
+      <w:r>
+        <w:rPr>
+          <w:color w:val="000000"/>
+        </w:rPr>
+        <w:t>国投证券</w:t>
+      </w:r>
+      <w:r>
+        <w:rPr>
+          <w:color w:val="000000"/>
+        </w:rPr>
+        <w:t xml:space="preserve"> until 2024), </w:t>
+      </w:r>
+      <w:r>
+        <w:rPr>
+          <w:color w:val="000000"/>
+        </w:rPr>
+        <w:t>国联证券</w:t>
+      </w:r>
+      <w:r>
+        <w:rPr>
+          <w:color w:val="000000"/>
+        </w:rPr>
+        <w:t xml:space="preserve"> (not</w:t>
+      </w:r>
+    </w:p>
+    <w:p>
+      <w:r>
+        <w:rPr>
+          <w:color w:val="000000"/>
+        </w:rPr>
+        <w:t>国联民生</w:t>
+      </w:r>
+      <w:r>
+        <w:rPr>
+          <w:color w:val="000000"/>
+        </w:rPr>
+        <w:t xml:space="preserve"> until 2025), </w:t>
+      </w:r>
+      <w:r>
+        <w:rPr>
+          <w:color w:val="000000"/>
+        </w:rPr>
+        <w:t>华菁证券</w:t>
+      </w:r>
+      <w:r>
+        <w:rPr>
+          <w:color w:val="000000"/>
+        </w:rPr>
+        <w:t xml:space="preserve"> (not </w:t>
+      </w:r>
+      <w:r>
+        <w:rPr>
+          <w:color w:val="000000"/>
+        </w:rPr>
+        <w:t>华兴证券</w:t>
+      </w:r>
+      <w:r>
+        <w:rPr>
+          <w:color w:val="000000"/>
+        </w:rPr>
+        <w:t xml:space="preserve"> until 2021), </w:t>
+      </w:r>
+      <w:r>
+        <w:rPr>
+          <w:color w:val="000000"/>
+        </w:rPr>
+        <w:t>新时代证券</w:t>
+      </w:r>
+      <w:r>
+        <w:rPr>
+          <w:color w:val="000000"/>
+        </w:rPr>
+        <w:t xml:space="preserve"> (not </w:t>
+      </w:r>
+      <w:r>
+        <w:rPr>
+          <w:color w:val="000000"/>
+        </w:rPr>
+        <w:t>诚通证券</w:t>
+      </w:r>
+      <w:r>
+        <w:rPr>
+          <w:color w:val="000000"/>
+        </w:rPr>
+        <w:t xml:space="preserve"> until</w:t>
+      </w:r>
+    </w:p>
+    <w:p>
+      <w:r>
+        <w:rPr>
+          <w:color w:val="000000"/>
+        </w:rPr>
+        <w:t xml:space="preserve">2022), </w:t>
+      </w:r>
+      <w:r>
+        <w:rPr>
+          <w:color w:val="000000"/>
+        </w:rPr>
+        <w:t>联讯证券</w:t>
+      </w:r>
+      <w:r>
+        <w:rPr>
+          <w:color w:val="000000"/>
+        </w:rPr>
+        <w:t xml:space="preserve"> (not </w:t>
+      </w:r>
+      <w:r>
+        <w:rPr>
+          <w:color w:val="000000"/>
+        </w:rPr>
+        <w:t>粤开证券</w:t>
+      </w:r>
+      <w:r>
+        <w:rPr>
+          <w:color w:val="000000"/>
+        </w:rPr>
+        <w:t xml:space="preserve"> until 2020), </w:t>
+      </w:r>
+      <w:r>
+        <w:rPr>
+          <w:color w:val="000000"/>
+        </w:rPr>
+        <w:t>财富证券</w:t>
+      </w:r>
+      <w:r>
+        <w:rPr>
+          <w:color w:val="000000"/>
+        </w:rPr>
+        <w:t xml:space="preserve"> (not </w:t>
+      </w:r>
+      <w:r>
+        <w:rPr>
+          <w:color w:val="000000"/>
+        </w:rPr>
+        <w:t>财信证券</w:t>
+      </w:r>
+      <w:r>
+        <w:rPr>
+          <w:color w:val="000000"/>
+        </w:rPr>
+        <w:t xml:space="preserve"> until 2020). Event-level</w:t>
+      </w:r>
+    </w:p>
+    <w:p>
+      <w:r>
+        <w:rPr>
+          <w:color w:val="000000"/>
+        </w:rPr>
+        <w:t>display uses the in-year name, so a 2018 Guotai Junan report is never written as Guotai</w:t>
+      </w:r>
+    </w:p>
+    <w:p>
+      <w:r>
+        <w:rPr>
+          <w:color w:val="000000"/>
+        </w:rPr>
+        <w:t>Haitong. The tier is built on the stable identities.</w:t>
       </w:r>
     </w:p>
     <w:p>
@@ -3437,7 +3848,7 @@
         <w:pStyle w:val="1"/>
         <w:spacing w:before="280" w:after="120"/>
       </w:pPr>
-      <w:bookmarkStart w:id="5" w:name="_Toc243215527"/>
+      <w:bookmarkStart w:id="5" w:name="_Toc243228839"/>
       <w:r>
         <w:rPr>
           <w:rFonts w:ascii="Times New Roman" w:eastAsia="Arial" w:hAnsi="Times New Roman"/>
@@ -3563,7 +3974,6 @@
           <w:b/>
           <w:color w:val="000000"/>
         </w:rPr>
-        <w:lastRenderedPageBreak/>
         <w:t>Step 4, heterogeneity.</w:t>
       </w:r>
       <w:r>
@@ -3609,7 +4019,7 @@
         <w:pStyle w:val="1"/>
         <w:spacing w:before="280" w:after="120"/>
       </w:pPr>
-      <w:bookmarkStart w:id="6" w:name="_Toc243215528"/>
+      <w:bookmarkStart w:id="6" w:name="_Toc243228840"/>
       <w:r>
         <w:rPr>
           <w:rFonts w:ascii="Times New Roman" w:eastAsia="Arial" w:hAnsi="Times New Roman"/>
@@ -3815,7 +4225,7 @@
         <w:pStyle w:val="1"/>
         <w:spacing w:before="280" w:after="120"/>
       </w:pPr>
-      <w:bookmarkStart w:id="7" w:name="_Toc243215529"/>
+      <w:bookmarkStart w:id="7" w:name="_Toc243228841"/>
       <w:r>
         <w:rPr>
           <w:rFonts w:ascii="Times New Roman" w:eastAsia="Arial" w:hAnsi="Times New Roman"/>
@@ -3906,6 +4316,38 @@
           <w:color w:val="000000"/>
         </w:rPr>
         <w:t>.</w:t>
+      </w:r>
+    </w:p>
+    <w:p>
+      <w:r>
+        <w:rPr>
+          <w:color w:val="000000"/>
+        </w:rPr>
+        <w:t>Already implemented: a suspension robustness check that drops events with a suspension</w:t>
+      </w:r>
+    </w:p>
+    <w:p>
+      <w:r>
+        <w:rPr>
+          <w:color w:val="000000"/>
+        </w:rPr>
+        <w:t>day in the window, a backward-looking rolling tier, and stock-clustered errors in the</w:t>
+      </w:r>
+    </w:p>
+    <w:p>
+      <w:r>
+        <w:rPr>
+          <w:color w:val="000000"/>
+        </w:rPr>
+        <w:t>interaction models. Still to do: limit-hit and ST filters, main-board/ChiNext splits,</w:t>
+      </w:r>
+    </w:p>
+    <w:p>
+      <w:r>
+        <w:rPr>
+          <w:color w:val="000000"/>
+        </w:rPr>
+        <w:t>and earnings-announcement overlap.</w:t>
       </w:r>
     </w:p>
     <w:p>
@@ -3959,7 +4401,7 @@
         <w:pStyle w:val="1"/>
         <w:spacing w:before="280" w:after="120"/>
       </w:pPr>
-      <w:bookmarkStart w:id="8" w:name="_Toc243215530"/>
+      <w:bookmarkStart w:id="8" w:name="_Toc243228842"/>
       <w:r>
         <w:rPr>
           <w:rFonts w:ascii="Times New Roman" w:eastAsia="Arial" w:hAnsi="Times New Roman"/>
@@ -4044,7 +4486,6 @@
                 <w:color w:val="000000"/>
                 <w:sz w:val="21"/>
               </w:rPr>
-              <w:lastRenderedPageBreak/>
               <w:t>1 Collect recommendation revisions</w:t>
             </w:r>
           </w:p>
@@ -4292,7 +4733,7 @@
         <w:pStyle w:val="1"/>
         <w:spacing w:before="280" w:after="120"/>
       </w:pPr>
-      <w:bookmarkStart w:id="9" w:name="_Toc243215531"/>
+      <w:bookmarkStart w:id="9" w:name="_Toc243228843"/>
       <w:r>
         <w:rPr>
           <w:rFonts w:ascii="Times New Roman" w:eastAsia="Arial" w:hAnsi="Times New Roman"/>
@@ -4308,79 +4749,103 @@
         <w:rPr>
           <w:color w:val="000000"/>
         </w:rPr>
-        <w:t>The presentation is on 27 October 2026 and roughly one effective week is available, so</w:t>
-      </w:r>
-    </w:p>
-    <w:p>
-      <w:r>
-        <w:rPr>
-          <w:color w:val="000000"/>
-        </w:rPr>
-        <w:t>the work is split into a scatter phase and a sprint week.</w:t>
-      </w:r>
-    </w:p>
-    <w:p>
-      <w:r>
-        <w:rPr>
-          <w:color w:val="000000"/>
-        </w:rPr>
-        <w:t>Before 19 October, four half-hour tasks that unblock everything else: confirm the iFinD</w:t>
-      </w:r>
-    </w:p>
-    <w:p>
-      <w:r>
-        <w:rPr>
-          <w:color w:val="000000"/>
-        </w:rPr>
-        <w:t>interface, install the missing Python packages, start collecting the New Fortune list,</w:t>
-      </w:r>
-    </w:p>
-    <w:p>
-      <w:r>
-        <w:rPr>
-          <w:color w:val="000000"/>
-        </w:rPr>
-        <w:t>confirm the written-report deadline with the TA.</w:t>
-      </w:r>
-    </w:p>
-    <w:p>
-      <w:r>
-        <w:rPr>
-          <w:color w:val="000000"/>
-        </w:rPr>
-        <w:t>Sprint week 20-26 October: pull and clean the data (20-21), main results (22-23),</w:t>
-      </w:r>
-    </w:p>
-    <w:p>
-      <w:r>
-        <w:rPr>
-          <w:color w:val="000000"/>
-        </w:rPr>
-        <w:t>robustness and heterogeneity (24), slides (25), rehearsal with timing (26).</w:t>
-      </w:r>
-    </w:p>
-    <w:p>
-      <w:r>
-        <w:rPr>
-          <w:color w:val="000000"/>
-        </w:rPr>
-        <w:t>Survival rules: main results must exist by 23 October, or the sample is cut to 20 stocks</w:t>
-      </w:r>
-    </w:p>
-    <w:p>
-      <w:r>
-        <w:rPr>
-          <w:color w:val="000000"/>
-        </w:rPr>
-        <w:t>until the pipeline runs end to end; slides freeze on 25 October; rehearse twice with a</w:t>
-      </w:r>
-    </w:p>
-    <w:p>
-      <w:r>
-        <w:rPr>
-          <w:color w:val="000000"/>
-        </w:rPr>
-        <w:t>timer and cut content rather than speed up delivery.</w:t>
+        <w:t>Status as of 18 October: the sample, authority variables, announcement results, drift,</w:t>
+      </w:r>
+    </w:p>
+    <w:p>
+      <w:r>
+        <w:rPr>
+          <w:color w:val="000000"/>
+        </w:rPr>
+        <w:t>accuracy, forecast error, direction and tier interactions, suspension robustness and the</w:t>
+      </w:r>
+    </w:p>
+    <w:p>
+      <w:r>
+        <w:rPr>
+          <w:color w:val="000000"/>
+        </w:rPr>
+        <w:t>rolling-tier robustness are done. The remaining work is clustered standard errors for the</w:t>
+      </w:r>
+    </w:p>
+    <w:p>
+      <w:r>
+        <w:rPr>
+          <w:color w:val="000000"/>
+        </w:rPr>
+        <w:t>event-study and accuracy tables, limit-hit and ST robustness, the three main figures,</w:t>
+      </w:r>
+    </w:p>
+    <w:p>
+      <w:r>
+        <w:rPr>
+          <w:color w:val="000000"/>
+        </w:rPr>
+        <w:t>slides and rehearsal.</w:t>
+      </w:r>
+    </w:p>
+    <w:p>
+      <w:r>
+        <w:rPr>
+          <w:color w:val="000000"/>
+        </w:rPr>
+        <w:t>19-20 October: clustered errors, limit-hit and ST robustness.</w:t>
+      </w:r>
+    </w:p>
+    <w:p>
+      <w:r>
+        <w:rPr>
+          <w:color w:val="000000"/>
+        </w:rPr>
+        <w:t>21-22 October: three main figures and the data appendix.</w:t>
+      </w:r>
+    </w:p>
+    <w:p>
+      <w:r>
+        <w:rPr>
+          <w:color w:val="000000"/>
+        </w:rPr>
+        <w:t>23-24 October: slides, with one owner per half.</w:t>
+      </w:r>
+    </w:p>
+    <w:p>
+      <w:r>
+        <w:rPr>
+          <w:color w:val="000000"/>
+        </w:rPr>
+        <w:t>25 October: first timed rehearsal.</w:t>
+      </w:r>
+    </w:p>
+    <w:p>
+      <w:r>
+        <w:rPr>
+          <w:color w:val="000000"/>
+        </w:rPr>
+        <w:t>26 October: second rehearsal and freeze.</w:t>
+      </w:r>
+    </w:p>
+    <w:p>
+      <w:r>
+        <w:rPr>
+          <w:color w:val="000000"/>
+        </w:rPr>
+        <w:t>27 October: presentation, 15 minutes plus 5 minutes of Q&amp;A.</w:t>
+      </w:r>
+    </w:p>
+    <w:p>
+      <w:r>
+        <w:rPr>
+          <w:color w:val="000000"/>
+        </w:rPr>
+        <w:t>Survival rules: slides freeze on 25 October; rehearse twice with a timer and cut content</w:t>
+      </w:r>
+    </w:p>
+    <w:p>
+      <w:r>
+        <w:rPr>
+          <w:color w:val="000000"/>
+        </w:rPr>
+        <w:t>rather than speed up delivery.</w:t>
       </w:r>
     </w:p>
     <w:p>
@@ -4388,105 +4853,1108 @@
         <w:pStyle w:val="1"/>
         <w:spacing w:before="280" w:after="120"/>
       </w:pPr>
-      <w:bookmarkStart w:id="10" w:name="_Toc243215532"/>
+      <w:bookmarkStart w:id="10" w:name="_Toc243228844"/>
       <w:r>
         <w:rPr>
           <w:rFonts w:ascii="Times New Roman" w:eastAsia="Arial" w:hAnsi="Times New Roman"/>
           <w:color w:val="000000"/>
           <w:sz w:val="30"/>
         </w:rPr>
-        <w:t>11. Slide outline (maximum 15)</w:t>
+        <w:t>11. Presentation and written report</w:t>
       </w:r>
       <w:bookmarkEnd w:id="10"/>
     </w:p>
     <w:p>
-      <w:r>
-        <w:rPr>
-          <w:color w:val="000000"/>
-        </w:rPr>
-        <w:t>Hook with a concrete case; institutional background on why China; the Milgram-to-market</w:t>
-      </w:r>
-    </w:p>
-    <w:p>
-      <w:r>
-        <w:rPr>
-          <w:color w:val="000000"/>
-        </w:rPr>
-        <w:t>mechanism; the four research questions and the two competing hypotheses; **the mapping</w:t>
-      </w:r>
-    </w:p>
-    <w:p>
-      <w:r>
-        <w:rPr>
-          <w:color w:val="000000"/>
-        </w:rPr>
-        <w:t>from each hypothesis to the data that can test it</w:t>
+      <w:pPr>
+        <w:pStyle w:val="21"/>
+        <w:spacing w:after="120"/>
+      </w:pPr>
+      <w:bookmarkStart w:id="11" w:name="_Toc243228845"/>
+      <w:r>
+        <w:rPr>
+          <w:rFonts w:ascii="Times New Roman" w:eastAsia="Arial" w:hAnsi="Times New Roman"/>
+          <w:color w:val="000000"/>
+        </w:rPr>
+        <w:t>11.1 Slide outline (maximum 15)</w:t>
+      </w:r>
+      <w:bookmarkEnd w:id="11"/>
+    </w:p>
+    <w:tbl>
+      <w:tblPr>
+        <w:tblStyle w:val="aff1"/>
+        <w:tblW w:w="0" w:type="auto"/>
+        <w:jc w:val="center"/>
+        <w:tblLook w:val="04A0" w:firstRow="1" w:lastRow="0" w:firstColumn="1" w:lastColumn="0" w:noHBand="0" w:noVBand="1"/>
+      </w:tblPr>
+      <w:tblGrid>
+        <w:gridCol w:w="3137"/>
+        <w:gridCol w:w="3137"/>
+        <w:gridCol w:w="3137"/>
+      </w:tblGrid>
+      <w:tr>
+        <w:trPr>
+          <w:cantSplit/>
+          <w:tblHeader/>
+          <w:jc w:val="center"/>
+        </w:trPr>
+        <w:tc>
+          <w:tcPr>
+            <w:tcW w:w="3137" w:type="dxa"/>
+            <w:shd w:val="clear" w:color="auto" w:fill="F2F2F2"/>
+          </w:tcPr>
+          <w:p>
+            <w:pPr>
+              <w:spacing w:after="40" w:line="276" w:lineRule="auto"/>
+            </w:pPr>
+            <w:r>
+              <w:rPr>
+                <w:b/>
+                <w:color w:val="000000"/>
+                <w:sz w:val="21"/>
+              </w:rPr>
+              <w:t>Slide</w:t>
+            </w:r>
+          </w:p>
+        </w:tc>
+        <w:tc>
+          <w:tcPr>
+            <w:tcW w:w="3137" w:type="dxa"/>
+            <w:shd w:val="clear" w:color="auto" w:fill="F2F2F2"/>
+          </w:tcPr>
+          <w:p>
+            <w:pPr>
+              <w:spacing w:after="40" w:line="276" w:lineRule="auto"/>
+            </w:pPr>
+            <w:r>
+              <w:rPr>
+                <w:b/>
+                <w:color w:val="000000"/>
+                <w:sz w:val="21"/>
+              </w:rPr>
+              <w:t>Content</w:t>
+            </w:r>
+          </w:p>
+        </w:tc>
+        <w:tc>
+          <w:tcPr>
+            <w:tcW w:w="3137" w:type="dxa"/>
+            <w:shd w:val="clear" w:color="auto" w:fill="F2F2F2"/>
+          </w:tcPr>
+          <w:p>
+            <w:pPr>
+              <w:spacing w:after="40" w:line="276" w:lineRule="auto"/>
+            </w:pPr>
+            <w:r>
+              <w:rPr>
+                <w:b/>
+                <w:color w:val="000000"/>
+                <w:sz w:val="21"/>
+              </w:rPr>
+              <w:t>What it must show</w:t>
+            </w:r>
+          </w:p>
+        </w:tc>
+      </w:tr>
+      <w:tr>
+        <w:trPr>
+          <w:cantSplit/>
+          <w:jc w:val="center"/>
+        </w:trPr>
+        <w:tc>
+          <w:tcPr>
+            <w:tcW w:w="3137" w:type="dxa"/>
+          </w:tcPr>
+          <w:p>
+            <w:pPr>
+              <w:spacing w:after="40" w:line="276" w:lineRule="auto"/>
+            </w:pPr>
+            <w:r>
+              <w:rPr>
+                <w:color w:val="000000"/>
+                <w:sz w:val="21"/>
+              </w:rPr>
+              <w:t>1</w:t>
+            </w:r>
+          </w:p>
+        </w:tc>
+        <w:tc>
+          <w:tcPr>
+            <w:tcW w:w="3137" w:type="dxa"/>
+          </w:tcPr>
+          <w:p>
+            <w:pPr>
+              <w:spacing w:after="40" w:line="276" w:lineRule="auto"/>
+            </w:pPr>
+            <w:r>
+              <w:rPr>
+                <w:color w:val="000000"/>
+                <w:sz w:val="21"/>
+              </w:rPr>
+              <w:t>Opening case</w:t>
+            </w:r>
+          </w:p>
+        </w:tc>
+        <w:tc>
+          <w:tcPr>
+            <w:tcW w:w="3137" w:type="dxa"/>
+          </w:tcPr>
+          <w:p>
+            <w:pPr>
+              <w:spacing w:after="40" w:line="276" w:lineRule="auto"/>
+            </w:pPr>
+            <w:r>
+              <w:rPr>
+                <w:color w:val="000000"/>
+                <w:sz w:val="21"/>
+              </w:rPr>
+              <w:t>One concrete event; no self-introduction</w:t>
+            </w:r>
+          </w:p>
+        </w:tc>
+      </w:tr>
+      <w:tr>
+        <w:trPr>
+          <w:cantSplit/>
+          <w:jc w:val="center"/>
+        </w:trPr>
+        <w:tc>
+          <w:tcPr>
+            <w:tcW w:w="3137" w:type="dxa"/>
+          </w:tcPr>
+          <w:p>
+            <w:pPr>
+              <w:spacing w:after="40" w:line="276" w:lineRule="auto"/>
+            </w:pPr>
+            <w:r>
+              <w:rPr>
+                <w:color w:val="000000"/>
+                <w:sz w:val="21"/>
+              </w:rPr>
+              <w:t>2</w:t>
+            </w:r>
+          </w:p>
+        </w:tc>
+        <w:tc>
+          <w:tcPr>
+            <w:tcW w:w="3137" w:type="dxa"/>
+          </w:tcPr>
+          <w:p>
+            <w:pPr>
+              <w:spacing w:after="40" w:line="276" w:lineRule="auto"/>
+            </w:pPr>
+            <w:r>
+              <w:rPr>
+                <w:color w:val="000000"/>
+                <w:sz w:val="21"/>
+              </w:rPr>
+              <w:t>Research question and why China</w:t>
+            </w:r>
+          </w:p>
+        </w:tc>
+        <w:tc>
+          <w:tcPr>
+            <w:tcW w:w="3137" w:type="dxa"/>
+          </w:tcPr>
+          <w:p>
+            <w:pPr>
+              <w:spacing w:after="40" w:line="276" w:lineRule="auto"/>
+            </w:pPr>
+            <w:r>
+              <w:rPr>
+                <w:color w:val="000000"/>
+                <w:sz w:val="21"/>
+              </w:rPr>
+              <w:t>Retail turnover, T+1, price limits, New Fortune</w:t>
+            </w:r>
+          </w:p>
+        </w:tc>
+      </w:tr>
+      <w:tr>
+        <w:trPr>
+          <w:cantSplit/>
+          <w:jc w:val="center"/>
+        </w:trPr>
+        <w:tc>
+          <w:tcPr>
+            <w:tcW w:w="3137" w:type="dxa"/>
+          </w:tcPr>
+          <w:p>
+            <w:pPr>
+              <w:spacing w:after="40" w:line="276" w:lineRule="auto"/>
+            </w:pPr>
+            <w:r>
+              <w:rPr>
+                <w:color w:val="000000"/>
+                <w:sz w:val="21"/>
+              </w:rPr>
+              <w:t>3</w:t>
+            </w:r>
+          </w:p>
+        </w:tc>
+        <w:tc>
+          <w:tcPr>
+            <w:tcW w:w="3137" w:type="dxa"/>
+          </w:tcPr>
+          <w:p>
+            <w:pPr>
+              <w:spacing w:after="40" w:line="276" w:lineRule="auto"/>
+            </w:pPr>
+            <w:r>
+              <w:rPr>
+                <w:color w:val="000000"/>
+                <w:sz w:val="21"/>
+              </w:rPr>
+              <w:t>Two hypotheses and three tests</w:t>
+            </w:r>
+          </w:p>
+        </w:tc>
+        <w:tc>
+          <w:tcPr>
+            <w:tcW w:w="3137" w:type="dxa"/>
+          </w:tcPr>
+          <w:p>
+            <w:pPr>
+              <w:spacing w:after="40" w:line="276" w:lineRule="auto"/>
+            </w:pPr>
+            <w:r>
+              <w:rPr>
+                <w:color w:val="000000"/>
+                <w:sz w:val="21"/>
+              </w:rPr>
+              <w:t>Information vs influence; announcement, drift, accuracy</w:t>
+            </w:r>
+          </w:p>
+        </w:tc>
+      </w:tr>
+      <w:tr>
+        <w:trPr>
+          <w:cantSplit/>
+          <w:jc w:val="center"/>
+        </w:trPr>
+        <w:tc>
+          <w:tcPr>
+            <w:tcW w:w="3137" w:type="dxa"/>
+          </w:tcPr>
+          <w:p>
+            <w:pPr>
+              <w:spacing w:after="40" w:line="276" w:lineRule="auto"/>
+            </w:pPr>
+            <w:r>
+              <w:rPr>
+                <w:color w:val="000000"/>
+                <w:sz w:val="21"/>
+              </w:rPr>
+              <w:t>4</w:t>
+            </w:r>
+          </w:p>
+        </w:tc>
+        <w:tc>
+          <w:tcPr>
+            <w:tcW w:w="3137" w:type="dxa"/>
+          </w:tcPr>
+          <w:p>
+            <w:pPr>
+              <w:spacing w:after="40" w:line="276" w:lineRule="auto"/>
+            </w:pPr>
+            <w:r>
+              <w:rPr>
+                <w:color w:val="000000"/>
+                <w:sz w:val="21"/>
+              </w:rPr>
+              <w:t>Data and sample</w:t>
+            </w:r>
+          </w:p>
+        </w:tc>
+        <w:tc>
+          <w:tcPr>
+            <w:tcW w:w="3137" w:type="dxa"/>
+          </w:tcPr>
+          <w:p>
+            <w:pPr>
+              <w:spacing w:after="40" w:line="276" w:lineRule="auto"/>
+            </w:pPr>
+            <w:r>
+              <w:rPr>
+                <w:color w:val="000000"/>
+                <w:sz w:val="21"/>
+              </w:rPr>
+              <w:t>iFinD; 20,980 revisions; cleaning funnel</w:t>
+            </w:r>
+          </w:p>
+        </w:tc>
+      </w:tr>
+      <w:tr>
+        <w:trPr>
+          <w:cantSplit/>
+          <w:jc w:val="center"/>
+        </w:trPr>
+        <w:tc>
+          <w:tcPr>
+            <w:tcW w:w="3137" w:type="dxa"/>
+          </w:tcPr>
+          <w:p>
+            <w:pPr>
+              <w:spacing w:after="40" w:line="276" w:lineRule="auto"/>
+            </w:pPr>
+            <w:r>
+              <w:rPr>
+                <w:color w:val="000000"/>
+                <w:sz w:val="21"/>
+              </w:rPr>
+              <w:t>5</w:t>
+            </w:r>
+          </w:p>
+        </w:tc>
+        <w:tc>
+          <w:tcPr>
+            <w:tcW w:w="3137" w:type="dxa"/>
+          </w:tcPr>
+          <w:p>
+            <w:pPr>
+              <w:spacing w:after="40" w:line="276" w:lineRule="auto"/>
+            </w:pPr>
+            <w:r>
+              <w:rPr>
+                <w:color w:val="000000"/>
+                <w:sz w:val="21"/>
+              </w:rPr>
+              <w:t>Authority variables</w:t>
+            </w:r>
+          </w:p>
+        </w:tc>
+        <w:tc>
+          <w:tcPr>
+            <w:tcW w:w="3137" w:type="dxa"/>
+          </w:tcPr>
+          <w:p>
+            <w:pPr>
+              <w:spacing w:after="40" w:line="276" w:lineRule="auto"/>
+            </w:pPr>
+            <w:r>
+              <w:rPr>
+                <w:color w:val="000000"/>
+                <w:sz w:val="21"/>
+              </w:rPr>
+              <w:t>star, seniority, broker tier; sample-period identities and in-year names</w:t>
+            </w:r>
+          </w:p>
+        </w:tc>
+      </w:tr>
+      <w:tr>
+        <w:trPr>
+          <w:cantSplit/>
+          <w:jc w:val="center"/>
+        </w:trPr>
+        <w:tc>
+          <w:tcPr>
+            <w:tcW w:w="3137" w:type="dxa"/>
+          </w:tcPr>
+          <w:p>
+            <w:pPr>
+              <w:spacing w:after="40" w:line="276" w:lineRule="auto"/>
+            </w:pPr>
+            <w:r>
+              <w:rPr>
+                <w:color w:val="000000"/>
+                <w:sz w:val="21"/>
+              </w:rPr>
+              <w:t>6</w:t>
+            </w:r>
+          </w:p>
+        </w:tc>
+        <w:tc>
+          <w:tcPr>
+            <w:tcW w:w="3137" w:type="dxa"/>
+          </w:tcPr>
+          <w:p>
+            <w:pPr>
+              <w:spacing w:after="40" w:line="276" w:lineRule="auto"/>
+            </w:pPr>
+            <w:r>
+              <w:rPr>
+                <w:color w:val="000000"/>
+                <w:sz w:val="21"/>
+              </w:rPr>
+              <w:t>Empirical design</w:t>
+            </w:r>
+          </w:p>
+        </w:tc>
+        <w:tc>
+          <w:tcPr>
+            <w:tcW w:w="3137" w:type="dxa"/>
+          </w:tcPr>
+          <w:p>
+            <w:pPr>
+              <w:spacing w:after="40" w:line="276" w:lineRule="auto"/>
+            </w:pPr>
+            <w:r>
+              <w:rPr>
+                <w:color w:val="000000"/>
+                <w:sz w:val="21"/>
+              </w:rPr>
+              <w:t>Windows, CAR, abnormal volume, drift, holding returns, 80% validity rule</w:t>
+            </w:r>
+          </w:p>
+        </w:tc>
+      </w:tr>
+      <w:tr>
+        <w:trPr>
+          <w:cantSplit/>
+          <w:jc w:val="center"/>
+        </w:trPr>
+        <w:tc>
+          <w:tcPr>
+            <w:tcW w:w="3137" w:type="dxa"/>
+          </w:tcPr>
+          <w:p>
+            <w:pPr>
+              <w:spacing w:after="40" w:line="276" w:lineRule="auto"/>
+            </w:pPr>
+            <w:r>
+              <w:rPr>
+                <w:color w:val="000000"/>
+                <w:sz w:val="21"/>
+              </w:rPr>
+              <w:t>7</w:t>
+            </w:r>
+          </w:p>
+        </w:tc>
+        <w:tc>
+          <w:tcPr>
+            <w:tcW w:w="3137" w:type="dxa"/>
+          </w:tcPr>
+          <w:p>
+            <w:pPr>
+              <w:spacing w:after="40" w:line="276" w:lineRule="auto"/>
+            </w:pPr>
+            <w:r>
+              <w:rPr>
+                <w:color w:val="000000"/>
+                <w:sz w:val="21"/>
+              </w:rPr>
+              <w:t>Q1: announcement</w:t>
+            </w:r>
+          </w:p>
+        </w:tc>
+        <w:tc>
+          <w:tcPr>
+            <w:tcW w:w="3137" w:type="dxa"/>
+          </w:tcPr>
+          <w:p>
+            <w:pPr>
+              <w:spacing w:after="40" w:line="276" w:lineRule="auto"/>
+            </w:pPr>
+            <w:r>
+              <w:rPr>
+                <w:color w:val="000000"/>
+                <w:sz w:val="21"/>
+              </w:rPr>
+              <w:t>Star upgrades vs downgrades, CAR and volume</w:t>
+            </w:r>
+          </w:p>
+        </w:tc>
+      </w:tr>
+      <w:tr>
+        <w:trPr>
+          <w:cantSplit/>
+          <w:jc w:val="center"/>
+        </w:trPr>
+        <w:tc>
+          <w:tcPr>
+            <w:tcW w:w="3137" w:type="dxa"/>
+          </w:tcPr>
+          <w:p>
+            <w:pPr>
+              <w:spacing w:after="40" w:line="276" w:lineRule="auto"/>
+            </w:pPr>
+            <w:r>
+              <w:rPr>
+                <w:color w:val="000000"/>
+                <w:sz w:val="21"/>
+              </w:rPr>
+              <w:t>8</w:t>
+            </w:r>
+          </w:p>
+        </w:tc>
+        <w:tc>
+          <w:tcPr>
+            <w:tcW w:w="3137" w:type="dxa"/>
+          </w:tcPr>
+          <w:p>
+            <w:pPr>
+              <w:spacing w:after="40" w:line="276" w:lineRule="auto"/>
+            </w:pPr>
+            <w:r>
+              <w:rPr>
+                <w:color w:val="000000"/>
+                <w:sz w:val="21"/>
+              </w:rPr>
+              <w:t>Q2: drift</w:t>
+            </w:r>
+          </w:p>
+        </w:tc>
+        <w:tc>
+          <w:tcPr>
+            <w:tcW w:w="3137" w:type="dxa"/>
+          </w:tcPr>
+          <w:p>
+            <w:pPr>
+              <w:spacing w:after="40" w:line="276" w:lineRule="auto"/>
+            </w:pPr>
+            <w:r>
+              <w:rPr>
+                <w:color w:val="000000"/>
+                <w:sz w:val="21"/>
+              </w:rPr>
+              <w:t>+2 to +250 path; downgrade underperformance then reversal</w:t>
+            </w:r>
+          </w:p>
+        </w:tc>
+      </w:tr>
+      <w:tr>
+        <w:trPr>
+          <w:cantSplit/>
+          <w:jc w:val="center"/>
+        </w:trPr>
+        <w:tc>
+          <w:tcPr>
+            <w:tcW w:w="3137" w:type="dxa"/>
+          </w:tcPr>
+          <w:p>
+            <w:pPr>
+              <w:spacing w:after="40" w:line="276" w:lineRule="auto"/>
+            </w:pPr>
+            <w:r>
+              <w:rPr>
+                <w:color w:val="000000"/>
+                <w:sz w:val="21"/>
+              </w:rPr>
+              <w:t>9</w:t>
+            </w:r>
+          </w:p>
+        </w:tc>
+        <w:tc>
+          <w:tcPr>
+            <w:tcW w:w="3137" w:type="dxa"/>
+          </w:tcPr>
+          <w:p>
+            <w:pPr>
+              <w:spacing w:after="40" w:line="276" w:lineRule="auto"/>
+            </w:pPr>
+            <w:r>
+              <w:rPr>
+                <w:color w:val="000000"/>
+                <w:sz w:val="21"/>
+              </w:rPr>
+              <w:t>Q3: accuracy</w:t>
+            </w:r>
+          </w:p>
+        </w:tc>
+        <w:tc>
+          <w:tcPr>
+            <w:tcW w:w="3137" w:type="dxa"/>
+          </w:tcPr>
+          <w:p>
+            <w:pPr>
+              <w:spacing w:after="40" w:line="276" w:lineRule="auto"/>
+            </w:pPr>
+            <w:r>
+              <w:rPr>
+                <w:color w:val="000000"/>
+                <w:sz w:val="21"/>
+              </w:rPr>
+              <w:t>6/12-month holding returns and EPS forecast error</w:t>
+            </w:r>
+          </w:p>
+        </w:tc>
+      </w:tr>
+      <w:tr>
+        <w:trPr>
+          <w:cantSplit/>
+          <w:jc w:val="center"/>
+        </w:trPr>
+        <w:tc>
+          <w:tcPr>
+            <w:tcW w:w="3137" w:type="dxa"/>
+          </w:tcPr>
+          <w:p>
+            <w:pPr>
+              <w:spacing w:after="40" w:line="276" w:lineRule="auto"/>
+            </w:pPr>
+            <w:r>
+              <w:rPr>
+                <w:color w:val="000000"/>
+                <w:sz w:val="21"/>
+              </w:rPr>
+              <w:t>10</w:t>
+            </w:r>
+          </w:p>
+        </w:tc>
+        <w:tc>
+          <w:tcPr>
+            <w:tcW w:w="3137" w:type="dxa"/>
+          </w:tcPr>
+          <w:p>
+            <w:pPr>
+              <w:spacing w:after="40" w:line="276" w:lineRule="auto"/>
+            </w:pPr>
+            <w:r>
+              <w:rPr>
+                <w:color w:val="000000"/>
+                <w:sz w:val="21"/>
+              </w:rPr>
+              <w:t>Q4: asymmetry and tier</w:t>
+            </w:r>
+          </w:p>
+        </w:tc>
+        <w:tc>
+          <w:tcPr>
+            <w:tcW w:w="3137" w:type="dxa"/>
+          </w:tcPr>
+          <w:p>
+            <w:pPr>
+              <w:spacing w:after="40" w:line="276" w:lineRule="auto"/>
+            </w:pPr>
+            <w:r>
+              <w:rPr>
+                <w:color w:val="000000"/>
+                <w:sz w:val="21"/>
+              </w:rPr>
+              <w:t>Interaction models; top-tier upgrade premium</w:t>
+            </w:r>
+          </w:p>
+        </w:tc>
+      </w:tr>
+      <w:tr>
+        <w:trPr>
+          <w:cantSplit/>
+          <w:jc w:val="center"/>
+        </w:trPr>
+        <w:tc>
+          <w:tcPr>
+            <w:tcW w:w="3137" w:type="dxa"/>
+          </w:tcPr>
+          <w:p>
+            <w:pPr>
+              <w:spacing w:after="40" w:line="276" w:lineRule="auto"/>
+            </w:pPr>
+            <w:r>
+              <w:rPr>
+                <w:color w:val="000000"/>
+                <w:sz w:val="21"/>
+              </w:rPr>
+              <w:t>11</w:t>
+            </w:r>
+          </w:p>
+        </w:tc>
+        <w:tc>
+          <w:tcPr>
+            <w:tcW w:w="3137" w:type="dxa"/>
+          </w:tcPr>
+          <w:p>
+            <w:pPr>
+              <w:spacing w:after="40" w:line="276" w:lineRule="auto"/>
+            </w:pPr>
+            <w:r>
+              <w:rPr>
+                <w:color w:val="000000"/>
+                <w:sz w:val="21"/>
+              </w:rPr>
+              <w:t>Robustness</w:t>
+            </w:r>
+          </w:p>
+        </w:tc>
+        <w:tc>
+          <w:tcPr>
+            <w:tcW w:w="3137" w:type="dxa"/>
+          </w:tcPr>
+          <w:p>
+            <w:pPr>
+              <w:spacing w:after="40" w:line="276" w:lineRule="auto"/>
+            </w:pPr>
+            <w:r>
+              <w:rPr>
+                <w:color w:val="000000"/>
+                <w:sz w:val="21"/>
+              </w:rPr>
+              <w:t>Suspension drop, clustering, alternative star definitions, rolling tier</w:t>
+            </w:r>
+          </w:p>
+        </w:tc>
+      </w:tr>
+      <w:tr>
+        <w:trPr>
+          <w:cantSplit/>
+          <w:jc w:val="center"/>
+        </w:trPr>
+        <w:tc>
+          <w:tcPr>
+            <w:tcW w:w="3137" w:type="dxa"/>
+          </w:tcPr>
+          <w:p>
+            <w:pPr>
+              <w:spacing w:after="40" w:line="276" w:lineRule="auto"/>
+            </w:pPr>
+            <w:r>
+              <w:rPr>
+                <w:color w:val="000000"/>
+                <w:sz w:val="21"/>
+              </w:rPr>
+              <w:t>12</w:t>
+            </w:r>
+          </w:p>
+        </w:tc>
+        <w:tc>
+          <w:tcPr>
+            <w:tcW w:w="3137" w:type="dxa"/>
+          </w:tcPr>
+          <w:p>
+            <w:pPr>
+              <w:spacing w:after="40" w:line="276" w:lineRule="auto"/>
+            </w:pPr>
+            <w:r>
+              <w:rPr>
+                <w:color w:val="000000"/>
+                <w:sz w:val="21"/>
+              </w:rPr>
+              <w:t>Interpretation</w:t>
+            </w:r>
+          </w:p>
+        </w:tc>
+        <w:tc>
+          <w:tcPr>
+            <w:tcW w:w="3137" w:type="dxa"/>
+          </w:tcPr>
+          <w:p>
+            <w:pPr>
+              <w:spacing w:after="40" w:line="276" w:lineRule="auto"/>
+            </w:pPr>
+            <w:r>
+              <w:rPr>
+                <w:color w:val="000000"/>
+                <w:sz w:val="21"/>
+              </w:rPr>
+              <w:t>Short-run information, long-run following; career concerns</w:t>
+            </w:r>
+          </w:p>
+        </w:tc>
+      </w:tr>
+      <w:tr>
+        <w:trPr>
+          <w:cantSplit/>
+          <w:jc w:val="center"/>
+        </w:trPr>
+        <w:tc>
+          <w:tcPr>
+            <w:tcW w:w="3137" w:type="dxa"/>
+          </w:tcPr>
+          <w:p>
+            <w:pPr>
+              <w:spacing w:after="40" w:line="276" w:lineRule="auto"/>
+            </w:pPr>
+            <w:r>
+              <w:rPr>
+                <w:color w:val="000000"/>
+                <w:sz w:val="21"/>
+              </w:rPr>
+              <w:t>13</w:t>
+            </w:r>
+          </w:p>
+        </w:tc>
+        <w:tc>
+          <w:tcPr>
+            <w:tcW w:w="3137" w:type="dxa"/>
+          </w:tcPr>
+          <w:p>
+            <w:pPr>
+              <w:spacing w:after="40" w:line="276" w:lineRule="auto"/>
+            </w:pPr>
+            <w:r>
+              <w:rPr>
+                <w:color w:val="000000"/>
+                <w:sz w:val="21"/>
+              </w:rPr>
+              <w:t>Conclusion</w:t>
+            </w:r>
+          </w:p>
+        </w:tc>
+        <w:tc>
+          <w:tcPr>
+            <w:tcW w:w="3137" w:type="dxa"/>
+          </w:tcPr>
+          <w:p>
+            <w:pPr>
+              <w:spacing w:after="40" w:line="276" w:lineRule="auto"/>
+            </w:pPr>
+            <w:r>
+              <w:rPr>
+                <w:color w:val="000000"/>
+                <w:sz w:val="21"/>
+              </w:rPr>
+              <w:t>Three claims and implications</w:t>
+            </w:r>
+          </w:p>
+        </w:tc>
+      </w:tr>
+      <w:tr>
+        <w:trPr>
+          <w:cantSplit/>
+          <w:jc w:val="center"/>
+        </w:trPr>
+        <w:tc>
+          <w:tcPr>
+            <w:tcW w:w="3137" w:type="dxa"/>
+          </w:tcPr>
+          <w:p>
+            <w:pPr>
+              <w:spacing w:after="40" w:line="276" w:lineRule="auto"/>
+            </w:pPr>
+            <w:r>
+              <w:rPr>
+                <w:color w:val="000000"/>
+                <w:sz w:val="21"/>
+              </w:rPr>
+              <w:t>14</w:t>
+            </w:r>
+          </w:p>
+        </w:tc>
+        <w:tc>
+          <w:tcPr>
+            <w:tcW w:w="3137" w:type="dxa"/>
+          </w:tcPr>
+          <w:p>
+            <w:pPr>
+              <w:spacing w:after="40" w:line="276" w:lineRule="auto"/>
+            </w:pPr>
+            <w:r>
+              <w:rPr>
+                <w:color w:val="000000"/>
+                <w:sz w:val="21"/>
+              </w:rPr>
+              <w:t>Backup</w:t>
+            </w:r>
+          </w:p>
+        </w:tc>
+        <w:tc>
+          <w:tcPr>
+            <w:tcW w:w="3137" w:type="dxa"/>
+          </w:tcPr>
+          <w:p>
+            <w:pPr>
+              <w:spacing w:after="40" w:line="276" w:lineRule="auto"/>
+            </w:pPr>
+            <w:r>
+              <w:rPr>
+                <w:color w:val="000000"/>
+                <w:sz w:val="21"/>
+              </w:rPr>
+              <w:t>Variable definitions, data sources, extra tables</w:t>
+            </w:r>
+          </w:p>
+        </w:tc>
+      </w:tr>
+    </w:tbl>
+    <w:p>
+      <w:pPr>
+        <w:spacing w:after="0"/>
+      </w:pPr>
+    </w:p>
+    <w:p>
+      <w:r>
+        <w:rPr>
+          <w:color w:val="000000"/>
+        </w:rPr>
+        <w:t xml:space="preserve">Two hard requirements from the instructor's feedback: </w:t>
       </w:r>
       <w:r>
         <w:rPr>
           <w:b/>
           <w:color w:val="000000"/>
         </w:rPr>
-        <w:t xml:space="preserve">; </w:t>
-      </w:r>
-      <w:r>
-        <w:rPr>
-          <w:color w:val="000000"/>
-        </w:rPr>
-        <w:t>the research pipeline as a flow</w:t>
-      </w:r>
-    </w:p>
-    <w:p>
-      <w:r>
-        <w:rPr>
-          <w:color w:val="000000"/>
-        </w:rPr>
-        <w:t>chart**; data sources and sample construction rules; three results slides; heterogeneity;</w:t>
-      </w:r>
-    </w:p>
-    <w:p>
-      <w:r>
-        <w:rPr>
-          <w:color w:val="000000"/>
-        </w:rPr>
-        <w:t>robustness; conclusion; extensions; appendix and Q&amp;A backup.</w:t>
-      </w:r>
-    </w:p>
-    <w:p>
-      <w:r>
-        <w:rPr>
-          <w:color w:val="000000"/>
-        </w:rPr>
-        <w:t>Two hard requirements from the instructor's feedback on earlier groups: **no limitations</w:t>
-      </w:r>
-    </w:p>
-    <w:p>
-      <w:r>
-        <w:rPr>
-          <w:color w:val="000000"/>
-        </w:rPr>
-        <w:t>on the slides</w:t>
-      </w:r>
-      <w:r>
-        <w:rPr>
-          <w:b/>
-          <w:color w:val="000000"/>
-        </w:rPr>
-        <w:t xml:space="preserve"> (they belong in the written report), and </w:t>
-      </w:r>
-      <w:r>
-        <w:rPr>
-          <w:color w:val="000000"/>
-        </w:rPr>
-        <w:t>show the process and the logic</w:t>
-      </w:r>
-    </w:p>
-    <w:p>
-      <w:r>
-        <w:rPr>
-          <w:color w:val="000000"/>
-        </w:rPr>
-        <w:t>chain, not only the final result**.</w:t>
+        <w:t>no limitations on the slides</w:t>
+      </w:r>
+    </w:p>
+    <w:p>
+      <w:r>
+        <w:rPr>
+          <w:color w:val="000000"/>
+        </w:rPr>
+        <w:t>(they belong in the written report), and **show the process and the logic chain, not only</w:t>
+      </w:r>
+    </w:p>
+    <w:p>
+      <w:r>
+        <w:rPr>
+          <w:color w:val="000000"/>
+        </w:rPr>
+        <w:t>the final result**. Slides 3, 4 and 6 carry the process; slides 7-10 each answer one</w:t>
+      </w:r>
+    </w:p>
+    <w:p>
+      <w:r>
+        <w:rPr>
+          <w:color w:val="000000"/>
+        </w:rPr>
+        <w:t>assigned question; slide 11 is the robustness backup.</w:t>
+      </w:r>
+    </w:p>
+    <w:p>
+      <w:pPr>
+        <w:pStyle w:val="21"/>
+        <w:spacing w:after="120"/>
+      </w:pPr>
+      <w:bookmarkStart w:id="12" w:name="_Toc243228846"/>
+      <w:r>
+        <w:rPr>
+          <w:rFonts w:ascii="Times New Roman" w:eastAsia="Arial" w:hAnsi="Times New Roman"/>
+          <w:color w:val="000000"/>
+        </w:rPr>
+        <w:t>11.2 Written report outline</w:t>
+      </w:r>
+      <w:bookmarkEnd w:id="12"/>
+    </w:p>
+    <w:p>
+      <w:pPr>
+        <w:spacing w:after="80"/>
+        <w:ind w:left="425" w:hanging="425"/>
+      </w:pPr>
+      <w:r>
+        <w:rPr>
+          <w:color w:val="000000"/>
+        </w:rPr>
+        <w:t>1. Abstract: question, data, three tests, one-sentence conclusion.</w:t>
+      </w:r>
+    </w:p>
+    <w:p>
+      <w:pPr>
+        <w:spacing w:after="80"/>
+        <w:ind w:left="425" w:hanging="425"/>
+      </w:pPr>
+      <w:r>
+        <w:rPr>
+          <w:color w:val="000000"/>
+        </w:rPr>
+        <w:t>2. Introduction: authority in markets, Milgram framing, contribution.</w:t>
+      </w:r>
+    </w:p>
+    <w:p>
+      <w:pPr>
+        <w:spacing w:after="80"/>
+        <w:ind w:left="425" w:hanging="425"/>
+      </w:pPr>
+      <w:r>
+        <w:rPr>
+          <w:color w:val="000000"/>
+        </w:rPr>
+        <w:t>3. Literature and hypotheses: information vs influence; star-analyst literature; H1-H4.</w:t>
+      </w:r>
+    </w:p>
+    <w:p>
+      <w:pPr>
+        <w:spacing w:after="80"/>
+        <w:ind w:left="425" w:hanging="425"/>
+      </w:pPr>
+      <w:r>
+        <w:rPr>
+          <w:color w:val="000000"/>
+        </w:rPr>
+        <w:t>4. Data: iFinD source, cleaning funnel, authority variables, market data, descriptives.</w:t>
+      </w:r>
+    </w:p>
+    <w:p>
+      <w:pPr>
+        <w:spacing w:after="80"/>
+        <w:ind w:left="425" w:hanging="425"/>
+      </w:pPr>
+      <w:r>
+        <w:rPr>
+          <w:color w:val="000000"/>
+        </w:rPr>
+        <w:t>5. Method: event study, drift, holding returns, forecast error, interaction models.</w:t>
+      </w:r>
+    </w:p>
+    <w:p>
+      <w:pPr>
+        <w:spacing w:after="80"/>
+        <w:ind w:left="425" w:hanging="425"/>
+      </w:pPr>
+      <w:r>
+        <w:rPr>
+          <w:color w:val="000000"/>
+        </w:rPr>
+        <w:t>6. Results: one subsection per assigned question, economic magnitudes first.</w:t>
+      </w:r>
+    </w:p>
+    <w:p>
+      <w:pPr>
+        <w:spacing w:after="80"/>
+        <w:ind w:left="425" w:hanging="425"/>
+      </w:pPr>
+      <w:r>
+        <w:rPr>
+          <w:color w:val="000000"/>
+        </w:rPr>
+        <w:t>7. Robustness: suspension, clustering, alternative star definitions, rolling tier, 2018.</w:t>
+      </w:r>
+    </w:p>
+    <w:p>
+      <w:pPr>
+        <w:spacing w:after="80"/>
+        <w:ind w:left="425" w:hanging="425"/>
+      </w:pPr>
+      <w:r>
+        <w:rPr>
+          <w:color w:val="000000"/>
+        </w:rPr>
+        <w:t>8. Discussion: short-run information vs long-run following; career concerns; why upgrades</w:t>
+      </w:r>
+    </w:p>
+    <w:p>
+      <w:r>
+        <w:rPr>
+          <w:color w:val="000000"/>
+        </w:rPr>
+        <w:t>and downgrades differ.</w:t>
+      </w:r>
+    </w:p>
+    <w:p>
+      <w:pPr>
+        <w:spacing w:after="80"/>
+        <w:ind w:left="425" w:hanging="425"/>
+      </w:pPr>
+      <w:r>
+        <w:rPr>
+          <w:color w:val="000000"/>
+        </w:rPr>
+        <w:t>9. Limitations: data source, ST, limit-hits, forecast-error coverage, tier proxy.</w:t>
+      </w:r>
+    </w:p>
+    <w:p>
+      <w:pPr>
+        <w:spacing w:after="80"/>
+        <w:ind w:left="425" w:hanging="425"/>
+      </w:pPr>
+      <w:r>
+        <w:rPr>
+          <w:color w:val="000000"/>
+        </w:rPr>
+        <w:t>10. Conclusion, references, appendix with variable definitions and the cleaning funnel.</w:t>
+      </w:r>
+    </w:p>
+    <w:p>
+      <w:r>
+        <w:rPr>
+          <w:color w:val="000000"/>
+        </w:rPr>
+        <w:t>The report carries the limitations and the one-page data-provenance statement that the</w:t>
+      </w:r>
+    </w:p>
+    <w:p>
+      <w:r>
+        <w:rPr>
+          <w:color w:val="000000"/>
+        </w:rPr>
+        <w:t>slides omit.</w:t>
       </w:r>
     </w:p>
     <w:p>
@@ -4494,17 +5962,16 @@
         <w:pStyle w:val="1"/>
         <w:spacing w:before="280" w:after="120"/>
       </w:pPr>
-      <w:bookmarkStart w:id="11" w:name="_Toc243215533"/>
+      <w:bookmarkStart w:id="13" w:name="_Toc243228847"/>
       <w:r>
         <w:rPr>
           <w:rFonts w:ascii="Times New Roman" w:eastAsia="Arial" w:hAnsi="Times New Roman"/>
           <w:color w:val="000000"/>
           <w:sz w:val="30"/>
         </w:rPr>
-        <w:lastRenderedPageBreak/>
         <w:t>12. Anticipated questions</w:t>
       </w:r>
-      <w:bookmarkEnd w:id="11"/>
+      <w:bookmarkEnd w:id="13"/>
     </w:p>
     <w:p>
       <w:pPr>
@@ -4659,7 +6126,7 @@
         <w:pStyle w:val="1"/>
         <w:spacing w:before="280" w:after="120"/>
       </w:pPr>
-      <w:bookmarkStart w:id="12" w:name="_Toc243215534"/>
+      <w:bookmarkStart w:id="14" w:name="_Toc243228848"/>
       <w:r>
         <w:rPr>
           <w:rFonts w:ascii="Times New Roman" w:eastAsia="Arial" w:hAnsi="Times New Roman"/>
@@ -4668,7 +6135,7 @@
         </w:rPr>
         <w:t>13. References</w:t>
       </w:r>
-      <w:bookmarkEnd w:id="12"/>
+      <w:bookmarkEnd w:id="14"/>
     </w:p>
     <w:p>
       <w:pPr>
@@ -4897,7 +6364,7 @@
         <w:pStyle w:val="1"/>
         <w:spacing w:before="280" w:after="120"/>
       </w:pPr>
-      <w:bookmarkStart w:id="13" w:name="_Toc243215535"/>
+      <w:bookmarkStart w:id="15" w:name="_Toc243228849"/>
       <w:r>
         <w:rPr>
           <w:rFonts w:ascii="Times New Roman" w:eastAsia="Arial" w:hAnsi="Times New Roman"/>
@@ -4906,7 +6373,7 @@
         </w:rPr>
         <w:t>14. Known limitations to disclose</w:t>
       </w:r>
-      <w:bookmarkEnd w:id="13"/>
+      <w:bookmarkEnd w:id="15"/>
     </w:p>
     <w:p>
       <w:pPr>
@@ -4957,7 +6424,6 @@
         <w:rPr>
           <w:color w:val="000000"/>
         </w:rPr>
-        <w:lastRenderedPageBreak/>
         <w:t xml:space="preserve">never be matched. The 237 hits for </w:t>
       </w:r>
       <w:r>
@@ -5440,7 +6906,6 @@
         <w:rPr>
           <w:color w:val="000000"/>
         </w:rPr>
-        <w:lastRenderedPageBreak/>
         <w:t>counts show such names exist: the largest reach 6,805 records, which no one person files.</w:t>
       </w:r>
     </w:p>
@@ -5725,31 +7190,31 @@
       </w:rPr>
     </w:lvl>
   </w:abstractNum>
-  <w:num w:numId="1" w16cid:durableId="387152069">
+  <w:num w:numId="1" w16cid:durableId="1338656653">
     <w:abstractNumId w:val="8"/>
   </w:num>
-  <w:num w:numId="2" w16cid:durableId="1138650308">
+  <w:num w:numId="2" w16cid:durableId="1710566411">
     <w:abstractNumId w:val="6"/>
   </w:num>
-  <w:num w:numId="3" w16cid:durableId="1576815826">
+  <w:num w:numId="3" w16cid:durableId="1664428158">
     <w:abstractNumId w:val="5"/>
   </w:num>
-  <w:num w:numId="4" w16cid:durableId="267549509">
+  <w:num w:numId="4" w16cid:durableId="522129248">
     <w:abstractNumId w:val="4"/>
   </w:num>
-  <w:num w:numId="5" w16cid:durableId="1874266397">
+  <w:num w:numId="5" w16cid:durableId="1155491227">
     <w:abstractNumId w:val="7"/>
   </w:num>
-  <w:num w:numId="6" w16cid:durableId="1684626881">
+  <w:num w:numId="6" w16cid:durableId="1435173113">
     <w:abstractNumId w:val="3"/>
   </w:num>
-  <w:num w:numId="7" w16cid:durableId="391124685">
+  <w:num w:numId="7" w16cid:durableId="1277638077">
     <w:abstractNumId w:val="2"/>
   </w:num>
-  <w:num w:numId="8" w16cid:durableId="1666518274">
+  <w:num w:numId="8" w16cid:durableId="405959516">
     <w:abstractNumId w:val="1"/>
   </w:num>
-  <w:num w:numId="9" w16cid:durableId="1803227065">
+  <w:num w:numId="9" w16cid:durableId="2096238978">
     <w:abstractNumId w:val="0"/>
   </w:num>
 </w:numbering>
@@ -17148,14 +18613,26 @@
     <w:autoRedefine/>
     <w:uiPriority w:val="39"/>
     <w:unhideWhenUsed/>
-    <w:rsid w:val="00504ABD"/>
+    <w:rsid w:val="00654741"/>
+  </w:style>
+  <w:style w:type="paragraph" w:styleId="TOC2">
+    <w:name w:val="toc 2"/>
+    <w:basedOn w:val="a1"/>
+    <w:next w:val="a1"/>
+    <w:autoRedefine/>
+    <w:uiPriority w:val="39"/>
+    <w:unhideWhenUsed/>
+    <w:rsid w:val="00654741"/>
+    <w:pPr>
+      <w:ind w:leftChars="200" w:left="420"/>
+    </w:pPr>
   </w:style>
   <w:style w:type="character" w:styleId="aff9">
     <w:name w:val="Hyperlink"/>
     <w:basedOn w:val="a2"/>
     <w:uiPriority w:val="99"/>
     <w:unhideWhenUsed/>
-    <w:rsid w:val="00504ABD"/>
+    <w:rsid w:val="00654741"/>
     <w:rPr>
       <w:color w:val="0000FF" w:themeColor="hyperlink"/>
       <w:u w:val="single"/>

</xml_diff>

<commit_message>
Rebuild all documents on the cleaned Dretwd/H00300 returns
The event study, accuracy, forecast error, tier models and robustness checks now use
the cleaned total-return series; the report, plans and memo are rebuilt with the new
numbers and the price-limit concentration caveat.

Co-Authored-By: Claude Code <noreply@anthropic.com>
</commit_message>
<xml_diff>
--- a/文档/Project10_Star_Analyst_Research_Plan_EN.docx
+++ b/文档/Project10_Star_Analyst_Research_Plan_EN.docx
@@ -202,7 +202,7 @@
         </w:rPr>
         <w:fldChar w:fldCharType="separate"/>
       </w:r>
-      <w:hyperlink w:anchor="_Toc243228834" w:history="1">
+      <w:hyperlink w:anchor="_Toc243234455" w:history="1">
         <w:r>
           <w:rPr>
             <w:rStyle w:val="aff9"/>
@@ -240,7 +240,7 @@
             <w:noProof/>
             <w:webHidden/>
           </w:rPr>
-          <w:instrText>PAGEREF _Toc243228834 \h</w:instrText>
+          <w:instrText>PAGEREF _Toc243234455 \h</w:instrText>
         </w:r>
         <w:r>
           <w:rPr>
@@ -298,7 +298,7 @@
           <w14:ligatures w14:val="standardContextual"/>
         </w:rPr>
       </w:pPr>
-      <w:hyperlink w:anchor="_Toc243228835" w:history="1">
+      <w:hyperlink w:anchor="_Toc243234456" w:history="1">
         <w:r>
           <w:rPr>
             <w:rStyle w:val="aff9"/>
@@ -336,7 +336,7 @@
             <w:noProof/>
             <w:webHidden/>
           </w:rPr>
-          <w:instrText>PAGEREF _Toc243228835 \h</w:instrText>
+          <w:instrText>PAGEREF _Toc243234456 \h</w:instrText>
         </w:r>
         <w:r>
           <w:rPr>
@@ -394,7 +394,7 @@
           <w14:ligatures w14:val="standardContextual"/>
         </w:rPr>
       </w:pPr>
-      <w:hyperlink w:anchor="_Toc243228836" w:history="1">
+      <w:hyperlink w:anchor="_Toc243234457" w:history="1">
         <w:r>
           <w:rPr>
             <w:rStyle w:val="aff9"/>
@@ -432,7 +432,7 @@
             <w:noProof/>
             <w:webHidden/>
           </w:rPr>
-          <w:instrText>PAGEREF _Toc243228836 \h</w:instrText>
+          <w:instrText>PAGEREF _Toc243234457 \h</w:instrText>
         </w:r>
         <w:r>
           <w:rPr>
@@ -490,7 +490,7 @@
           <w14:ligatures w14:val="standardContextual"/>
         </w:rPr>
       </w:pPr>
-      <w:hyperlink w:anchor="_Toc243228837" w:history="1">
+      <w:hyperlink w:anchor="_Toc243234458" w:history="1">
         <w:r>
           <w:rPr>
             <w:rStyle w:val="aff9"/>
@@ -528,7 +528,7 @@
             <w:noProof/>
             <w:webHidden/>
           </w:rPr>
-          <w:instrText>PAGEREF _Toc243228837 \h</w:instrText>
+          <w:instrText>PAGEREF _Toc243234458 \h</w:instrText>
         </w:r>
         <w:r>
           <w:rPr>
@@ -586,7 +586,7 @@
           <w14:ligatures w14:val="standardContextual"/>
         </w:rPr>
       </w:pPr>
-      <w:hyperlink w:anchor="_Toc243228838" w:history="1">
+      <w:hyperlink w:anchor="_Toc243234459" w:history="1">
         <w:r>
           <w:rPr>
             <w:rStyle w:val="aff9"/>
@@ -624,7 +624,7 @@
             <w:noProof/>
             <w:webHidden/>
           </w:rPr>
-          <w:instrText>PAGEREF _Toc243228838 \h</w:instrText>
+          <w:instrText>PAGEREF _Toc243234459 \h</w:instrText>
         </w:r>
         <w:r>
           <w:rPr>
@@ -654,7 +654,7 @@
             <w:noProof/>
             <w:webHidden/>
           </w:rPr>
-          <w:t>3</w:t>
+          <w:t>4</w:t>
         </w:r>
         <w:r>
           <w:rPr>
@@ -682,7 +682,7 @@
           <w14:ligatures w14:val="standardContextual"/>
         </w:rPr>
       </w:pPr>
-      <w:hyperlink w:anchor="_Toc243228839" w:history="1">
+      <w:hyperlink w:anchor="_Toc243234460" w:history="1">
         <w:r>
           <w:rPr>
             <w:rStyle w:val="aff9"/>
@@ -720,7 +720,7 @@
             <w:noProof/>
             <w:webHidden/>
           </w:rPr>
-          <w:instrText>PAGEREF _Toc243228839 \h</w:instrText>
+          <w:instrText>PAGEREF _Toc243234460 \h</w:instrText>
         </w:r>
         <w:r>
           <w:rPr>
@@ -778,7 +778,7 @@
           <w14:ligatures w14:val="standardContextual"/>
         </w:rPr>
       </w:pPr>
-      <w:hyperlink w:anchor="_Toc243228840" w:history="1">
+      <w:hyperlink w:anchor="_Toc243234461" w:history="1">
         <w:r>
           <w:rPr>
             <w:rStyle w:val="aff9"/>
@@ -816,7 +816,7 @@
             <w:noProof/>
             <w:webHidden/>
           </w:rPr>
-          <w:instrText>PAGEREF _Toc243228840 \h</w:instrText>
+          <w:instrText>PAGEREF _Toc243234461 \h</w:instrText>
         </w:r>
         <w:r>
           <w:rPr>
@@ -874,7 +874,7 @@
           <w14:ligatures w14:val="standardContextual"/>
         </w:rPr>
       </w:pPr>
-      <w:hyperlink w:anchor="_Toc243228841" w:history="1">
+      <w:hyperlink w:anchor="_Toc243234462" w:history="1">
         <w:r>
           <w:rPr>
             <w:rStyle w:val="aff9"/>
@@ -912,7 +912,7 @@
             <w:noProof/>
             <w:webHidden/>
           </w:rPr>
-          <w:instrText>PAGEREF _Toc243228841 \h</w:instrText>
+          <w:instrText>PAGEREF _Toc243234462 \h</w:instrText>
         </w:r>
         <w:r>
           <w:rPr>
@@ -970,7 +970,7 @@
           <w14:ligatures w14:val="standardContextual"/>
         </w:rPr>
       </w:pPr>
-      <w:hyperlink w:anchor="_Toc243228842" w:history="1">
+      <w:hyperlink w:anchor="_Toc243234463" w:history="1">
         <w:r>
           <w:rPr>
             <w:rStyle w:val="aff9"/>
@@ -1008,7 +1008,7 @@
             <w:noProof/>
             <w:webHidden/>
           </w:rPr>
-          <w:instrText>PAGEREF _Toc243228842 \h</w:instrText>
+          <w:instrText>PAGEREF _Toc243234463 \h</w:instrText>
         </w:r>
         <w:r>
           <w:rPr>
@@ -1066,7 +1066,7 @@
           <w14:ligatures w14:val="standardContextual"/>
         </w:rPr>
       </w:pPr>
-      <w:hyperlink w:anchor="_Toc243228843" w:history="1">
+      <w:hyperlink w:anchor="_Toc243234464" w:history="1">
         <w:r>
           <w:rPr>
             <w:rStyle w:val="aff9"/>
@@ -1104,7 +1104,7 @@
             <w:noProof/>
             <w:webHidden/>
           </w:rPr>
-          <w:instrText>PAGEREF _Toc243228843 \h</w:instrText>
+          <w:instrText>PAGEREF _Toc243234464 \h</w:instrText>
         </w:r>
         <w:r>
           <w:rPr>
@@ -1162,7 +1162,7 @@
           <w14:ligatures w14:val="standardContextual"/>
         </w:rPr>
       </w:pPr>
-      <w:hyperlink w:anchor="_Toc243228844" w:history="1">
+      <w:hyperlink w:anchor="_Toc243234465" w:history="1">
         <w:r>
           <w:rPr>
             <w:rStyle w:val="aff9"/>
@@ -1200,7 +1200,7 @@
             <w:noProof/>
             <w:webHidden/>
           </w:rPr>
-          <w:instrText>PAGEREF _Toc243228844 \h</w:instrText>
+          <w:instrText>PAGEREF _Toc243234465 \h</w:instrText>
         </w:r>
         <w:r>
           <w:rPr>
@@ -1259,7 +1259,7 @@
           <w14:ligatures w14:val="standardContextual"/>
         </w:rPr>
       </w:pPr>
-      <w:hyperlink w:anchor="_Toc243228845" w:history="1">
+      <w:hyperlink w:anchor="_Toc243234466" w:history="1">
         <w:r>
           <w:rPr>
             <w:rStyle w:val="aff9"/>
@@ -1297,7 +1297,7 @@
             <w:noProof/>
             <w:webHidden/>
           </w:rPr>
-          <w:instrText>PAGEREF _Toc243228845 \h</w:instrText>
+          <w:instrText>PAGEREF _Toc243234466 \h</w:instrText>
         </w:r>
         <w:r>
           <w:rPr>
@@ -1356,7 +1356,7 @@
           <w14:ligatures w14:val="standardContextual"/>
         </w:rPr>
       </w:pPr>
-      <w:hyperlink w:anchor="_Toc243228846" w:history="1">
+      <w:hyperlink w:anchor="_Toc243234467" w:history="1">
         <w:r>
           <w:rPr>
             <w:rStyle w:val="aff9"/>
@@ -1394,7 +1394,7 @@
             <w:noProof/>
             <w:webHidden/>
           </w:rPr>
-          <w:instrText>PAGEREF _Toc243228846 \h</w:instrText>
+          <w:instrText>PAGEREF _Toc243234467 \h</w:instrText>
         </w:r>
         <w:r>
           <w:rPr>
@@ -1452,7 +1452,7 @@
           <w14:ligatures w14:val="standardContextual"/>
         </w:rPr>
       </w:pPr>
-      <w:hyperlink w:anchor="_Toc243228847" w:history="1">
+      <w:hyperlink w:anchor="_Toc243234468" w:history="1">
         <w:r>
           <w:rPr>
             <w:rStyle w:val="aff9"/>
@@ -1490,7 +1490,7 @@
             <w:noProof/>
             <w:webHidden/>
           </w:rPr>
-          <w:instrText>PAGEREF _Toc243228847 \h</w:instrText>
+          <w:instrText>PAGEREF _Toc243234468 \h</w:instrText>
         </w:r>
         <w:r>
           <w:rPr>
@@ -1548,7 +1548,7 @@
           <w14:ligatures w14:val="standardContextual"/>
         </w:rPr>
       </w:pPr>
-      <w:hyperlink w:anchor="_Toc243228848" w:history="1">
+      <w:hyperlink w:anchor="_Toc243234469" w:history="1">
         <w:r>
           <w:rPr>
             <w:rStyle w:val="aff9"/>
@@ -1586,7 +1586,7 @@
             <w:noProof/>
             <w:webHidden/>
           </w:rPr>
-          <w:instrText>PAGEREF _Toc243228848 \h</w:instrText>
+          <w:instrText>PAGEREF _Toc243234469 \h</w:instrText>
         </w:r>
         <w:r>
           <w:rPr>
@@ -1644,7 +1644,7 @@
           <w14:ligatures w14:val="standardContextual"/>
         </w:rPr>
       </w:pPr>
-      <w:hyperlink w:anchor="_Toc243228849" w:history="1">
+      <w:hyperlink w:anchor="_Toc243234470" w:history="1">
         <w:r>
           <w:rPr>
             <w:rStyle w:val="aff9"/>
@@ -1682,7 +1682,7 @@
             <w:noProof/>
             <w:webHidden/>
           </w:rPr>
-          <w:instrText>PAGEREF _Toc243228849 \h</w:instrText>
+          <w:instrText>PAGEREF _Toc243234470 \h</w:instrText>
         </w:r>
         <w:r>
           <w:rPr>
@@ -1737,7 +1737,7 @@
         <w:pStyle w:val="1"/>
         <w:spacing w:before="280" w:after="120"/>
       </w:pPr>
-      <w:bookmarkStart w:id="0" w:name="_Toc243228834"/>
+      <w:bookmarkStart w:id="0" w:name="_Toc243234455"/>
       <w:r>
         <w:rPr>
           <w:rFonts w:ascii="Times New Roman" w:eastAsia="Arial" w:hAnsi="Times New Roman"/>
@@ -2186,7 +2186,7 @@
         <w:pStyle w:val="1"/>
         <w:spacing w:before="280" w:after="120"/>
       </w:pPr>
-      <w:bookmarkStart w:id="1" w:name="_Toc243228835"/>
+      <w:bookmarkStart w:id="1" w:name="_Toc243234456"/>
       <w:r>
         <w:rPr>
           <w:rFonts w:ascii="Times New Roman" w:eastAsia="Arial" w:hAnsi="Times New Roman"/>
@@ -2234,7 +2234,7 @@
         <w:pStyle w:val="1"/>
         <w:spacing w:before="280" w:after="120"/>
       </w:pPr>
-      <w:bookmarkStart w:id="2" w:name="_Toc243228836"/>
+      <w:bookmarkStart w:id="2" w:name="_Toc243234457"/>
       <w:r>
         <w:rPr>
           <w:rFonts w:ascii="Times New Roman" w:eastAsia="Arial" w:hAnsi="Times New Roman"/>
@@ -2649,11 +2649,138 @@
       </w:r>
     </w:p>
     <w:p>
+      <w:r>
+        <w:rPr>
+          <w:b/>
+          <w:color w:val="000000"/>
+        </w:rPr>
+        <w:t>Market returns.</w:t>
+      </w:r>
+      <w:r>
+        <w:rPr>
+          <w:color w:val="000000"/>
+        </w:rPr>
+        <w:t xml:space="preserve"> The event study uses the cleaned total-return series: stock </w:t>
+      </w:r>
+      <w:r>
+        <w:rPr>
+          <w:rFonts w:ascii="Consolas" w:hAnsi="Consolas"/>
+          <w:color w:val="000000"/>
+          <w:sz w:val="22"/>
+        </w:rPr>
+        <w:t>Dretwd</w:t>
+      </w:r>
+      <w:r>
+        <w:rPr>
+          <w:color w:val="000000"/>
+        </w:rPr>
+        <w:t xml:space="preserve"> in</w:t>
+      </w:r>
+    </w:p>
+    <w:p>
+      <w:r>
+        <w:rPr>
+          <w:rFonts w:ascii="Consolas" w:hAnsi="Consolas"/>
+          <w:color w:val="000000"/>
+          <w:sz w:val="22"/>
+        </w:rPr>
+        <w:t>data/stock_returns_dretwd.csv</w:t>
+      </w:r>
+      <w:r>
+        <w:rPr>
+          <w:color w:val="000000"/>
+        </w:rPr>
+        <w:t xml:space="preserve"> and the CSI 300 total-return index </w:t>
+      </w:r>
+      <w:r>
+        <w:rPr>
+          <w:rFonts w:ascii="Consolas" w:hAnsi="Consolas"/>
+          <w:color w:val="000000"/>
+          <w:sz w:val="22"/>
+        </w:rPr>
+        <w:t>H00300</w:t>
+      </w:r>
+      <w:r>
+        <w:rPr>
+          <w:color w:val="000000"/>
+        </w:rPr>
+        <w:t xml:space="preserve"> in</w:t>
+      </w:r>
+    </w:p>
+    <w:p>
+      <w:r>
+        <w:rPr>
+          <w:rFonts w:ascii="Consolas" w:hAnsi="Consolas"/>
+          <w:color w:val="000000"/>
+          <w:sz w:val="22"/>
+        </w:rPr>
+        <w:t>data/market_returns_h00300.csv</w:t>
+      </w:r>
+      <w:r>
+        <w:rPr>
+          <w:color w:val="000000"/>
+        </w:rPr>
+        <w:t>. Both are decimal returns and are converted to percentage</w:t>
+      </w:r>
+    </w:p>
+    <w:p>
+      <w:r>
+        <w:rPr>
+          <w:color w:val="000000"/>
+        </w:rPr>
+        <w:t xml:space="preserve">points by </w:t>
+      </w:r>
+      <w:r>
+        <w:rPr>
+          <w:rFonts w:ascii="Consolas" w:hAnsi="Consolas"/>
+          <w:color w:val="000000"/>
+          <w:sz w:val="22"/>
+        </w:rPr>
+        <w:t>market_data_adapter.py</w:t>
+      </w:r>
+      <w:r>
+        <w:rPr>
+          <w:color w:val="000000"/>
+        </w:rPr>
+        <w:t>. Suspension rows are omitted rather than filled with</w:t>
+      </w:r>
+    </w:p>
+    <w:p>
+      <w:r>
+        <w:rPr>
+          <w:color w:val="000000"/>
+        </w:rPr>
+        <w:t>zero, holiday filler rows are removed, and old and new stock codes are unified. Volume</w:t>
+      </w:r>
+    </w:p>
+    <w:p>
+      <w:r>
+        <w:rPr>
+          <w:color w:val="000000"/>
+        </w:rPr>
+        <w:t xml:space="preserve">and event-day closing prices still come from the earlier </w:t>
+      </w:r>
+      <w:r>
+        <w:rPr>
+          <w:rFonts w:ascii="Consolas" w:hAnsi="Consolas"/>
+          <w:color w:val="000000"/>
+          <w:sz w:val="22"/>
+        </w:rPr>
+        <w:t>market_panel.csv</w:t>
+      </w:r>
+      <w:r>
+        <w:rPr>
+          <w:color w:val="000000"/>
+        </w:rPr>
+        <w:t>.</w:t>
+      </w:r>
+    </w:p>
+    <w:p>
       <w:pPr>
         <w:pStyle w:val="1"/>
         <w:spacing w:before="280" w:after="120"/>
       </w:pPr>
-      <w:bookmarkStart w:id="3" w:name="_Toc243228837"/>
+      <w:bookmarkStart w:id="3" w:name="_Toc243234458"/>
       <w:r>
         <w:rPr>
           <w:rFonts w:ascii="Times New Roman" w:eastAsia="Arial" w:hAnsi="Times New Roman"/>
@@ -3160,7 +3287,7 @@
         <w:pStyle w:val="1"/>
         <w:spacing w:before="280" w:after="120"/>
       </w:pPr>
-      <w:bookmarkStart w:id="4" w:name="_Toc243228838"/>
+      <w:bookmarkStart w:id="4" w:name="_Toc243234459"/>
       <w:r>
         <w:rPr>
           <w:rFonts w:ascii="Times New Roman" w:eastAsia="Arial" w:hAnsi="Times New Roman"/>
@@ -3848,7 +3975,7 @@
         <w:pStyle w:val="1"/>
         <w:spacing w:before="280" w:after="120"/>
       </w:pPr>
-      <w:bookmarkStart w:id="5" w:name="_Toc243228839"/>
+      <w:bookmarkStart w:id="5" w:name="_Toc243234460"/>
       <w:r>
         <w:rPr>
           <w:rFonts w:ascii="Times New Roman" w:eastAsia="Arial" w:hAnsi="Times New Roman"/>
@@ -4019,7 +4146,7 @@
         <w:pStyle w:val="1"/>
         <w:spacing w:before="280" w:after="120"/>
       </w:pPr>
-      <w:bookmarkStart w:id="6" w:name="_Toc243228840"/>
+      <w:bookmarkStart w:id="6" w:name="_Toc243234461"/>
       <w:r>
         <w:rPr>
           <w:rFonts w:ascii="Times New Roman" w:eastAsia="Arial" w:hAnsi="Times New Roman"/>
@@ -4225,7 +4352,7 @@
         <w:pStyle w:val="1"/>
         <w:spacing w:before="280" w:after="120"/>
       </w:pPr>
-      <w:bookmarkStart w:id="7" w:name="_Toc243228841"/>
+      <w:bookmarkStart w:id="7" w:name="_Toc243234462"/>
       <w:r>
         <w:rPr>
           <w:rFonts w:ascii="Times New Roman" w:eastAsia="Arial" w:hAnsi="Times New Roman"/>
@@ -4323,31 +4450,39 @@
         <w:rPr>
           <w:color w:val="000000"/>
         </w:rPr>
-        <w:t>Already implemented: a suspension robustness check that drops events with a suspension</w:t>
-      </w:r>
-    </w:p>
-    <w:p>
-      <w:r>
-        <w:rPr>
-          <w:color w:val="000000"/>
-        </w:rPr>
-        <w:t>day in the window, a backward-looking rolling tier, and stock-clustered errors in the</w:t>
-      </w:r>
-    </w:p>
-    <w:p>
-      <w:r>
-        <w:rPr>
-          <w:color w:val="000000"/>
-        </w:rPr>
-        <w:t>interaction models. Still to do: limit-hit and ST filters, main-board/ChiNext splits,</w:t>
-      </w:r>
-    </w:p>
-    <w:p>
-      <w:r>
-        <w:rPr>
-          <w:color w:val="000000"/>
-        </w:rPr>
-        <w:t>and earnings-announcement overlap.</w:t>
+        <w:t>Already implemented: clustered errors, a suspension robustness check, price-limit and</w:t>
+      </w:r>
+    </w:p>
+    <w:p>
+      <w:r>
+        <w:rPr>
+          <w:color w:val="000000"/>
+        </w:rPr>
+        <w:t>ST-proxy robustness, an independent replication, and a backward-looking rolling tier.</w:t>
+      </w:r>
+    </w:p>
+    <w:p>
+      <w:r>
+        <w:rPr>
+          <w:color w:val="000000"/>
+        </w:rPr>
+        <w:t>Price-limit robustness shows that the upgrade premium is concentrated in limit-hit</w:t>
+      </w:r>
+    </w:p>
+    <w:p>
+      <w:r>
+        <w:rPr>
+          <w:color w:val="000000"/>
+        </w:rPr>
+        <w:t>events; excluding them, the short-window premium loses significance while the [-5,+5]</w:t>
+      </w:r>
+    </w:p>
+    <w:p>
+      <w:r>
+        <w:rPr>
+          <w:color w:val="000000"/>
+        </w:rPr>
+        <w:t>premium remains. Still to do: main-board/ChiNext splits and earnings-announcement overlap.</w:t>
       </w:r>
     </w:p>
     <w:p>
@@ -4401,7 +4536,7 @@
         <w:pStyle w:val="1"/>
         <w:spacing w:before="280" w:after="120"/>
       </w:pPr>
-      <w:bookmarkStart w:id="8" w:name="_Toc243228842"/>
+      <w:bookmarkStart w:id="8" w:name="_Toc243234463"/>
       <w:r>
         <w:rPr>
           <w:rFonts w:ascii="Times New Roman" w:eastAsia="Arial" w:hAnsi="Times New Roman"/>
@@ -4733,7 +4868,7 @@
         <w:pStyle w:val="1"/>
         <w:spacing w:before="280" w:after="120"/>
       </w:pPr>
-      <w:bookmarkStart w:id="9" w:name="_Toc243228843"/>
+      <w:bookmarkStart w:id="9" w:name="_Toc243234464"/>
       <w:r>
         <w:rPr>
           <w:rFonts w:ascii="Times New Roman" w:eastAsia="Arial" w:hAnsi="Times New Roman"/>
@@ -4749,39 +4884,61 @@
         <w:rPr>
           <w:color w:val="000000"/>
         </w:rPr>
-        <w:t>Status as of 18 October: the sample, authority variables, announcement results, drift,</w:t>
-      </w:r>
-    </w:p>
-    <w:p>
-      <w:r>
-        <w:rPr>
-          <w:color w:val="000000"/>
-        </w:rPr>
-        <w:t>accuracy, forecast error, direction and tier interactions, suspension robustness and the</w:t>
-      </w:r>
-    </w:p>
-    <w:p>
-      <w:r>
-        <w:rPr>
-          <w:color w:val="000000"/>
-        </w:rPr>
-        <w:t>rolling-tier robustness are done. The remaining work is clustered standard errors for the</w:t>
-      </w:r>
-    </w:p>
-    <w:p>
-      <w:r>
-        <w:rPr>
-          <w:color w:val="000000"/>
-        </w:rPr>
-        <w:t>event-study and accuracy tables, limit-hit and ST robustness, the three main figures,</w:t>
-      </w:r>
-    </w:p>
-    <w:p>
-      <w:r>
-        <w:rPr>
-          <w:color w:val="000000"/>
-        </w:rPr>
-        <w:t>slides and rehearsal.</w:t>
+        <w:t xml:space="preserve">Status as of 18 October: all results have been rebuilt on the cleaned </w:t>
+      </w:r>
+      <w:r>
+        <w:rPr>
+          <w:rFonts w:ascii="Consolas" w:hAnsi="Consolas"/>
+          <w:color w:val="000000"/>
+          <w:sz w:val="22"/>
+        </w:rPr>
+        <w:t>Dretwd</w:t>
+      </w:r>
+      <w:r>
+        <w:rPr>
+          <w:color w:val="000000"/>
+        </w:rPr>
+        <w:t>/</w:t>
+      </w:r>
+      <w:r>
+        <w:rPr>
+          <w:rFonts w:ascii="Consolas" w:hAnsi="Consolas"/>
+          <w:color w:val="000000"/>
+          <w:sz w:val="22"/>
+        </w:rPr>
+        <w:t>H00300</w:t>
+      </w:r>
+    </w:p>
+    <w:p>
+      <w:r>
+        <w:rPr>
+          <w:color w:val="000000"/>
+        </w:rPr>
+        <w:t>returns. The sample, authority variables, announcement results, drift, accuracy, forecast</w:t>
+      </w:r>
+    </w:p>
+    <w:p>
+      <w:r>
+        <w:rPr>
+          <w:color w:val="000000"/>
+        </w:rPr>
+        <w:t>error, direction and tier interactions, clustered inference, suspension, price-limit and</w:t>
+      </w:r>
+    </w:p>
+    <w:p>
+      <w:r>
+        <w:rPr>
+          <w:color w:val="000000"/>
+        </w:rPr>
+        <w:t>ST robustness, independent replication and the rolling-tier robustness are done. The</w:t>
+      </w:r>
+    </w:p>
+    <w:p>
+      <w:r>
+        <w:rPr>
+          <w:color w:val="000000"/>
+        </w:rPr>
+        <w:t>remaining work is the slides and two rehearsals.</w:t>
       </w:r>
     </w:p>
     <w:p>
@@ -4853,7 +5010,7 @@
         <w:pStyle w:val="1"/>
         <w:spacing w:before="280" w:after="120"/>
       </w:pPr>
-      <w:bookmarkStart w:id="10" w:name="_Toc243228844"/>
+      <w:bookmarkStart w:id="10" w:name="_Toc243234465"/>
       <w:r>
         <w:rPr>
           <w:rFonts w:ascii="Times New Roman" w:eastAsia="Arial" w:hAnsi="Times New Roman"/>
@@ -4869,7 +5026,7 @@
         <w:pStyle w:val="21"/>
         <w:spacing w:after="120"/>
       </w:pPr>
-      <w:bookmarkStart w:id="11" w:name="_Toc243228845"/>
+      <w:bookmarkStart w:id="11" w:name="_Toc243234466"/>
       <w:r>
         <w:rPr>
           <w:rFonts w:ascii="Times New Roman" w:eastAsia="Arial" w:hAnsi="Times New Roman"/>
@@ -5803,7 +5960,7 @@
         <w:pStyle w:val="21"/>
         <w:spacing w:after="120"/>
       </w:pPr>
-      <w:bookmarkStart w:id="12" w:name="_Toc243228846"/>
+      <w:bookmarkStart w:id="12" w:name="_Toc243234467"/>
       <w:r>
         <w:rPr>
           <w:rFonts w:ascii="Times New Roman" w:eastAsia="Arial" w:hAnsi="Times New Roman"/>
@@ -5962,7 +6119,7 @@
         <w:pStyle w:val="1"/>
         <w:spacing w:before="280" w:after="120"/>
       </w:pPr>
-      <w:bookmarkStart w:id="13" w:name="_Toc243228847"/>
+      <w:bookmarkStart w:id="13" w:name="_Toc243234468"/>
       <w:r>
         <w:rPr>
           <w:rFonts w:ascii="Times New Roman" w:eastAsia="Arial" w:hAnsi="Times New Roman"/>
@@ -6126,7 +6283,7 @@
         <w:pStyle w:val="1"/>
         <w:spacing w:before="280" w:after="120"/>
       </w:pPr>
-      <w:bookmarkStart w:id="14" w:name="_Toc243228848"/>
+      <w:bookmarkStart w:id="14" w:name="_Toc243234469"/>
       <w:r>
         <w:rPr>
           <w:rFonts w:ascii="Times New Roman" w:eastAsia="Arial" w:hAnsi="Times New Roman"/>
@@ -6364,7 +6521,7 @@
         <w:pStyle w:val="1"/>
         <w:spacing w:before="280" w:after="120"/>
       </w:pPr>
-      <w:bookmarkStart w:id="15" w:name="_Toc243228849"/>
+      <w:bookmarkStart w:id="15" w:name="_Toc243234470"/>
       <w:r>
         <w:rPr>
           <w:rFonts w:ascii="Times New Roman" w:eastAsia="Arial" w:hAnsi="Times New Roman"/>
@@ -7190,31 +7347,31 @@
       </w:rPr>
     </w:lvl>
   </w:abstractNum>
-  <w:num w:numId="1" w16cid:durableId="1338656653">
+  <w:num w:numId="1" w16cid:durableId="1011832108">
     <w:abstractNumId w:val="8"/>
   </w:num>
-  <w:num w:numId="2" w16cid:durableId="1710566411">
+  <w:num w:numId="2" w16cid:durableId="1426922463">
     <w:abstractNumId w:val="6"/>
   </w:num>
-  <w:num w:numId="3" w16cid:durableId="1664428158">
+  <w:num w:numId="3" w16cid:durableId="293603226">
     <w:abstractNumId w:val="5"/>
   </w:num>
-  <w:num w:numId="4" w16cid:durableId="522129248">
+  <w:num w:numId="4" w16cid:durableId="187985422">
     <w:abstractNumId w:val="4"/>
   </w:num>
-  <w:num w:numId="5" w16cid:durableId="1155491227">
+  <w:num w:numId="5" w16cid:durableId="1581329408">
     <w:abstractNumId w:val="7"/>
   </w:num>
-  <w:num w:numId="6" w16cid:durableId="1435173113">
+  <w:num w:numId="6" w16cid:durableId="309137007">
     <w:abstractNumId w:val="3"/>
   </w:num>
-  <w:num w:numId="7" w16cid:durableId="1277638077">
+  <w:num w:numId="7" w16cid:durableId="2114545968">
     <w:abstractNumId w:val="2"/>
   </w:num>
-  <w:num w:numId="8" w16cid:durableId="405959516">
+  <w:num w:numId="8" w16cid:durableId="928074331">
     <w:abstractNumId w:val="1"/>
   </w:num>
-  <w:num w:numId="9" w16cid:durableId="2096238978">
+  <w:num w:numId="9" w16cid:durableId="1049456336">
     <w:abstractNumId w:val="0"/>
   </w:num>
 </w:numbering>
@@ -18613,7 +18770,7 @@
     <w:autoRedefine/>
     <w:uiPriority w:val="39"/>
     <w:unhideWhenUsed/>
-    <w:rsid w:val="00654741"/>
+    <w:rsid w:val="00CF11AA"/>
   </w:style>
   <w:style w:type="paragraph" w:styleId="TOC2">
     <w:name w:val="toc 2"/>
@@ -18622,7 +18779,7 @@
     <w:autoRedefine/>
     <w:uiPriority w:val="39"/>
     <w:unhideWhenUsed/>
-    <w:rsid w:val="00654741"/>
+    <w:rsid w:val="00CF11AA"/>
     <w:pPr>
       <w:ind w:leftChars="200" w:left="420"/>
     </w:pPr>
@@ -18632,7 +18789,7 @@
     <w:basedOn w:val="a2"/>
     <w:uiPriority w:val="99"/>
     <w:unhideWhenUsed/>
-    <w:rsid w:val="00654741"/>
+    <w:rsid w:val="00CF11AA"/>
     <w:rPr>
       <w:color w:val="0000FF" w:themeColor="hyperlink"/>
       <w:u w:val="single"/>

</xml_diff>

<commit_message>
Note the marginal clustered six-month result and rebuild the Word files
Co-Authored-By: Claude Code <noreply@anthropic.com>
</commit_message>
<xml_diff>
--- a/文档/Project10_Star_Analyst_Research_Plan_EN.docx
+++ b/文档/Project10_Star_Analyst_Research_Plan_EN.docx
@@ -202,7 +202,7 @@
         </w:rPr>
         <w:fldChar w:fldCharType="separate"/>
       </w:r>
-      <w:hyperlink w:anchor="_Toc243234455" w:history="1">
+      <w:hyperlink w:anchor="_Toc243234993" w:history="1">
         <w:r>
           <w:rPr>
             <w:rStyle w:val="aff9"/>
@@ -240,7 +240,7 @@
             <w:noProof/>
             <w:webHidden/>
           </w:rPr>
-          <w:instrText>PAGEREF _Toc243234455 \h</w:instrText>
+          <w:instrText>PAGEREF _Toc243234993 \h</w:instrText>
         </w:r>
         <w:r>
           <w:rPr>
@@ -298,7 +298,7 @@
           <w14:ligatures w14:val="standardContextual"/>
         </w:rPr>
       </w:pPr>
-      <w:hyperlink w:anchor="_Toc243234456" w:history="1">
+      <w:hyperlink w:anchor="_Toc243234994" w:history="1">
         <w:r>
           <w:rPr>
             <w:rStyle w:val="aff9"/>
@@ -336,7 +336,7 @@
             <w:noProof/>
             <w:webHidden/>
           </w:rPr>
-          <w:instrText>PAGEREF _Toc243234456 \h</w:instrText>
+          <w:instrText>PAGEREF _Toc243234994 \h</w:instrText>
         </w:r>
         <w:r>
           <w:rPr>
@@ -394,7 +394,7 @@
           <w14:ligatures w14:val="standardContextual"/>
         </w:rPr>
       </w:pPr>
-      <w:hyperlink w:anchor="_Toc243234457" w:history="1">
+      <w:hyperlink w:anchor="_Toc243234995" w:history="1">
         <w:r>
           <w:rPr>
             <w:rStyle w:val="aff9"/>
@@ -432,7 +432,7 @@
             <w:noProof/>
             <w:webHidden/>
           </w:rPr>
-          <w:instrText>PAGEREF _Toc243234457 \h</w:instrText>
+          <w:instrText>PAGEREF _Toc243234995 \h</w:instrText>
         </w:r>
         <w:r>
           <w:rPr>
@@ -490,7 +490,7 @@
           <w14:ligatures w14:val="standardContextual"/>
         </w:rPr>
       </w:pPr>
-      <w:hyperlink w:anchor="_Toc243234458" w:history="1">
+      <w:hyperlink w:anchor="_Toc243234996" w:history="1">
         <w:r>
           <w:rPr>
             <w:rStyle w:val="aff9"/>
@@ -528,7 +528,7 @@
             <w:noProof/>
             <w:webHidden/>
           </w:rPr>
-          <w:instrText>PAGEREF _Toc243234458 \h</w:instrText>
+          <w:instrText>PAGEREF _Toc243234996 \h</w:instrText>
         </w:r>
         <w:r>
           <w:rPr>
@@ -586,7 +586,7 @@
           <w14:ligatures w14:val="standardContextual"/>
         </w:rPr>
       </w:pPr>
-      <w:hyperlink w:anchor="_Toc243234459" w:history="1">
+      <w:hyperlink w:anchor="_Toc243234997" w:history="1">
         <w:r>
           <w:rPr>
             <w:rStyle w:val="aff9"/>
@@ -624,7 +624,7 @@
             <w:noProof/>
             <w:webHidden/>
           </w:rPr>
-          <w:instrText>PAGEREF _Toc243234459 \h</w:instrText>
+          <w:instrText>PAGEREF _Toc243234997 \h</w:instrText>
         </w:r>
         <w:r>
           <w:rPr>
@@ -682,7 +682,7 @@
           <w14:ligatures w14:val="standardContextual"/>
         </w:rPr>
       </w:pPr>
-      <w:hyperlink w:anchor="_Toc243234460" w:history="1">
+      <w:hyperlink w:anchor="_Toc243234998" w:history="1">
         <w:r>
           <w:rPr>
             <w:rStyle w:val="aff9"/>
@@ -720,7 +720,7 @@
             <w:noProof/>
             <w:webHidden/>
           </w:rPr>
-          <w:instrText>PAGEREF _Toc243234460 \h</w:instrText>
+          <w:instrText>PAGEREF _Toc243234998 \h</w:instrText>
         </w:r>
         <w:r>
           <w:rPr>
@@ -778,7 +778,7 @@
           <w14:ligatures w14:val="standardContextual"/>
         </w:rPr>
       </w:pPr>
-      <w:hyperlink w:anchor="_Toc243234461" w:history="1">
+      <w:hyperlink w:anchor="_Toc243234999" w:history="1">
         <w:r>
           <w:rPr>
             <w:rStyle w:val="aff9"/>
@@ -816,7 +816,7 @@
             <w:noProof/>
             <w:webHidden/>
           </w:rPr>
-          <w:instrText>PAGEREF _Toc243234461 \h</w:instrText>
+          <w:instrText>PAGEREF _Toc243234999 \h</w:instrText>
         </w:r>
         <w:r>
           <w:rPr>
@@ -874,7 +874,7 @@
           <w14:ligatures w14:val="standardContextual"/>
         </w:rPr>
       </w:pPr>
-      <w:hyperlink w:anchor="_Toc243234462" w:history="1">
+      <w:hyperlink w:anchor="_Toc243235000" w:history="1">
         <w:r>
           <w:rPr>
             <w:rStyle w:val="aff9"/>
@@ -912,7 +912,7 @@
             <w:noProof/>
             <w:webHidden/>
           </w:rPr>
-          <w:instrText>PAGEREF _Toc243234462 \h</w:instrText>
+          <w:instrText>PAGEREF _Toc243235000 \h</w:instrText>
         </w:r>
         <w:r>
           <w:rPr>
@@ -970,7 +970,7 @@
           <w14:ligatures w14:val="standardContextual"/>
         </w:rPr>
       </w:pPr>
-      <w:hyperlink w:anchor="_Toc243234463" w:history="1">
+      <w:hyperlink w:anchor="_Toc243235001" w:history="1">
         <w:r>
           <w:rPr>
             <w:rStyle w:val="aff9"/>
@@ -1008,7 +1008,7 @@
             <w:noProof/>
             <w:webHidden/>
           </w:rPr>
-          <w:instrText>PAGEREF _Toc243234463 \h</w:instrText>
+          <w:instrText>PAGEREF _Toc243235001 \h</w:instrText>
         </w:r>
         <w:r>
           <w:rPr>
@@ -1066,7 +1066,7 @@
           <w14:ligatures w14:val="standardContextual"/>
         </w:rPr>
       </w:pPr>
-      <w:hyperlink w:anchor="_Toc243234464" w:history="1">
+      <w:hyperlink w:anchor="_Toc243235002" w:history="1">
         <w:r>
           <w:rPr>
             <w:rStyle w:val="aff9"/>
@@ -1104,7 +1104,7 @@
             <w:noProof/>
             <w:webHidden/>
           </w:rPr>
-          <w:instrText>PAGEREF _Toc243234464 \h</w:instrText>
+          <w:instrText>PAGEREF _Toc243235002 \h</w:instrText>
         </w:r>
         <w:r>
           <w:rPr>
@@ -1162,7 +1162,7 @@
           <w14:ligatures w14:val="standardContextual"/>
         </w:rPr>
       </w:pPr>
-      <w:hyperlink w:anchor="_Toc243234465" w:history="1">
+      <w:hyperlink w:anchor="_Toc243235003" w:history="1">
         <w:r>
           <w:rPr>
             <w:rStyle w:val="aff9"/>
@@ -1200,7 +1200,7 @@
             <w:noProof/>
             <w:webHidden/>
           </w:rPr>
-          <w:instrText>PAGEREF _Toc243234465 \h</w:instrText>
+          <w:instrText>PAGEREF _Toc243235003 \h</w:instrText>
         </w:r>
         <w:r>
           <w:rPr>
@@ -1259,7 +1259,7 @@
           <w14:ligatures w14:val="standardContextual"/>
         </w:rPr>
       </w:pPr>
-      <w:hyperlink w:anchor="_Toc243234466" w:history="1">
+      <w:hyperlink w:anchor="_Toc243235004" w:history="1">
         <w:r>
           <w:rPr>
             <w:rStyle w:val="aff9"/>
@@ -1297,7 +1297,7 @@
             <w:noProof/>
             <w:webHidden/>
           </w:rPr>
-          <w:instrText>PAGEREF _Toc243234466 \h</w:instrText>
+          <w:instrText>PAGEREF _Toc243235004 \h</w:instrText>
         </w:r>
         <w:r>
           <w:rPr>
@@ -1356,7 +1356,7 @@
           <w14:ligatures w14:val="standardContextual"/>
         </w:rPr>
       </w:pPr>
-      <w:hyperlink w:anchor="_Toc243234467" w:history="1">
+      <w:hyperlink w:anchor="_Toc243235005" w:history="1">
         <w:r>
           <w:rPr>
             <w:rStyle w:val="aff9"/>
@@ -1394,7 +1394,7 @@
             <w:noProof/>
             <w:webHidden/>
           </w:rPr>
-          <w:instrText>PAGEREF _Toc243234467 \h</w:instrText>
+          <w:instrText>PAGEREF _Toc243235005 \h</w:instrText>
         </w:r>
         <w:r>
           <w:rPr>
@@ -1452,7 +1452,7 @@
           <w14:ligatures w14:val="standardContextual"/>
         </w:rPr>
       </w:pPr>
-      <w:hyperlink w:anchor="_Toc243234468" w:history="1">
+      <w:hyperlink w:anchor="_Toc243235006" w:history="1">
         <w:r>
           <w:rPr>
             <w:rStyle w:val="aff9"/>
@@ -1490,7 +1490,7 @@
             <w:noProof/>
             <w:webHidden/>
           </w:rPr>
-          <w:instrText>PAGEREF _Toc243234468 \h</w:instrText>
+          <w:instrText>PAGEREF _Toc243235006 \h</w:instrText>
         </w:r>
         <w:r>
           <w:rPr>
@@ -1548,7 +1548,7 @@
           <w14:ligatures w14:val="standardContextual"/>
         </w:rPr>
       </w:pPr>
-      <w:hyperlink w:anchor="_Toc243234469" w:history="1">
+      <w:hyperlink w:anchor="_Toc243235007" w:history="1">
         <w:r>
           <w:rPr>
             <w:rStyle w:val="aff9"/>
@@ -1586,7 +1586,7 @@
             <w:noProof/>
             <w:webHidden/>
           </w:rPr>
-          <w:instrText>PAGEREF _Toc243234469 \h</w:instrText>
+          <w:instrText>PAGEREF _Toc243235007 \h</w:instrText>
         </w:r>
         <w:r>
           <w:rPr>
@@ -1644,7 +1644,7 @@
           <w14:ligatures w14:val="standardContextual"/>
         </w:rPr>
       </w:pPr>
-      <w:hyperlink w:anchor="_Toc243234470" w:history="1">
+      <w:hyperlink w:anchor="_Toc243235008" w:history="1">
         <w:r>
           <w:rPr>
             <w:rStyle w:val="aff9"/>
@@ -1682,7 +1682,7 @@
             <w:noProof/>
             <w:webHidden/>
           </w:rPr>
-          <w:instrText>PAGEREF _Toc243234470 \h</w:instrText>
+          <w:instrText>PAGEREF _Toc243235008 \h</w:instrText>
         </w:r>
         <w:r>
           <w:rPr>
@@ -1737,7 +1737,7 @@
         <w:pStyle w:val="1"/>
         <w:spacing w:before="280" w:after="120"/>
       </w:pPr>
-      <w:bookmarkStart w:id="0" w:name="_Toc243234455"/>
+      <w:bookmarkStart w:id="0" w:name="_Toc243234993"/>
       <w:r>
         <w:rPr>
           <w:rFonts w:ascii="Times New Roman" w:eastAsia="Arial" w:hAnsi="Times New Roman"/>
@@ -2186,7 +2186,7 @@
         <w:pStyle w:val="1"/>
         <w:spacing w:before="280" w:after="120"/>
       </w:pPr>
-      <w:bookmarkStart w:id="1" w:name="_Toc243234456"/>
+      <w:bookmarkStart w:id="1" w:name="_Toc243234994"/>
       <w:r>
         <w:rPr>
           <w:rFonts w:ascii="Times New Roman" w:eastAsia="Arial" w:hAnsi="Times New Roman"/>
@@ -2234,7 +2234,7 @@
         <w:pStyle w:val="1"/>
         <w:spacing w:before="280" w:after="120"/>
       </w:pPr>
-      <w:bookmarkStart w:id="2" w:name="_Toc243234457"/>
+      <w:bookmarkStart w:id="2" w:name="_Toc243234995"/>
       <w:r>
         <w:rPr>
           <w:rFonts w:ascii="Times New Roman" w:eastAsia="Arial" w:hAnsi="Times New Roman"/>
@@ -2780,7 +2780,7 @@
         <w:pStyle w:val="1"/>
         <w:spacing w:before="280" w:after="120"/>
       </w:pPr>
-      <w:bookmarkStart w:id="3" w:name="_Toc243234458"/>
+      <w:bookmarkStart w:id="3" w:name="_Toc243234996"/>
       <w:r>
         <w:rPr>
           <w:rFonts w:ascii="Times New Roman" w:eastAsia="Arial" w:hAnsi="Times New Roman"/>
@@ -3287,7 +3287,7 @@
         <w:pStyle w:val="1"/>
         <w:spacing w:before="280" w:after="120"/>
       </w:pPr>
-      <w:bookmarkStart w:id="4" w:name="_Toc243234459"/>
+      <w:bookmarkStart w:id="4" w:name="_Toc243234997"/>
       <w:r>
         <w:rPr>
           <w:rFonts w:ascii="Times New Roman" w:eastAsia="Arial" w:hAnsi="Times New Roman"/>
@@ -3975,7 +3975,7 @@
         <w:pStyle w:val="1"/>
         <w:spacing w:before="280" w:after="120"/>
       </w:pPr>
-      <w:bookmarkStart w:id="5" w:name="_Toc243234460"/>
+      <w:bookmarkStart w:id="5" w:name="_Toc243234998"/>
       <w:r>
         <w:rPr>
           <w:rFonts w:ascii="Times New Roman" w:eastAsia="Arial" w:hAnsi="Times New Roman"/>
@@ -4146,7 +4146,7 @@
         <w:pStyle w:val="1"/>
         <w:spacing w:before="280" w:after="120"/>
       </w:pPr>
-      <w:bookmarkStart w:id="6" w:name="_Toc243234461"/>
+      <w:bookmarkStart w:id="6" w:name="_Toc243234999"/>
       <w:r>
         <w:rPr>
           <w:rFonts w:ascii="Times New Roman" w:eastAsia="Arial" w:hAnsi="Times New Roman"/>
@@ -4352,7 +4352,7 @@
         <w:pStyle w:val="1"/>
         <w:spacing w:before="280" w:after="120"/>
       </w:pPr>
-      <w:bookmarkStart w:id="7" w:name="_Toc243234462"/>
+      <w:bookmarkStart w:id="7" w:name="_Toc243235000"/>
       <w:r>
         <w:rPr>
           <w:rFonts w:ascii="Times New Roman" w:eastAsia="Arial" w:hAnsi="Times New Roman"/>
@@ -4536,7 +4536,7 @@
         <w:pStyle w:val="1"/>
         <w:spacing w:before="280" w:after="120"/>
       </w:pPr>
-      <w:bookmarkStart w:id="8" w:name="_Toc243234463"/>
+      <w:bookmarkStart w:id="8" w:name="_Toc243235001"/>
       <w:r>
         <w:rPr>
           <w:rFonts w:ascii="Times New Roman" w:eastAsia="Arial" w:hAnsi="Times New Roman"/>
@@ -4868,7 +4868,7 @@
         <w:pStyle w:val="1"/>
         <w:spacing w:before="280" w:after="120"/>
       </w:pPr>
-      <w:bookmarkStart w:id="9" w:name="_Toc243234464"/>
+      <w:bookmarkStart w:id="9" w:name="_Toc243235002"/>
       <w:r>
         <w:rPr>
           <w:rFonts w:ascii="Times New Roman" w:eastAsia="Arial" w:hAnsi="Times New Roman"/>
@@ -5010,7 +5010,7 @@
         <w:pStyle w:val="1"/>
         <w:spacing w:before="280" w:after="120"/>
       </w:pPr>
-      <w:bookmarkStart w:id="10" w:name="_Toc243234465"/>
+      <w:bookmarkStart w:id="10" w:name="_Toc243235003"/>
       <w:r>
         <w:rPr>
           <w:rFonts w:ascii="Times New Roman" w:eastAsia="Arial" w:hAnsi="Times New Roman"/>
@@ -5026,7 +5026,7 @@
         <w:pStyle w:val="21"/>
         <w:spacing w:after="120"/>
       </w:pPr>
-      <w:bookmarkStart w:id="11" w:name="_Toc243234466"/>
+      <w:bookmarkStart w:id="11" w:name="_Toc243235004"/>
       <w:r>
         <w:rPr>
           <w:rFonts w:ascii="Times New Roman" w:eastAsia="Arial" w:hAnsi="Times New Roman"/>
@@ -5960,7 +5960,7 @@
         <w:pStyle w:val="21"/>
         <w:spacing w:after="120"/>
       </w:pPr>
-      <w:bookmarkStart w:id="12" w:name="_Toc243234467"/>
+      <w:bookmarkStart w:id="12" w:name="_Toc243235005"/>
       <w:r>
         <w:rPr>
           <w:rFonts w:ascii="Times New Roman" w:eastAsia="Arial" w:hAnsi="Times New Roman"/>
@@ -6119,7 +6119,7 @@
         <w:pStyle w:val="1"/>
         <w:spacing w:before="280" w:after="120"/>
       </w:pPr>
-      <w:bookmarkStart w:id="13" w:name="_Toc243234468"/>
+      <w:bookmarkStart w:id="13" w:name="_Toc243235006"/>
       <w:r>
         <w:rPr>
           <w:rFonts w:ascii="Times New Roman" w:eastAsia="Arial" w:hAnsi="Times New Roman"/>
@@ -6283,7 +6283,7 @@
         <w:pStyle w:val="1"/>
         <w:spacing w:before="280" w:after="120"/>
       </w:pPr>
-      <w:bookmarkStart w:id="14" w:name="_Toc243234469"/>
+      <w:bookmarkStart w:id="14" w:name="_Toc243235007"/>
       <w:r>
         <w:rPr>
           <w:rFonts w:ascii="Times New Roman" w:eastAsia="Arial" w:hAnsi="Times New Roman"/>
@@ -6521,7 +6521,7 @@
         <w:pStyle w:val="1"/>
         <w:spacing w:before="280" w:after="120"/>
       </w:pPr>
-      <w:bookmarkStart w:id="15" w:name="_Toc243234470"/>
+      <w:bookmarkStart w:id="15" w:name="_Toc243235008"/>
       <w:r>
         <w:rPr>
           <w:rFonts w:ascii="Times New Roman" w:eastAsia="Arial" w:hAnsi="Times New Roman"/>
@@ -7347,31 +7347,31 @@
       </w:rPr>
     </w:lvl>
   </w:abstractNum>
-  <w:num w:numId="1" w16cid:durableId="1011832108">
+  <w:num w:numId="1" w16cid:durableId="1110735572">
     <w:abstractNumId w:val="8"/>
   </w:num>
-  <w:num w:numId="2" w16cid:durableId="1426922463">
+  <w:num w:numId="2" w16cid:durableId="761489027">
     <w:abstractNumId w:val="6"/>
   </w:num>
-  <w:num w:numId="3" w16cid:durableId="293603226">
+  <w:num w:numId="3" w16cid:durableId="1223907918">
     <w:abstractNumId w:val="5"/>
   </w:num>
-  <w:num w:numId="4" w16cid:durableId="187985422">
+  <w:num w:numId="4" w16cid:durableId="590429966">
     <w:abstractNumId w:val="4"/>
   </w:num>
-  <w:num w:numId="5" w16cid:durableId="1581329408">
+  <w:num w:numId="5" w16cid:durableId="78059965">
     <w:abstractNumId w:val="7"/>
   </w:num>
-  <w:num w:numId="6" w16cid:durableId="309137007">
+  <w:num w:numId="6" w16cid:durableId="1235624277">
     <w:abstractNumId w:val="3"/>
   </w:num>
-  <w:num w:numId="7" w16cid:durableId="2114545968">
+  <w:num w:numId="7" w16cid:durableId="2083990757">
     <w:abstractNumId w:val="2"/>
   </w:num>
-  <w:num w:numId="8" w16cid:durableId="928074331">
+  <w:num w:numId="8" w16cid:durableId="1400177603">
     <w:abstractNumId w:val="1"/>
   </w:num>
-  <w:num w:numId="9" w16cid:durableId="1049456336">
+  <w:num w:numId="9" w16cid:durableId="1589076425">
     <w:abstractNumId w:val="0"/>
   </w:num>
 </w:numbering>
@@ -18770,7 +18770,7 @@
     <w:autoRedefine/>
     <w:uiPriority w:val="39"/>
     <w:unhideWhenUsed/>
-    <w:rsid w:val="00CF11AA"/>
+    <w:rsid w:val="003B0E60"/>
   </w:style>
   <w:style w:type="paragraph" w:styleId="TOC2">
     <w:name w:val="toc 2"/>
@@ -18779,7 +18779,7 @@
     <w:autoRedefine/>
     <w:uiPriority w:val="39"/>
     <w:unhideWhenUsed/>
-    <w:rsid w:val="00CF11AA"/>
+    <w:rsid w:val="003B0E60"/>
     <w:pPr>
       <w:ind w:leftChars="200" w:left="420"/>
     </w:pPr>
@@ -18789,7 +18789,7 @@
     <w:basedOn w:val="a2"/>
     <w:uiPriority w:val="99"/>
     <w:unhideWhenUsed/>
-    <w:rsid w:val="00CF11AA"/>
+    <w:rsid w:val="003B0E60"/>
     <w:rPr>
       <w:color w:val="0000FF" w:themeColor="hyperlink"/>
       <w:u w:val="single"/>

</xml_diff>

<commit_message>
Extend the FY1 forecast-error sample to 2025
The 2025 realised EPS adds 2,679 of the 2,726 2024 events. FY1 raises the star-minus-
non-star gap to 0.40 (p=0.009) for upgrades and 0.94 (p<0.001) for downgrades.
All Word documents are rebuilt with the new sample and clustered results.

Co-Authored-By: Claude Code <noreply@anthropic.com>
</commit_message>
<xml_diff>
--- a/文档/Project10_Star_Analyst_Research_Plan_EN.docx
+++ b/文档/Project10_Star_Analyst_Research_Plan_EN.docx
@@ -202,7 +202,7 @@
         </w:rPr>
         <w:fldChar w:fldCharType="separate"/>
       </w:r>
-      <w:hyperlink w:anchor="_Toc243234993" w:history="1">
+      <w:hyperlink w:anchor="_Toc243235683" w:history="1">
         <w:r>
           <w:rPr>
             <w:rStyle w:val="aff9"/>
@@ -240,7 +240,7 @@
             <w:noProof/>
             <w:webHidden/>
           </w:rPr>
-          <w:instrText>PAGEREF _Toc243234993 \h</w:instrText>
+          <w:instrText>PAGEREF _Toc243235683 \h</w:instrText>
         </w:r>
         <w:r>
           <w:rPr>
@@ -298,7 +298,7 @@
           <w14:ligatures w14:val="standardContextual"/>
         </w:rPr>
       </w:pPr>
-      <w:hyperlink w:anchor="_Toc243234994" w:history="1">
+      <w:hyperlink w:anchor="_Toc243235684" w:history="1">
         <w:r>
           <w:rPr>
             <w:rStyle w:val="aff9"/>
@@ -336,7 +336,7 @@
             <w:noProof/>
             <w:webHidden/>
           </w:rPr>
-          <w:instrText>PAGEREF _Toc243234994 \h</w:instrText>
+          <w:instrText>PAGEREF _Toc243235684 \h</w:instrText>
         </w:r>
         <w:r>
           <w:rPr>
@@ -394,7 +394,7 @@
           <w14:ligatures w14:val="standardContextual"/>
         </w:rPr>
       </w:pPr>
-      <w:hyperlink w:anchor="_Toc243234995" w:history="1">
+      <w:hyperlink w:anchor="_Toc243235685" w:history="1">
         <w:r>
           <w:rPr>
             <w:rStyle w:val="aff9"/>
@@ -432,7 +432,7 @@
             <w:noProof/>
             <w:webHidden/>
           </w:rPr>
-          <w:instrText>PAGEREF _Toc243234995 \h</w:instrText>
+          <w:instrText>PAGEREF _Toc243235685 \h</w:instrText>
         </w:r>
         <w:r>
           <w:rPr>
@@ -490,7 +490,7 @@
           <w14:ligatures w14:val="standardContextual"/>
         </w:rPr>
       </w:pPr>
-      <w:hyperlink w:anchor="_Toc243234996" w:history="1">
+      <w:hyperlink w:anchor="_Toc243235686" w:history="1">
         <w:r>
           <w:rPr>
             <w:rStyle w:val="aff9"/>
@@ -528,7 +528,7 @@
             <w:noProof/>
             <w:webHidden/>
           </w:rPr>
-          <w:instrText>PAGEREF _Toc243234996 \h</w:instrText>
+          <w:instrText>PAGEREF _Toc243235686 \h</w:instrText>
         </w:r>
         <w:r>
           <w:rPr>
@@ -586,7 +586,7 @@
           <w14:ligatures w14:val="standardContextual"/>
         </w:rPr>
       </w:pPr>
-      <w:hyperlink w:anchor="_Toc243234997" w:history="1">
+      <w:hyperlink w:anchor="_Toc243235687" w:history="1">
         <w:r>
           <w:rPr>
             <w:rStyle w:val="aff9"/>
@@ -624,7 +624,7 @@
             <w:noProof/>
             <w:webHidden/>
           </w:rPr>
-          <w:instrText>PAGEREF _Toc243234997 \h</w:instrText>
+          <w:instrText>PAGEREF _Toc243235687 \h</w:instrText>
         </w:r>
         <w:r>
           <w:rPr>
@@ -682,7 +682,7 @@
           <w14:ligatures w14:val="standardContextual"/>
         </w:rPr>
       </w:pPr>
-      <w:hyperlink w:anchor="_Toc243234998" w:history="1">
+      <w:hyperlink w:anchor="_Toc243235688" w:history="1">
         <w:r>
           <w:rPr>
             <w:rStyle w:val="aff9"/>
@@ -720,7 +720,7 @@
             <w:noProof/>
             <w:webHidden/>
           </w:rPr>
-          <w:instrText>PAGEREF _Toc243234998 \h</w:instrText>
+          <w:instrText>PAGEREF _Toc243235688 \h</w:instrText>
         </w:r>
         <w:r>
           <w:rPr>
@@ -778,7 +778,7 @@
           <w14:ligatures w14:val="standardContextual"/>
         </w:rPr>
       </w:pPr>
-      <w:hyperlink w:anchor="_Toc243234999" w:history="1">
+      <w:hyperlink w:anchor="_Toc243235689" w:history="1">
         <w:r>
           <w:rPr>
             <w:rStyle w:val="aff9"/>
@@ -816,7 +816,7 @@
             <w:noProof/>
             <w:webHidden/>
           </w:rPr>
-          <w:instrText>PAGEREF _Toc243234999 \h</w:instrText>
+          <w:instrText>PAGEREF _Toc243235689 \h</w:instrText>
         </w:r>
         <w:r>
           <w:rPr>
@@ -874,7 +874,7 @@
           <w14:ligatures w14:val="standardContextual"/>
         </w:rPr>
       </w:pPr>
-      <w:hyperlink w:anchor="_Toc243235000" w:history="1">
+      <w:hyperlink w:anchor="_Toc243235690" w:history="1">
         <w:r>
           <w:rPr>
             <w:rStyle w:val="aff9"/>
@@ -912,7 +912,7 @@
             <w:noProof/>
             <w:webHidden/>
           </w:rPr>
-          <w:instrText>PAGEREF _Toc243235000 \h</w:instrText>
+          <w:instrText>PAGEREF _Toc243235690 \h</w:instrText>
         </w:r>
         <w:r>
           <w:rPr>
@@ -970,7 +970,7 @@
           <w14:ligatures w14:val="standardContextual"/>
         </w:rPr>
       </w:pPr>
-      <w:hyperlink w:anchor="_Toc243235001" w:history="1">
+      <w:hyperlink w:anchor="_Toc243235691" w:history="1">
         <w:r>
           <w:rPr>
             <w:rStyle w:val="aff9"/>
@@ -1008,7 +1008,7 @@
             <w:noProof/>
             <w:webHidden/>
           </w:rPr>
-          <w:instrText>PAGEREF _Toc243235001 \h</w:instrText>
+          <w:instrText>PAGEREF _Toc243235691 \h</w:instrText>
         </w:r>
         <w:r>
           <w:rPr>
@@ -1066,7 +1066,7 @@
           <w14:ligatures w14:val="standardContextual"/>
         </w:rPr>
       </w:pPr>
-      <w:hyperlink w:anchor="_Toc243235002" w:history="1">
+      <w:hyperlink w:anchor="_Toc243235692" w:history="1">
         <w:r>
           <w:rPr>
             <w:rStyle w:val="aff9"/>
@@ -1104,7 +1104,7 @@
             <w:noProof/>
             <w:webHidden/>
           </w:rPr>
-          <w:instrText>PAGEREF _Toc243235002 \h</w:instrText>
+          <w:instrText>PAGEREF _Toc243235692 \h</w:instrText>
         </w:r>
         <w:r>
           <w:rPr>
@@ -1162,7 +1162,7 @@
           <w14:ligatures w14:val="standardContextual"/>
         </w:rPr>
       </w:pPr>
-      <w:hyperlink w:anchor="_Toc243235003" w:history="1">
+      <w:hyperlink w:anchor="_Toc243235693" w:history="1">
         <w:r>
           <w:rPr>
             <w:rStyle w:val="aff9"/>
@@ -1200,7 +1200,7 @@
             <w:noProof/>
             <w:webHidden/>
           </w:rPr>
-          <w:instrText>PAGEREF _Toc243235003 \h</w:instrText>
+          <w:instrText>PAGEREF _Toc243235693 \h</w:instrText>
         </w:r>
         <w:r>
           <w:rPr>
@@ -1259,7 +1259,7 @@
           <w14:ligatures w14:val="standardContextual"/>
         </w:rPr>
       </w:pPr>
-      <w:hyperlink w:anchor="_Toc243235004" w:history="1">
+      <w:hyperlink w:anchor="_Toc243235694" w:history="1">
         <w:r>
           <w:rPr>
             <w:rStyle w:val="aff9"/>
@@ -1297,7 +1297,7 @@
             <w:noProof/>
             <w:webHidden/>
           </w:rPr>
-          <w:instrText>PAGEREF _Toc243235004 \h</w:instrText>
+          <w:instrText>PAGEREF _Toc243235694 \h</w:instrText>
         </w:r>
         <w:r>
           <w:rPr>
@@ -1356,7 +1356,7 @@
           <w14:ligatures w14:val="standardContextual"/>
         </w:rPr>
       </w:pPr>
-      <w:hyperlink w:anchor="_Toc243235005" w:history="1">
+      <w:hyperlink w:anchor="_Toc243235695" w:history="1">
         <w:r>
           <w:rPr>
             <w:rStyle w:val="aff9"/>
@@ -1394,7 +1394,7 @@
             <w:noProof/>
             <w:webHidden/>
           </w:rPr>
-          <w:instrText>PAGEREF _Toc243235005 \h</w:instrText>
+          <w:instrText>PAGEREF _Toc243235695 \h</w:instrText>
         </w:r>
         <w:r>
           <w:rPr>
@@ -1452,7 +1452,7 @@
           <w14:ligatures w14:val="standardContextual"/>
         </w:rPr>
       </w:pPr>
-      <w:hyperlink w:anchor="_Toc243235006" w:history="1">
+      <w:hyperlink w:anchor="_Toc243235696" w:history="1">
         <w:r>
           <w:rPr>
             <w:rStyle w:val="aff9"/>
@@ -1490,7 +1490,7 @@
             <w:noProof/>
             <w:webHidden/>
           </w:rPr>
-          <w:instrText>PAGEREF _Toc243235006 \h</w:instrText>
+          <w:instrText>PAGEREF _Toc243235696 \h</w:instrText>
         </w:r>
         <w:r>
           <w:rPr>
@@ -1548,7 +1548,7 @@
           <w14:ligatures w14:val="standardContextual"/>
         </w:rPr>
       </w:pPr>
-      <w:hyperlink w:anchor="_Toc243235007" w:history="1">
+      <w:hyperlink w:anchor="_Toc243235697" w:history="1">
         <w:r>
           <w:rPr>
             <w:rStyle w:val="aff9"/>
@@ -1586,7 +1586,7 @@
             <w:noProof/>
             <w:webHidden/>
           </w:rPr>
-          <w:instrText>PAGEREF _Toc243235007 \h</w:instrText>
+          <w:instrText>PAGEREF _Toc243235697 \h</w:instrText>
         </w:r>
         <w:r>
           <w:rPr>
@@ -1644,7 +1644,7 @@
           <w14:ligatures w14:val="standardContextual"/>
         </w:rPr>
       </w:pPr>
-      <w:hyperlink w:anchor="_Toc243235008" w:history="1">
+      <w:hyperlink w:anchor="_Toc243235698" w:history="1">
         <w:r>
           <w:rPr>
             <w:rStyle w:val="aff9"/>
@@ -1682,7 +1682,7 @@
             <w:noProof/>
             <w:webHidden/>
           </w:rPr>
-          <w:instrText>PAGEREF _Toc243235008 \h</w:instrText>
+          <w:instrText>PAGEREF _Toc243235698 \h</w:instrText>
         </w:r>
         <w:r>
           <w:rPr>
@@ -1737,7 +1737,7 @@
         <w:pStyle w:val="1"/>
         <w:spacing w:before="280" w:after="120"/>
       </w:pPr>
-      <w:bookmarkStart w:id="0" w:name="_Toc243234993"/>
+      <w:bookmarkStart w:id="0" w:name="_Toc243235683"/>
       <w:r>
         <w:rPr>
           <w:rFonts w:ascii="Times New Roman" w:eastAsia="Arial" w:hAnsi="Times New Roman"/>
@@ -2186,7 +2186,7 @@
         <w:pStyle w:val="1"/>
         <w:spacing w:before="280" w:after="120"/>
       </w:pPr>
-      <w:bookmarkStart w:id="1" w:name="_Toc243234994"/>
+      <w:bookmarkStart w:id="1" w:name="_Toc243235684"/>
       <w:r>
         <w:rPr>
           <w:rFonts w:ascii="Times New Roman" w:eastAsia="Arial" w:hAnsi="Times New Roman"/>
@@ -2234,7 +2234,7 @@
         <w:pStyle w:val="1"/>
         <w:spacing w:before="280" w:after="120"/>
       </w:pPr>
-      <w:bookmarkStart w:id="2" w:name="_Toc243234995"/>
+      <w:bookmarkStart w:id="2" w:name="_Toc243235685"/>
       <w:r>
         <w:rPr>
           <w:rFonts w:ascii="Times New Roman" w:eastAsia="Arial" w:hAnsi="Times New Roman"/>
@@ -2780,7 +2780,7 @@
         <w:pStyle w:val="1"/>
         <w:spacing w:before="280" w:after="120"/>
       </w:pPr>
-      <w:bookmarkStart w:id="3" w:name="_Toc243234996"/>
+      <w:bookmarkStart w:id="3" w:name="_Toc243235686"/>
       <w:r>
         <w:rPr>
           <w:rFonts w:ascii="Times New Roman" w:eastAsia="Arial" w:hAnsi="Times New Roman"/>
@@ -3287,7 +3287,7 @@
         <w:pStyle w:val="1"/>
         <w:spacing w:before="280" w:after="120"/>
       </w:pPr>
-      <w:bookmarkStart w:id="4" w:name="_Toc243234997"/>
+      <w:bookmarkStart w:id="4" w:name="_Toc243235687"/>
       <w:r>
         <w:rPr>
           <w:rFonts w:ascii="Times New Roman" w:eastAsia="Arial" w:hAnsi="Times New Roman"/>
@@ -3975,7 +3975,7 @@
         <w:pStyle w:val="1"/>
         <w:spacing w:before="280" w:after="120"/>
       </w:pPr>
-      <w:bookmarkStart w:id="5" w:name="_Toc243234998"/>
+      <w:bookmarkStart w:id="5" w:name="_Toc243235688"/>
       <w:r>
         <w:rPr>
           <w:rFonts w:ascii="Times New Roman" w:eastAsia="Arial" w:hAnsi="Times New Roman"/>
@@ -4146,7 +4146,7 @@
         <w:pStyle w:val="1"/>
         <w:spacing w:before="280" w:after="120"/>
       </w:pPr>
-      <w:bookmarkStart w:id="6" w:name="_Toc243234999"/>
+      <w:bookmarkStart w:id="6" w:name="_Toc243235689"/>
       <w:r>
         <w:rPr>
           <w:rFonts w:ascii="Times New Roman" w:eastAsia="Arial" w:hAnsi="Times New Roman"/>
@@ -4352,7 +4352,7 @@
         <w:pStyle w:val="1"/>
         <w:spacing w:before="280" w:after="120"/>
       </w:pPr>
-      <w:bookmarkStart w:id="7" w:name="_Toc243235000"/>
+      <w:bookmarkStart w:id="7" w:name="_Toc243235690"/>
       <w:r>
         <w:rPr>
           <w:rFonts w:ascii="Times New Roman" w:eastAsia="Arial" w:hAnsi="Times New Roman"/>
@@ -4536,7 +4536,7 @@
         <w:pStyle w:val="1"/>
         <w:spacing w:before="280" w:after="120"/>
       </w:pPr>
-      <w:bookmarkStart w:id="8" w:name="_Toc243235001"/>
+      <w:bookmarkStart w:id="8" w:name="_Toc243235691"/>
       <w:r>
         <w:rPr>
           <w:rFonts w:ascii="Times New Roman" w:eastAsia="Arial" w:hAnsi="Times New Roman"/>
@@ -4868,7 +4868,7 @@
         <w:pStyle w:val="1"/>
         <w:spacing w:before="280" w:after="120"/>
       </w:pPr>
-      <w:bookmarkStart w:id="9" w:name="_Toc243235002"/>
+      <w:bookmarkStart w:id="9" w:name="_Toc243235692"/>
       <w:r>
         <w:rPr>
           <w:rFonts w:ascii="Times New Roman" w:eastAsia="Arial" w:hAnsi="Times New Roman"/>
@@ -5010,7 +5010,7 @@
         <w:pStyle w:val="1"/>
         <w:spacing w:before="280" w:after="120"/>
       </w:pPr>
-      <w:bookmarkStart w:id="10" w:name="_Toc243235003"/>
+      <w:bookmarkStart w:id="10" w:name="_Toc243235693"/>
       <w:r>
         <w:rPr>
           <w:rFonts w:ascii="Times New Roman" w:eastAsia="Arial" w:hAnsi="Times New Roman"/>
@@ -5026,7 +5026,7 @@
         <w:pStyle w:val="21"/>
         <w:spacing w:after="120"/>
       </w:pPr>
-      <w:bookmarkStart w:id="11" w:name="_Toc243235004"/>
+      <w:bookmarkStart w:id="11" w:name="_Toc243235694"/>
       <w:r>
         <w:rPr>
           <w:rFonts w:ascii="Times New Roman" w:eastAsia="Arial" w:hAnsi="Times New Roman"/>
@@ -5960,7 +5960,7 @@
         <w:pStyle w:val="21"/>
         <w:spacing w:after="120"/>
       </w:pPr>
-      <w:bookmarkStart w:id="12" w:name="_Toc243235005"/>
+      <w:bookmarkStart w:id="12" w:name="_Toc243235695"/>
       <w:r>
         <w:rPr>
           <w:rFonts w:ascii="Times New Roman" w:eastAsia="Arial" w:hAnsi="Times New Roman"/>
@@ -6119,7 +6119,7 @@
         <w:pStyle w:val="1"/>
         <w:spacing w:before="280" w:after="120"/>
       </w:pPr>
-      <w:bookmarkStart w:id="13" w:name="_Toc243235006"/>
+      <w:bookmarkStart w:id="13" w:name="_Toc243235696"/>
       <w:r>
         <w:rPr>
           <w:rFonts w:ascii="Times New Roman" w:eastAsia="Arial" w:hAnsi="Times New Roman"/>
@@ -6283,7 +6283,7 @@
         <w:pStyle w:val="1"/>
         <w:spacing w:before="280" w:after="120"/>
       </w:pPr>
-      <w:bookmarkStart w:id="14" w:name="_Toc243235007"/>
+      <w:bookmarkStart w:id="14" w:name="_Toc243235697"/>
       <w:r>
         <w:rPr>
           <w:rFonts w:ascii="Times New Roman" w:eastAsia="Arial" w:hAnsi="Times New Roman"/>
@@ -6521,7 +6521,7 @@
         <w:pStyle w:val="1"/>
         <w:spacing w:before="280" w:after="120"/>
       </w:pPr>
-      <w:bookmarkStart w:id="15" w:name="_Toc243235008"/>
+      <w:bookmarkStart w:id="15" w:name="_Toc243235698"/>
       <w:r>
         <w:rPr>
           <w:rFonts w:ascii="Times New Roman" w:eastAsia="Arial" w:hAnsi="Times New Roman"/>
@@ -7347,31 +7347,31 @@
       </w:rPr>
     </w:lvl>
   </w:abstractNum>
-  <w:num w:numId="1" w16cid:durableId="1110735572">
+  <w:num w:numId="1" w16cid:durableId="777021823">
     <w:abstractNumId w:val="8"/>
   </w:num>
-  <w:num w:numId="2" w16cid:durableId="761489027">
+  <w:num w:numId="2" w16cid:durableId="1912696074">
     <w:abstractNumId w:val="6"/>
   </w:num>
-  <w:num w:numId="3" w16cid:durableId="1223907918">
+  <w:num w:numId="3" w16cid:durableId="568656852">
     <w:abstractNumId w:val="5"/>
   </w:num>
-  <w:num w:numId="4" w16cid:durableId="590429966">
+  <w:num w:numId="4" w16cid:durableId="2127191254">
     <w:abstractNumId w:val="4"/>
   </w:num>
-  <w:num w:numId="5" w16cid:durableId="78059965">
+  <w:num w:numId="5" w16cid:durableId="2128962411">
     <w:abstractNumId w:val="7"/>
   </w:num>
-  <w:num w:numId="6" w16cid:durableId="1235624277">
+  <w:num w:numId="6" w16cid:durableId="243220007">
     <w:abstractNumId w:val="3"/>
   </w:num>
-  <w:num w:numId="7" w16cid:durableId="2083990757">
+  <w:num w:numId="7" w16cid:durableId="1979072932">
     <w:abstractNumId w:val="2"/>
   </w:num>
-  <w:num w:numId="8" w16cid:durableId="1400177603">
+  <w:num w:numId="8" w16cid:durableId="984163814">
     <w:abstractNumId w:val="1"/>
   </w:num>
-  <w:num w:numId="9" w16cid:durableId="1589076425">
+  <w:num w:numId="9" w16cid:durableId="442848264">
     <w:abstractNumId w:val="0"/>
   </w:num>
 </w:numbering>
@@ -18770,7 +18770,7 @@
     <w:autoRedefine/>
     <w:uiPriority w:val="39"/>
     <w:unhideWhenUsed/>
-    <w:rsid w:val="003B0E60"/>
+    <w:rsid w:val="00D325EC"/>
   </w:style>
   <w:style w:type="paragraph" w:styleId="TOC2">
     <w:name w:val="toc 2"/>
@@ -18779,7 +18779,7 @@
     <w:autoRedefine/>
     <w:uiPriority w:val="39"/>
     <w:unhideWhenUsed/>
-    <w:rsid w:val="003B0E60"/>
+    <w:rsid w:val="00D325EC"/>
     <w:pPr>
       <w:ind w:leftChars="200" w:left="420"/>
     </w:pPr>
@@ -18789,7 +18789,7 @@
     <w:basedOn w:val="a2"/>
     <w:uiPriority w:val="99"/>
     <w:unhideWhenUsed/>
-    <w:rsid w:val="003B0E60"/>
+    <w:rsid w:val="00D325EC"/>
     <w:rPr>
       <w:color w:val="0000FF" w:themeColor="hyperlink"/>
       <w:u w:val="single"/>

</xml_diff>

<commit_message>
Add the event-day seniority variant and correct its definition
The main seniority column is measured at the report date. For non-trading-day
reports the event day can be up to 10 calendar days later; car_event_level now also
stores the event-day variant. The two differ by at most 0.027 years (rank correlation
0.9999999), and car_summary is unchanged.

Co-Authored-By: Claude Code <noreply@anthropic.com>
</commit_message>
<xml_diff>
--- a/文档/Project10_Star_Analyst_Research_Plan_EN.docx
+++ b/文档/Project10_Star_Analyst_Research_Plan_EN.docx
@@ -202,7 +202,7 @@
         </w:rPr>
         <w:fldChar w:fldCharType="separate"/>
       </w:r>
-      <w:hyperlink w:anchor="_Toc243235683" w:history="1">
+      <w:hyperlink w:anchor="_Toc243236502" w:history="1">
         <w:r>
           <w:rPr>
             <w:rStyle w:val="aff9"/>
@@ -240,7 +240,7 @@
             <w:noProof/>
             <w:webHidden/>
           </w:rPr>
-          <w:instrText>PAGEREF _Toc243235683 \h</w:instrText>
+          <w:instrText>PAGEREF _Toc243236502 \h</w:instrText>
         </w:r>
         <w:r>
           <w:rPr>
@@ -298,7 +298,7 @@
           <w14:ligatures w14:val="standardContextual"/>
         </w:rPr>
       </w:pPr>
-      <w:hyperlink w:anchor="_Toc243235684" w:history="1">
+      <w:hyperlink w:anchor="_Toc243236503" w:history="1">
         <w:r>
           <w:rPr>
             <w:rStyle w:val="aff9"/>
@@ -336,7 +336,7 @@
             <w:noProof/>
             <w:webHidden/>
           </w:rPr>
-          <w:instrText>PAGEREF _Toc243235684 \h</w:instrText>
+          <w:instrText>PAGEREF _Toc243236503 \h</w:instrText>
         </w:r>
         <w:r>
           <w:rPr>
@@ -394,7 +394,7 @@
           <w14:ligatures w14:val="standardContextual"/>
         </w:rPr>
       </w:pPr>
-      <w:hyperlink w:anchor="_Toc243235685" w:history="1">
+      <w:hyperlink w:anchor="_Toc243236504" w:history="1">
         <w:r>
           <w:rPr>
             <w:rStyle w:val="aff9"/>
@@ -432,7 +432,7 @@
             <w:noProof/>
             <w:webHidden/>
           </w:rPr>
-          <w:instrText>PAGEREF _Toc243235685 \h</w:instrText>
+          <w:instrText>PAGEREF _Toc243236504 \h</w:instrText>
         </w:r>
         <w:r>
           <w:rPr>
@@ -490,7 +490,7 @@
           <w14:ligatures w14:val="standardContextual"/>
         </w:rPr>
       </w:pPr>
-      <w:hyperlink w:anchor="_Toc243235686" w:history="1">
+      <w:hyperlink w:anchor="_Toc243236505" w:history="1">
         <w:r>
           <w:rPr>
             <w:rStyle w:val="aff9"/>
@@ -528,7 +528,7 @@
             <w:noProof/>
             <w:webHidden/>
           </w:rPr>
-          <w:instrText>PAGEREF _Toc243235686 \h</w:instrText>
+          <w:instrText>PAGEREF _Toc243236505 \h</w:instrText>
         </w:r>
         <w:r>
           <w:rPr>
@@ -586,7 +586,7 @@
           <w14:ligatures w14:val="standardContextual"/>
         </w:rPr>
       </w:pPr>
-      <w:hyperlink w:anchor="_Toc243235687" w:history="1">
+      <w:hyperlink w:anchor="_Toc243236506" w:history="1">
         <w:r>
           <w:rPr>
             <w:rStyle w:val="aff9"/>
@@ -624,7 +624,7 @@
             <w:noProof/>
             <w:webHidden/>
           </w:rPr>
-          <w:instrText>PAGEREF _Toc243235687 \h</w:instrText>
+          <w:instrText>PAGEREF _Toc243236506 \h</w:instrText>
         </w:r>
         <w:r>
           <w:rPr>
@@ -682,7 +682,7 @@
           <w14:ligatures w14:val="standardContextual"/>
         </w:rPr>
       </w:pPr>
-      <w:hyperlink w:anchor="_Toc243235688" w:history="1">
+      <w:hyperlink w:anchor="_Toc243236507" w:history="1">
         <w:r>
           <w:rPr>
             <w:rStyle w:val="aff9"/>
@@ -720,7 +720,7 @@
             <w:noProof/>
             <w:webHidden/>
           </w:rPr>
-          <w:instrText>PAGEREF _Toc243235688 \h</w:instrText>
+          <w:instrText>PAGEREF _Toc243236507 \h</w:instrText>
         </w:r>
         <w:r>
           <w:rPr>
@@ -778,7 +778,7 @@
           <w14:ligatures w14:val="standardContextual"/>
         </w:rPr>
       </w:pPr>
-      <w:hyperlink w:anchor="_Toc243235689" w:history="1">
+      <w:hyperlink w:anchor="_Toc243236508" w:history="1">
         <w:r>
           <w:rPr>
             <w:rStyle w:val="aff9"/>
@@ -816,7 +816,7 @@
             <w:noProof/>
             <w:webHidden/>
           </w:rPr>
-          <w:instrText>PAGEREF _Toc243235689 \h</w:instrText>
+          <w:instrText>PAGEREF _Toc243236508 \h</w:instrText>
         </w:r>
         <w:r>
           <w:rPr>
@@ -874,7 +874,7 @@
           <w14:ligatures w14:val="standardContextual"/>
         </w:rPr>
       </w:pPr>
-      <w:hyperlink w:anchor="_Toc243235690" w:history="1">
+      <w:hyperlink w:anchor="_Toc243236509" w:history="1">
         <w:r>
           <w:rPr>
             <w:rStyle w:val="aff9"/>
@@ -912,7 +912,7 @@
             <w:noProof/>
             <w:webHidden/>
           </w:rPr>
-          <w:instrText>PAGEREF _Toc243235690 \h</w:instrText>
+          <w:instrText>PAGEREF _Toc243236509 \h</w:instrText>
         </w:r>
         <w:r>
           <w:rPr>
@@ -970,7 +970,7 @@
           <w14:ligatures w14:val="standardContextual"/>
         </w:rPr>
       </w:pPr>
-      <w:hyperlink w:anchor="_Toc243235691" w:history="1">
+      <w:hyperlink w:anchor="_Toc243236510" w:history="1">
         <w:r>
           <w:rPr>
             <w:rStyle w:val="aff9"/>
@@ -1008,7 +1008,7 @@
             <w:noProof/>
             <w:webHidden/>
           </w:rPr>
-          <w:instrText>PAGEREF _Toc243235691 \h</w:instrText>
+          <w:instrText>PAGEREF _Toc243236510 \h</w:instrText>
         </w:r>
         <w:r>
           <w:rPr>
@@ -1066,7 +1066,7 @@
           <w14:ligatures w14:val="standardContextual"/>
         </w:rPr>
       </w:pPr>
-      <w:hyperlink w:anchor="_Toc243235692" w:history="1">
+      <w:hyperlink w:anchor="_Toc243236511" w:history="1">
         <w:r>
           <w:rPr>
             <w:rStyle w:val="aff9"/>
@@ -1104,7 +1104,7 @@
             <w:noProof/>
             <w:webHidden/>
           </w:rPr>
-          <w:instrText>PAGEREF _Toc243235692 \h</w:instrText>
+          <w:instrText>PAGEREF _Toc243236511 \h</w:instrText>
         </w:r>
         <w:r>
           <w:rPr>
@@ -1162,7 +1162,7 @@
           <w14:ligatures w14:val="standardContextual"/>
         </w:rPr>
       </w:pPr>
-      <w:hyperlink w:anchor="_Toc243235693" w:history="1">
+      <w:hyperlink w:anchor="_Toc243236512" w:history="1">
         <w:r>
           <w:rPr>
             <w:rStyle w:val="aff9"/>
@@ -1200,7 +1200,7 @@
             <w:noProof/>
             <w:webHidden/>
           </w:rPr>
-          <w:instrText>PAGEREF _Toc243235693 \h</w:instrText>
+          <w:instrText>PAGEREF _Toc243236512 \h</w:instrText>
         </w:r>
         <w:r>
           <w:rPr>
@@ -1259,7 +1259,7 @@
           <w14:ligatures w14:val="standardContextual"/>
         </w:rPr>
       </w:pPr>
-      <w:hyperlink w:anchor="_Toc243235694" w:history="1">
+      <w:hyperlink w:anchor="_Toc243236513" w:history="1">
         <w:r>
           <w:rPr>
             <w:rStyle w:val="aff9"/>
@@ -1297,7 +1297,7 @@
             <w:noProof/>
             <w:webHidden/>
           </w:rPr>
-          <w:instrText>PAGEREF _Toc243235694 \h</w:instrText>
+          <w:instrText>PAGEREF _Toc243236513 \h</w:instrText>
         </w:r>
         <w:r>
           <w:rPr>
@@ -1356,7 +1356,7 @@
           <w14:ligatures w14:val="standardContextual"/>
         </w:rPr>
       </w:pPr>
-      <w:hyperlink w:anchor="_Toc243235695" w:history="1">
+      <w:hyperlink w:anchor="_Toc243236514" w:history="1">
         <w:r>
           <w:rPr>
             <w:rStyle w:val="aff9"/>
@@ -1394,7 +1394,7 @@
             <w:noProof/>
             <w:webHidden/>
           </w:rPr>
-          <w:instrText>PAGEREF _Toc243235695 \h</w:instrText>
+          <w:instrText>PAGEREF _Toc243236514 \h</w:instrText>
         </w:r>
         <w:r>
           <w:rPr>
@@ -1452,7 +1452,7 @@
           <w14:ligatures w14:val="standardContextual"/>
         </w:rPr>
       </w:pPr>
-      <w:hyperlink w:anchor="_Toc243235696" w:history="1">
+      <w:hyperlink w:anchor="_Toc243236515" w:history="1">
         <w:r>
           <w:rPr>
             <w:rStyle w:val="aff9"/>
@@ -1490,7 +1490,7 @@
             <w:noProof/>
             <w:webHidden/>
           </w:rPr>
-          <w:instrText>PAGEREF _Toc243235696 \h</w:instrText>
+          <w:instrText>PAGEREF _Toc243236515 \h</w:instrText>
         </w:r>
         <w:r>
           <w:rPr>
@@ -1548,7 +1548,7 @@
           <w14:ligatures w14:val="standardContextual"/>
         </w:rPr>
       </w:pPr>
-      <w:hyperlink w:anchor="_Toc243235697" w:history="1">
+      <w:hyperlink w:anchor="_Toc243236516" w:history="1">
         <w:r>
           <w:rPr>
             <w:rStyle w:val="aff9"/>
@@ -1586,7 +1586,7 @@
             <w:noProof/>
             <w:webHidden/>
           </w:rPr>
-          <w:instrText>PAGEREF _Toc243235697 \h</w:instrText>
+          <w:instrText>PAGEREF _Toc243236516 \h</w:instrText>
         </w:r>
         <w:r>
           <w:rPr>
@@ -1644,7 +1644,7 @@
           <w14:ligatures w14:val="standardContextual"/>
         </w:rPr>
       </w:pPr>
-      <w:hyperlink w:anchor="_Toc243235698" w:history="1">
+      <w:hyperlink w:anchor="_Toc243236517" w:history="1">
         <w:r>
           <w:rPr>
             <w:rStyle w:val="aff9"/>
@@ -1682,7 +1682,7 @@
             <w:noProof/>
             <w:webHidden/>
           </w:rPr>
-          <w:instrText>PAGEREF _Toc243235698 \h</w:instrText>
+          <w:instrText>PAGEREF _Toc243236517 \h</w:instrText>
         </w:r>
         <w:r>
           <w:rPr>
@@ -1737,7 +1737,7 @@
         <w:pStyle w:val="1"/>
         <w:spacing w:before="280" w:after="120"/>
       </w:pPr>
-      <w:bookmarkStart w:id="0" w:name="_Toc243235683"/>
+      <w:bookmarkStart w:id="0" w:name="_Toc243236502"/>
       <w:r>
         <w:rPr>
           <w:rFonts w:ascii="Times New Roman" w:eastAsia="Arial" w:hAnsi="Times New Roman"/>
@@ -2186,7 +2186,7 @@
         <w:pStyle w:val="1"/>
         <w:spacing w:before="280" w:after="120"/>
       </w:pPr>
-      <w:bookmarkStart w:id="1" w:name="_Toc243235684"/>
+      <w:bookmarkStart w:id="1" w:name="_Toc243236503"/>
       <w:r>
         <w:rPr>
           <w:rFonts w:ascii="Times New Roman" w:eastAsia="Arial" w:hAnsi="Times New Roman"/>
@@ -2234,7 +2234,7 @@
         <w:pStyle w:val="1"/>
         <w:spacing w:before="280" w:after="120"/>
       </w:pPr>
-      <w:bookmarkStart w:id="2" w:name="_Toc243235685"/>
+      <w:bookmarkStart w:id="2" w:name="_Toc243236504"/>
       <w:r>
         <w:rPr>
           <w:rFonts w:ascii="Times New Roman" w:eastAsia="Arial" w:hAnsi="Times New Roman"/>
@@ -2780,7 +2780,7 @@
         <w:pStyle w:val="1"/>
         <w:spacing w:before="280" w:after="120"/>
       </w:pPr>
-      <w:bookmarkStart w:id="3" w:name="_Toc243235686"/>
+      <w:bookmarkStart w:id="3" w:name="_Toc243236505"/>
       <w:r>
         <w:rPr>
           <w:rFonts w:ascii="Times New Roman" w:eastAsia="Arial" w:hAnsi="Times New Roman"/>
@@ -3287,7 +3287,7 @@
         <w:pStyle w:val="1"/>
         <w:spacing w:before="280" w:after="120"/>
       </w:pPr>
-      <w:bookmarkStart w:id="4" w:name="_Toc243235687"/>
+      <w:bookmarkStart w:id="4" w:name="_Toc243236506"/>
       <w:r>
         <w:rPr>
           <w:rFonts w:ascii="Times New Roman" w:eastAsia="Arial" w:hAnsi="Times New Roman"/>
@@ -3483,7 +3483,7 @@
                 <w:color w:val="000000"/>
                 <w:sz w:val="21"/>
               </w:rPr>
-              <w:t>years from the first report by the analyst to the event date</w:t>
+              <w:t>years from the first report by the analyst to the report date</w:t>
             </w:r>
           </w:p>
         </w:tc>
@@ -3975,7 +3975,7 @@
         <w:pStyle w:val="1"/>
         <w:spacing w:before="280" w:after="120"/>
       </w:pPr>
-      <w:bookmarkStart w:id="5" w:name="_Toc243235688"/>
+      <w:bookmarkStart w:id="5" w:name="_Toc243236507"/>
       <w:r>
         <w:rPr>
           <w:rFonts w:ascii="Times New Roman" w:eastAsia="Arial" w:hAnsi="Times New Roman"/>
@@ -4146,7 +4146,7 @@
         <w:pStyle w:val="1"/>
         <w:spacing w:before="280" w:after="120"/>
       </w:pPr>
-      <w:bookmarkStart w:id="6" w:name="_Toc243235689"/>
+      <w:bookmarkStart w:id="6" w:name="_Toc243236508"/>
       <w:r>
         <w:rPr>
           <w:rFonts w:ascii="Times New Roman" w:eastAsia="Arial" w:hAnsi="Times New Roman"/>
@@ -4352,7 +4352,7 @@
         <w:pStyle w:val="1"/>
         <w:spacing w:before="280" w:after="120"/>
       </w:pPr>
-      <w:bookmarkStart w:id="7" w:name="_Toc243235690"/>
+      <w:bookmarkStart w:id="7" w:name="_Toc243236509"/>
       <w:r>
         <w:rPr>
           <w:rFonts w:ascii="Times New Roman" w:eastAsia="Arial" w:hAnsi="Times New Roman"/>
@@ -4536,7 +4536,7 @@
         <w:pStyle w:val="1"/>
         <w:spacing w:before="280" w:after="120"/>
       </w:pPr>
-      <w:bookmarkStart w:id="8" w:name="_Toc243235691"/>
+      <w:bookmarkStart w:id="8" w:name="_Toc243236510"/>
       <w:r>
         <w:rPr>
           <w:rFonts w:ascii="Times New Roman" w:eastAsia="Arial" w:hAnsi="Times New Roman"/>
@@ -4868,7 +4868,7 @@
         <w:pStyle w:val="1"/>
         <w:spacing w:before="280" w:after="120"/>
       </w:pPr>
-      <w:bookmarkStart w:id="9" w:name="_Toc243235692"/>
+      <w:bookmarkStart w:id="9" w:name="_Toc243236511"/>
       <w:r>
         <w:rPr>
           <w:rFonts w:ascii="Times New Roman" w:eastAsia="Arial" w:hAnsi="Times New Roman"/>
@@ -5010,7 +5010,7 @@
         <w:pStyle w:val="1"/>
         <w:spacing w:before="280" w:after="120"/>
       </w:pPr>
-      <w:bookmarkStart w:id="10" w:name="_Toc243235693"/>
+      <w:bookmarkStart w:id="10" w:name="_Toc243236512"/>
       <w:r>
         <w:rPr>
           <w:rFonts w:ascii="Times New Roman" w:eastAsia="Arial" w:hAnsi="Times New Roman"/>
@@ -5026,7 +5026,7 @@
         <w:pStyle w:val="21"/>
         <w:spacing w:after="120"/>
       </w:pPr>
-      <w:bookmarkStart w:id="11" w:name="_Toc243235694"/>
+      <w:bookmarkStart w:id="11" w:name="_Toc243236513"/>
       <w:r>
         <w:rPr>
           <w:rFonts w:ascii="Times New Roman" w:eastAsia="Arial" w:hAnsi="Times New Roman"/>
@@ -5960,7 +5960,7 @@
         <w:pStyle w:val="21"/>
         <w:spacing w:after="120"/>
       </w:pPr>
-      <w:bookmarkStart w:id="12" w:name="_Toc243235695"/>
+      <w:bookmarkStart w:id="12" w:name="_Toc243236514"/>
       <w:r>
         <w:rPr>
           <w:rFonts w:ascii="Times New Roman" w:eastAsia="Arial" w:hAnsi="Times New Roman"/>
@@ -6119,7 +6119,7 @@
         <w:pStyle w:val="1"/>
         <w:spacing w:before="280" w:after="120"/>
       </w:pPr>
-      <w:bookmarkStart w:id="13" w:name="_Toc243235696"/>
+      <w:bookmarkStart w:id="13" w:name="_Toc243236515"/>
       <w:r>
         <w:rPr>
           <w:rFonts w:ascii="Times New Roman" w:eastAsia="Arial" w:hAnsi="Times New Roman"/>
@@ -6283,7 +6283,7 @@
         <w:pStyle w:val="1"/>
         <w:spacing w:before="280" w:after="120"/>
       </w:pPr>
-      <w:bookmarkStart w:id="14" w:name="_Toc243235697"/>
+      <w:bookmarkStart w:id="14" w:name="_Toc243236516"/>
       <w:r>
         <w:rPr>
           <w:rFonts w:ascii="Times New Roman" w:eastAsia="Arial" w:hAnsi="Times New Roman"/>
@@ -6521,7 +6521,7 @@
         <w:pStyle w:val="1"/>
         <w:spacing w:before="280" w:after="120"/>
       </w:pPr>
-      <w:bookmarkStart w:id="15" w:name="_Toc243235698"/>
+      <w:bookmarkStart w:id="15" w:name="_Toc243236517"/>
       <w:r>
         <w:rPr>
           <w:rFonts w:ascii="Times New Roman" w:eastAsia="Arial" w:hAnsi="Times New Roman"/>
@@ -7347,31 +7347,31 @@
       </w:rPr>
     </w:lvl>
   </w:abstractNum>
-  <w:num w:numId="1" w16cid:durableId="777021823">
+  <w:num w:numId="1" w16cid:durableId="2121141286">
     <w:abstractNumId w:val="8"/>
   </w:num>
-  <w:num w:numId="2" w16cid:durableId="1912696074">
+  <w:num w:numId="2" w16cid:durableId="475729261">
     <w:abstractNumId w:val="6"/>
   </w:num>
-  <w:num w:numId="3" w16cid:durableId="568656852">
+  <w:num w:numId="3" w16cid:durableId="2033650242">
     <w:abstractNumId w:val="5"/>
   </w:num>
-  <w:num w:numId="4" w16cid:durableId="2127191254">
+  <w:num w:numId="4" w16cid:durableId="1707369652">
     <w:abstractNumId w:val="4"/>
   </w:num>
-  <w:num w:numId="5" w16cid:durableId="2128962411">
+  <w:num w:numId="5" w16cid:durableId="771628248">
     <w:abstractNumId w:val="7"/>
   </w:num>
-  <w:num w:numId="6" w16cid:durableId="243220007">
+  <w:num w:numId="6" w16cid:durableId="1467503698">
     <w:abstractNumId w:val="3"/>
   </w:num>
-  <w:num w:numId="7" w16cid:durableId="1979072932">
+  <w:num w:numId="7" w16cid:durableId="105467794">
     <w:abstractNumId w:val="2"/>
   </w:num>
-  <w:num w:numId="8" w16cid:durableId="984163814">
+  <w:num w:numId="8" w16cid:durableId="603422110">
     <w:abstractNumId w:val="1"/>
   </w:num>
-  <w:num w:numId="9" w16cid:durableId="442848264">
+  <w:num w:numId="9" w16cid:durableId="42563998">
     <w:abstractNumId w:val="0"/>
   </w:num>
 </w:numbering>
@@ -18770,7 +18770,7 @@
     <w:autoRedefine/>
     <w:uiPriority w:val="39"/>
     <w:unhideWhenUsed/>
-    <w:rsid w:val="00D325EC"/>
+    <w:rsid w:val="00062010"/>
   </w:style>
   <w:style w:type="paragraph" w:styleId="TOC2">
     <w:name w:val="toc 2"/>
@@ -18779,7 +18779,7 @@
     <w:autoRedefine/>
     <w:uiPriority w:val="39"/>
     <w:unhideWhenUsed/>
-    <w:rsid w:val="00D325EC"/>
+    <w:rsid w:val="00062010"/>
     <w:pPr>
       <w:ind w:leftChars="200" w:left="420"/>
     </w:pPr>
@@ -18789,7 +18789,7 @@
     <w:basedOn w:val="a2"/>
     <w:uiPriority w:val="99"/>
     <w:unhideWhenUsed/>
-    <w:rsid w:val="00D325EC"/>
+    <w:rsid w:val="00062010"/>
     <w:rPr>
       <w:color w:val="0000FF" w:themeColor="hyperlink"/>
       <w:u w:val="single"/>

</xml_diff>